<commit_message>
docs: remove ChangeRequest from MVP requirements
</commit_message>
<xml_diff>
--- a/docs/business-rules/Business_Rules.docx
+++ b/docs/business-rules/Business_Rules.docx
@@ -7029,144 +7029,76 @@
           </w:tcPr>
           <w:p>
             <w:r>
-              <w:t xml:space="preserve">Transport Specialist </w:t>
-            </w:r>
-            <w:proofErr w:type="spellStart"/>
-            <w:r>
-              <w:t>và</w:t>
-            </w:r>
-            <w:proofErr w:type="spellEnd"/>
-            <w:r>
-              <w:t xml:space="preserve"> Fleet &amp; Route Coordinator </w:t>
-            </w:r>
-            <w:proofErr w:type="spellStart"/>
-            <w:r>
-              <w:t>chỉ</w:t>
-            </w:r>
-            <w:proofErr w:type="spellEnd"/>
-            <w:r>
-              <w:t xml:space="preserve"> </w:t>
-            </w:r>
-            <w:proofErr w:type="spellStart"/>
-            <w:r>
-              <w:t>có</w:t>
-            </w:r>
-            <w:proofErr w:type="spellEnd"/>
-            <w:r>
-              <w:t xml:space="preserve"> </w:t>
-            </w:r>
-            <w:proofErr w:type="spellStart"/>
-            <w:r>
-              <w:t>quyền</w:t>
-            </w:r>
-            <w:proofErr w:type="spellEnd"/>
-            <w:r>
-              <w:t xml:space="preserve"> </w:t>
-            </w:r>
-            <w:proofErr w:type="spellStart"/>
-            <w:r>
-              <w:t>đề</w:t>
-            </w:r>
-            <w:proofErr w:type="spellEnd"/>
-            <w:r>
-              <w:t xml:space="preserve"> </w:t>
-            </w:r>
-            <w:proofErr w:type="spellStart"/>
-            <w:r>
-              <w:t>xuất</w:t>
-            </w:r>
-            <w:proofErr w:type="spellEnd"/>
-            <w:r>
-              <w:t xml:space="preserve"> </w:t>
-            </w:r>
-            <w:proofErr w:type="spellStart"/>
-            <w:r>
-              <w:t>các</w:t>
-            </w:r>
-            <w:proofErr w:type="spellEnd"/>
-            <w:r>
-              <w:t xml:space="preserve"> </w:t>
-            </w:r>
-            <w:proofErr w:type="spellStart"/>
-            <w:r>
-              <w:t>thay</w:t>
-            </w:r>
-            <w:proofErr w:type="spellEnd"/>
-            <w:r>
-              <w:t xml:space="preserve"> </w:t>
-            </w:r>
-            <w:proofErr w:type="spellStart"/>
-            <w:r>
-              <w:t>đổi</w:t>
-            </w:r>
-            <w:proofErr w:type="spellEnd"/>
-            <w:r>
-              <w:t xml:space="preserve"> ROUTE, VEHICLE </w:t>
-            </w:r>
-            <w:proofErr w:type="spellStart"/>
-            <w:r>
-              <w:t>hoặc</w:t>
-            </w:r>
-            <w:proofErr w:type="spellEnd"/>
-            <w:r>
-              <w:t xml:space="preserve"> COST </w:t>
-            </w:r>
-            <w:proofErr w:type="spellStart"/>
-            <w:r>
-              <w:t>thông</w:t>
-            </w:r>
-            <w:proofErr w:type="spellEnd"/>
-            <w:r>
-              <w:t xml:space="preserve"> qua </w:t>
-            </w:r>
-            <w:proofErr w:type="spellStart"/>
-            <w:r>
-              <w:t>ChangeRequest</w:t>
-            </w:r>
-            <w:proofErr w:type="spellEnd"/>
-            <w:r>
-              <w:t xml:space="preserve">. </w:t>
-            </w:r>
-            <w:proofErr w:type="spellStart"/>
-            <w:r>
-              <w:t>Chỉ</w:t>
-            </w:r>
-            <w:proofErr w:type="spellEnd"/>
-            <w:r>
-              <w:t xml:space="preserve"> Logistics Manager </w:t>
-            </w:r>
-            <w:proofErr w:type="spellStart"/>
-            <w:r>
-              <w:t>có</w:t>
-            </w:r>
-            <w:proofErr w:type="spellEnd"/>
-            <w:r>
-              <w:t xml:space="preserve"> </w:t>
-            </w:r>
-            <w:proofErr w:type="spellStart"/>
-            <w:r>
-              <w:t>quyền</w:t>
-            </w:r>
-            <w:proofErr w:type="spellEnd"/>
-            <w:r>
-              <w:t xml:space="preserve"> APPROVE </w:t>
-            </w:r>
-            <w:proofErr w:type="spellStart"/>
-            <w:r>
-              <w:t>hoặc</w:t>
-            </w:r>
-            <w:proofErr w:type="spellEnd"/>
-            <w:r>
-              <w:t xml:space="preserve"> REJECT </w:t>
-            </w:r>
-            <w:proofErr w:type="spellStart"/>
-            <w:r>
-              <w:t>ChangeRequest</w:t>
-            </w:r>
-            <w:proofErr w:type="spellEnd"/>
-            <w:r>
-              <w:t>.</w:t>
-            </w:r>
+              <w:t>Không áp dụng trong MVP. Quy tắc legacy này đã được loại khỏi phạm vi MVP.</w:t>
+            </w:r>
+            <w:proofErr w:type="spellStart"/>
+            <w:r/>
+            <w:proofErr w:type="spellEnd"/>
+            <w:r/>
+            <w:proofErr w:type="spellStart"/>
+            <w:r/>
+            <w:proofErr w:type="spellEnd"/>
+            <w:r/>
+            <w:proofErr w:type="spellStart"/>
+            <w:r/>
+            <w:proofErr w:type="spellEnd"/>
+            <w:r/>
+            <w:proofErr w:type="spellStart"/>
+            <w:r/>
+            <w:proofErr w:type="spellEnd"/>
+            <w:r/>
+            <w:proofErr w:type="spellStart"/>
+            <w:r/>
+            <w:proofErr w:type="spellEnd"/>
+            <w:r/>
+            <w:proofErr w:type="spellStart"/>
+            <w:r/>
+            <w:proofErr w:type="spellEnd"/>
+            <w:r/>
+            <w:proofErr w:type="spellStart"/>
+            <w:r/>
+            <w:proofErr w:type="spellEnd"/>
+            <w:r/>
+            <w:proofErr w:type="spellStart"/>
+            <w:r/>
+            <w:proofErr w:type="spellEnd"/>
+            <w:r/>
+            <w:proofErr w:type="spellStart"/>
+            <w:r/>
+            <w:proofErr w:type="spellEnd"/>
+            <w:r/>
+            <w:proofErr w:type="spellStart"/>
+            <w:r/>
+            <w:proofErr w:type="spellEnd"/>
+            <w:r/>
+            <w:proofErr w:type="spellStart"/>
+            <w:r/>
+            <w:proofErr w:type="spellEnd"/>
+            <w:r/>
+            <w:proofErr w:type="spellStart"/>
+            <w:r/>
+            <w:proofErr w:type="spellEnd"/>
+            <w:r/>
+            <w:proofErr w:type="spellStart"/>
+            <w:r/>
+            <w:proofErr w:type="spellEnd"/>
+            <w:r/>
+            <w:proofErr w:type="spellStart"/>
+            <w:r/>
+            <w:proofErr w:type="spellEnd"/>
+            <w:r/>
+            <w:proofErr w:type="spellStart"/>
+            <w:r/>
+            <w:proofErr w:type="spellEnd"/>
+            <w:r/>
+            <w:proofErr w:type="spellStart"/>
+            <w:r/>
+            <w:proofErr w:type="spellEnd"/>
+            <w:r/>
+            <w:proofErr w:type="spellStart"/>
+            <w:r/>
+            <w:proofErr w:type="spellEnd"/>
+            <w:r/>
           </w:p>
         </w:tc>
         <w:tc>
@@ -7190,7 +7122,7 @@
                 <w:sz w:val="18"/>
                 <w:szCs w:val="18"/>
               </w:rPr>
-              <w:t>Bắt</w:t>
+              <w:t>Ngoài phạm vi MVP</w:t>
             </w:r>
             <w:proofErr w:type="spellEnd"/>
             <w:r>
@@ -7201,7 +7133,6 @@
                 <w:sz w:val="18"/>
                 <w:szCs w:val="18"/>
               </w:rPr>
-              <w:t xml:space="preserve"> </w:t>
             </w:r>
             <w:proofErr w:type="spellStart"/>
             <w:r>
@@ -7212,7 +7143,6 @@
                 <w:sz w:val="18"/>
                 <w:szCs w:val="18"/>
               </w:rPr>
-              <w:t>buộc</w:t>
             </w:r>
             <w:proofErr w:type="spellEnd"/>
           </w:p>
@@ -8313,13 +8243,13 @@
               <w:rPr>
                 <w:lang w:val="vi-VN"/>
               </w:rPr>
-              <w:t>6</w:t>
+              <w:t>5</w:t>
             </w:r>
             <w:r>
               <w:rPr>
                 <w:lang w:val="vi-VN"/>
               </w:rPr>
-              <w:t xml:space="preserve"> entity gồm TransportOrder, TransportOrderHorse, HorseDocumentVersion, RouteLeg, Quotation và ChangeRequest phải tạo một StatusAuditLog chứa trạng thái trước, trạng thái sau, người thực hiện, thời gian và lý do nếu có. </w:t>
+              <w:t xml:space="preserve"> entity gồm TransportOrder, TransportOrderHorse, HorseDocumentVersion, RouteLeg và Quotation phải tạo một StatusAuditLog chứa trạng thái trước, trạng thái sau, người thực hiện, thời gian và lý do nếu có. </w:t>
             </w:r>
             <w:r>
               <w:t xml:space="preserve">Audit log </w:t>

</xml_diff>

<commit_message>
docs: update order cancellation and rejection rules
</commit_message>
<xml_diff>
--- a/docs/business-rules/Business_Rules.docx
+++ b/docs/business-rules/Business_Rules.docx
@@ -1993,7 +1993,263 @@
             </w:r>
             <w:proofErr w:type="spellEnd"/>
             <w:r>
-              <w:t xml:space="preserve"> Logistics Manager (LM) </w:t>
+              <w:t xml:space="preserve"> Customer </w:t>
+            </w:r>
+            <w:proofErr w:type="spellStart"/>
+            <w:r>
+              <w:t>thanh</w:t>
+            </w:r>
+            <w:proofErr w:type="spellEnd"/>
+            <w:r>
+              <w:t xml:space="preserve"> </w:t>
+            </w:r>
+            <w:proofErr w:type="spellStart"/>
+            <w:r>
+              <w:t>toán</w:t>
+            </w:r>
+            <w:proofErr w:type="spellEnd"/>
+            <w:r>
+              <w:t xml:space="preserve"> Deposit </w:t>
+            </w:r>
+            <w:proofErr w:type="spellStart"/>
+            <w:r>
+              <w:t>thành</w:t>
+            </w:r>
+            <w:proofErr w:type="spellEnd"/>
+            <w:r>
+              <w:t xml:space="preserve"> </w:t>
+            </w:r>
+            <w:proofErr w:type="spellStart"/>
+            <w:r>
+              <w:t>công</w:t>
+            </w:r>
+            <w:proofErr w:type="spellEnd"/>
+            <w:r>
+              <w:t xml:space="preserve"> </w:t>
+            </w:r>
+            <w:proofErr w:type="spellStart"/>
+            <w:r>
+              <w:t>thông</w:t>
+            </w:r>
+            <w:proofErr w:type="spellEnd"/>
+            <w:r>
+              <w:t xml:space="preserve"> qua Stripe </w:t>
+            </w:r>
+            <w:proofErr w:type="spellStart"/>
+            <w:r>
+              <w:t>cho</w:t>
+            </w:r>
+            <w:proofErr w:type="spellEnd"/>
+            <w:r>
+              <w:t xml:space="preserve"> quotation </w:t>
+            </w:r>
+            <w:proofErr w:type="spellStart"/>
+            <w:r>
+              <w:t>đã</w:t>
+            </w:r>
+            <w:proofErr w:type="spellEnd"/>
+            <w:r>
+              <w:t xml:space="preserve"> </w:t>
+            </w:r>
+            <w:proofErr w:type="spellStart"/>
+            <w:r>
+              <w:t>được</w:t>
+            </w:r>
+            <w:proofErr w:type="spellEnd"/>
+            <w:r>
+              <w:t xml:space="preserve"> </w:t>
+            </w:r>
+            <w:proofErr w:type="spellStart"/>
+            <w:r>
+              <w:t>gửi</w:t>
+            </w:r>
+            <w:proofErr w:type="spellEnd"/>
+            <w:r>
+              <w:t xml:space="preserve"> </w:t>
+            </w:r>
+            <w:proofErr w:type="spellStart"/>
+            <w:r>
+              <w:t>và</w:t>
+            </w:r>
+            <w:proofErr w:type="spellEnd"/>
+            <w:r>
+              <w:t xml:space="preserve"> </w:t>
+            </w:r>
+            <w:proofErr w:type="spellStart"/>
+            <w:r>
+              <w:t>khóa</w:t>
+            </w:r>
+            <w:proofErr w:type="spellEnd"/>
+            <w:r>
+              <w:t xml:space="preserve">. </w:t>
+            </w:r>
+            <w:proofErr w:type="spellStart"/>
+            <w:r>
+              <w:t>Hệ</w:t>
+            </w:r>
+            <w:proofErr w:type="spellEnd"/>
+            <w:r>
+              <w:t xml:space="preserve"> </w:t>
+            </w:r>
+            <w:proofErr w:type="spellStart"/>
+            <w:r>
+              <w:t>thống</w:t>
+            </w:r>
+            <w:proofErr w:type="spellEnd"/>
+            <w:r>
+              <w:t xml:space="preserve"> </w:t>
+            </w:r>
+            <w:proofErr w:type="spellStart"/>
+            <w:r>
+              <w:t>tự</w:t>
+            </w:r>
+            <w:proofErr w:type="spellEnd"/>
+            <w:r>
+              <w:t xml:space="preserve"> </w:t>
+            </w:r>
+            <w:proofErr w:type="spellStart"/>
+            <w:r>
+              <w:t>động</w:t>
+            </w:r>
+            <w:proofErr w:type="spellEnd"/>
+            <w:r>
+              <w:t xml:space="preserve"> </w:t>
+            </w:r>
+            <w:proofErr w:type="spellStart"/>
+            <w:r>
+              <w:t>chuyển</w:t>
+            </w:r>
+            <w:proofErr w:type="spellEnd"/>
+            <w:r>
+              <w:t xml:space="preserve"> </w:t>
+            </w:r>
+            <w:proofErr w:type="spellStart"/>
+            <w:r>
+              <w:t>đơn</w:t>
+            </w:r>
+            <w:proofErr w:type="spellEnd"/>
+            <w:r>
+              <w:t xml:space="preserve"> </w:t>
+            </w:r>
+            <w:proofErr w:type="spellStart"/>
+            <w:r>
+              <w:t>hàng</w:t>
+            </w:r>
+            <w:proofErr w:type="spellEnd"/>
+            <w:r>
+              <w:t xml:space="preserve"> sang APPROVED </w:t>
+            </w:r>
+            <w:proofErr w:type="spellStart"/>
+            <w:r>
+              <w:t>sau</w:t>
+            </w:r>
+            <w:proofErr w:type="spellEnd"/>
+            <w:r>
+              <w:t xml:space="preserve"> </w:t>
+            </w:r>
+            <w:proofErr w:type="spellStart"/>
+            <w:r>
+              <w:t>khi</w:t>
+            </w:r>
+            <w:proofErr w:type="spellEnd"/>
+            <w:r>
+              <w:t xml:space="preserve"> </w:t>
+            </w:r>
+            <w:proofErr w:type="spellStart"/>
+            <w:r>
+              <w:t>nhận</w:t>
+            </w:r>
+            <w:proofErr w:type="spellEnd"/>
+            <w:r>
+              <w:t xml:space="preserve"> </w:t>
+            </w:r>
+            <w:proofErr w:type="spellStart"/>
+            <w:r>
+              <w:t>được</w:t>
+            </w:r>
+            <w:proofErr w:type="spellEnd"/>
+            <w:r>
+              <w:t xml:space="preserve"> </w:t>
+            </w:r>
+            <w:proofErr w:type="spellStart"/>
+            <w:r>
+              <w:t>xác</w:t>
+            </w:r>
+            <w:proofErr w:type="spellEnd"/>
+            <w:r>
+              <w:t xml:space="preserve"> </w:t>
+            </w:r>
+            <w:proofErr w:type="spellStart"/>
+            <w:r>
+              <w:t>nhận</w:t>
+            </w:r>
+            <w:proofErr w:type="spellEnd"/>
+            <w:r>
+              <w:t xml:space="preserve"> </w:t>
+            </w:r>
+            <w:proofErr w:type="spellStart"/>
+            <w:r>
+              <w:t>thanh</w:t>
+            </w:r>
+            <w:proofErr w:type="spellEnd"/>
+            <w:r>
+              <w:t xml:space="preserve"> </w:t>
+            </w:r>
+            <w:proofErr w:type="spellStart"/>
+            <w:r>
+              <w:t>toán</w:t>
+            </w:r>
+            <w:proofErr w:type="spellEnd"/>
+            <w:r>
+              <w:t xml:space="preserve"> </w:t>
+            </w:r>
+            <w:proofErr w:type="spellStart"/>
+            <w:r>
+              <w:t>thành</w:t>
+            </w:r>
+            <w:proofErr w:type="spellEnd"/>
+            <w:r>
+              <w:t xml:space="preserve"> </w:t>
+            </w:r>
+            <w:proofErr w:type="spellStart"/>
+            <w:r>
+              <w:t>công</w:t>
+            </w:r>
+            <w:proofErr w:type="spellEnd"/>
+            <w:r>
+              <w:t xml:space="preserve"> </w:t>
+            </w:r>
+            <w:proofErr w:type="spellStart"/>
+            <w:r>
+              <w:t>từ</w:t>
+            </w:r>
+            <w:proofErr w:type="spellEnd"/>
+            <w:r>
+              <w:t xml:space="preserve"> Stripe. </w:t>
+            </w:r>
+            <w:proofErr w:type="spellStart"/>
+            <w:r>
+              <w:t>Không</w:t>
+            </w:r>
+            <w:proofErr w:type="spellEnd"/>
+            <w:r>
+              <w:t xml:space="preserve"> </w:t>
+            </w:r>
+            <w:proofErr w:type="spellStart"/>
+            <w:r>
+              <w:t>yêu</w:t>
+            </w:r>
+            <w:proofErr w:type="spellEnd"/>
+            <w:r>
+              <w:t xml:space="preserve"> </w:t>
+            </w:r>
+            <w:proofErr w:type="spellStart"/>
+            <w:r>
+              <w:t>cầu</w:t>
+            </w:r>
+            <w:proofErr w:type="spellEnd"/>
+            <w:r>
+              <w:t xml:space="preserve"> Customer </w:t>
             </w:r>
             <w:proofErr w:type="spellStart"/>
             <w:r>
@@ -2013,6 +2269,62 @@
             </w:r>
             <w:proofErr w:type="spellStart"/>
             <w:r>
+              <w:t>thao</w:t>
+            </w:r>
+            <w:proofErr w:type="spellEnd"/>
+            <w:r>
+              <w:t xml:space="preserve"> </w:t>
+            </w:r>
+            <w:proofErr w:type="spellStart"/>
+            <w:r>
+              <w:t>tác</w:t>
+            </w:r>
+            <w:proofErr w:type="spellEnd"/>
+            <w:r>
+              <w:t xml:space="preserve"> ACCEPT quotation </w:t>
+            </w:r>
+            <w:proofErr w:type="spellStart"/>
+            <w:r>
+              <w:t>riêng</w:t>
+            </w:r>
+            <w:proofErr w:type="spellEnd"/>
+            <w:r>
+              <w:t xml:space="preserve"> </w:t>
+            </w:r>
+            <w:proofErr w:type="spellStart"/>
+            <w:r>
+              <w:t>và</w:t>
+            </w:r>
+            <w:proofErr w:type="spellEnd"/>
+            <w:r>
+              <w:t xml:space="preserve"> </w:t>
+            </w:r>
+            <w:proofErr w:type="spellStart"/>
+            <w:r>
+              <w:t>không</w:t>
+            </w:r>
+            <w:proofErr w:type="spellEnd"/>
+            <w:r>
+              <w:t xml:space="preserve"> </w:t>
+            </w:r>
+            <w:proofErr w:type="spellStart"/>
+            <w:r>
+              <w:t>yêu</w:t>
+            </w:r>
+            <w:proofErr w:type="spellEnd"/>
+            <w:r>
+              <w:t xml:space="preserve"> </w:t>
+            </w:r>
+            <w:proofErr w:type="spellStart"/>
+            <w:r>
+              <w:t>cầu</w:t>
+            </w:r>
+            <w:proofErr w:type="spellEnd"/>
+            <w:r>
+              <w:t xml:space="preserve"> LM </w:t>
+            </w:r>
+            <w:proofErr w:type="spellStart"/>
+            <w:r>
               <w:t>phê</w:t>
             </w:r>
             <w:proofErr w:type="spellEnd"/>
@@ -2029,132 +2341,25 @@
             </w:r>
             <w:proofErr w:type="spellStart"/>
             <w:r>
-              <w:t>chính</w:t>
-            </w:r>
-            <w:proofErr w:type="spellEnd"/>
-            <w:r>
-              <w:t xml:space="preserve"> </w:t>
-            </w:r>
-            <w:proofErr w:type="spellStart"/>
-            <w:r>
-              <w:t>thức</w:t>
-            </w:r>
-            <w:proofErr w:type="spellEnd"/>
-            <w:r>
-              <w:t xml:space="preserve"> </w:t>
-            </w:r>
-            <w:proofErr w:type="spellStart"/>
-            <w:r>
-              <w:t>và</w:t>
-            </w:r>
-            <w:proofErr w:type="spellEnd"/>
-            <w:r>
-              <w:t xml:space="preserve"> quotation </w:t>
-            </w:r>
-            <w:proofErr w:type="spellStart"/>
-            <w:r>
-              <w:t>tương</w:t>
-            </w:r>
-            <w:proofErr w:type="spellEnd"/>
-            <w:r>
-              <w:t xml:space="preserve"> </w:t>
-            </w:r>
-            <w:proofErr w:type="spellStart"/>
-            <w:r>
-              <w:t>ứng</w:t>
-            </w:r>
-            <w:proofErr w:type="spellEnd"/>
-            <w:r>
-              <w:t xml:space="preserve"> </w:t>
-            </w:r>
-            <w:proofErr w:type="spellStart"/>
-            <w:r>
-              <w:t>đã</w:t>
-            </w:r>
-            <w:proofErr w:type="spellEnd"/>
-            <w:r>
-              <w:t xml:space="preserve"> </w:t>
-            </w:r>
-            <w:proofErr w:type="spellStart"/>
-            <w:r>
-              <w:t>được</w:t>
-            </w:r>
-            <w:proofErr w:type="spellEnd"/>
-            <w:r>
-              <w:t xml:space="preserve"> Customer ACCEPTED. </w:t>
-            </w:r>
-            <w:proofErr w:type="spellStart"/>
-            <w:r>
-              <w:t>Hệ</w:t>
-            </w:r>
-            <w:proofErr w:type="spellEnd"/>
-            <w:r>
-              <w:t xml:space="preserve"> </w:t>
-            </w:r>
-            <w:proofErr w:type="spellStart"/>
-            <w:r>
-              <w:t>thống</w:t>
-            </w:r>
-            <w:proofErr w:type="spellEnd"/>
-            <w:r>
-              <w:t xml:space="preserve"> </w:t>
-            </w:r>
-            <w:proofErr w:type="spellStart"/>
-            <w:r>
-              <w:t>không</w:t>
-            </w:r>
-            <w:proofErr w:type="spellEnd"/>
-            <w:r>
-              <w:t xml:space="preserve"> </w:t>
-            </w:r>
-            <w:proofErr w:type="spellStart"/>
-            <w:r>
-              <w:t>tự</w:t>
-            </w:r>
-            <w:proofErr w:type="spellEnd"/>
-            <w:r>
-              <w:t xml:space="preserve"> </w:t>
-            </w:r>
-            <w:proofErr w:type="spellStart"/>
-            <w:r>
-              <w:t>động</w:t>
-            </w:r>
-            <w:proofErr w:type="spellEnd"/>
-            <w:r>
-              <w:t xml:space="preserve"> </w:t>
-            </w:r>
-            <w:proofErr w:type="spellStart"/>
-            <w:r>
-              <w:t>phê</w:t>
-            </w:r>
-            <w:proofErr w:type="spellEnd"/>
-            <w:r>
-              <w:t xml:space="preserve"> </w:t>
-            </w:r>
-            <w:proofErr w:type="spellStart"/>
-            <w:r>
-              <w:t>duyệt</w:t>
-            </w:r>
-            <w:proofErr w:type="spellEnd"/>
-            <w:r>
-              <w:t xml:space="preserve"> </w:t>
-            </w:r>
-            <w:proofErr w:type="spellStart"/>
-            <w:r>
-              <w:t>đơn</w:t>
-            </w:r>
-            <w:proofErr w:type="spellEnd"/>
-            <w:r>
-              <w:t xml:space="preserve"> </w:t>
-            </w:r>
-            <w:proofErr w:type="spellStart"/>
-            <w:r>
-              <w:t>hàng</w:t>
+              <w:t>thủ</w:t>
+            </w:r>
+            <w:proofErr w:type="spellEnd"/>
+            <w:r>
+              <w:t xml:space="preserve"> </w:t>
+            </w:r>
+            <w:proofErr w:type="spellStart"/>
+            <w:proofErr w:type="gramStart"/>
+            <w:r>
+              <w:t>công</w:t>
             </w:r>
             <w:proofErr w:type="spellEnd"/>
             <w:r>
               <w:t>.</w:t>
             </w:r>
+            <w:r>
+              <w:t>.</w:t>
+            </w:r>
+            <w:proofErr w:type="gramEnd"/>
           </w:p>
         </w:tc>
         <w:tc>
@@ -2314,23 +2519,7 @@
             </w:r>
             <w:proofErr w:type="spellEnd"/>
             <w:r>
-              <w:t xml:space="preserve"> LM </w:t>
-            </w:r>
-            <w:proofErr w:type="spellStart"/>
-            <w:r>
-              <w:t>phê</w:t>
-            </w:r>
-            <w:proofErr w:type="spellEnd"/>
-            <w:r>
-              <w:t xml:space="preserve"> </w:t>
-            </w:r>
-            <w:proofErr w:type="spellStart"/>
-            <w:r>
-              <w:t>duyệt</w:t>
-            </w:r>
-            <w:proofErr w:type="spellEnd"/>
-            <w:r>
-              <w:t xml:space="preserve">. Transport Specialist (TS) </w:t>
+              <w:t xml:space="preserve"> Order </w:t>
             </w:r>
             <w:proofErr w:type="spellStart"/>
             <w:r>
@@ -2342,7 +2531,47 @@
             </w:r>
             <w:proofErr w:type="spellStart"/>
             <w:r>
-              <w:t>phân</w:t>
+              <w:t>chuyển</w:t>
+            </w:r>
+            <w:proofErr w:type="spellEnd"/>
+            <w:r>
+              <w:t xml:space="preserve"> sang APPROVED. Sau </w:t>
+            </w:r>
+            <w:proofErr w:type="spellStart"/>
+            <w:r>
+              <w:t>khi</w:t>
+            </w:r>
+            <w:proofErr w:type="spellEnd"/>
+            <w:r>
+              <w:t xml:space="preserve"> Deposit </w:t>
+            </w:r>
+            <w:proofErr w:type="spellStart"/>
+            <w:r>
+              <w:t>được</w:t>
+            </w:r>
+            <w:proofErr w:type="spellEnd"/>
+            <w:r>
+              <w:t xml:space="preserve"> </w:t>
+            </w:r>
+            <w:proofErr w:type="spellStart"/>
+            <w:r>
+              <w:t>thanh</w:t>
+            </w:r>
+            <w:proofErr w:type="spellEnd"/>
+            <w:r>
+              <w:t xml:space="preserve"> </w:t>
+            </w:r>
+            <w:proofErr w:type="spellStart"/>
+            <w:r>
+              <w:t>toán</w:t>
+            </w:r>
+            <w:proofErr w:type="spellEnd"/>
+            <w:r>
+              <w:t xml:space="preserve"> </w:t>
+            </w:r>
+            <w:proofErr w:type="spellStart"/>
+            <w:r>
+              <w:t>thành</w:t>
             </w:r>
             <w:proofErr w:type="spellEnd"/>
             <w:r>
@@ -2358,39 +2587,31 @@
             </w:r>
             <w:proofErr w:type="spellStart"/>
             <w:r>
-              <w:t>trước</w:t>
-            </w:r>
-            <w:proofErr w:type="spellEnd"/>
-            <w:r>
-              <w:t xml:space="preserve"> </w:t>
-            </w:r>
-            <w:proofErr w:type="spellStart"/>
-            <w:r>
-              <w:t>khi</w:t>
-            </w:r>
-            <w:proofErr w:type="spellEnd"/>
-            <w:r>
-              <w:t xml:space="preserve"> LM </w:t>
-            </w:r>
-            <w:proofErr w:type="spellStart"/>
-            <w:r>
-              <w:t>phê</w:t>
-            </w:r>
-            <w:proofErr w:type="spellEnd"/>
-            <w:r>
-              <w:t xml:space="preserve"> </w:t>
-            </w:r>
-            <w:proofErr w:type="spellStart"/>
-            <w:r>
-              <w:t>duyệt</w:t>
-            </w:r>
-            <w:proofErr w:type="spellEnd"/>
-            <w:r>
-              <w:t xml:space="preserve"> </w:t>
-            </w:r>
-            <w:proofErr w:type="spellStart"/>
-            <w:r>
-              <w:t>để</w:t>
+              <w:t>và</w:t>
+            </w:r>
+            <w:proofErr w:type="spellEnd"/>
+            <w:r>
+              <w:t xml:space="preserve"> Order </w:t>
+            </w:r>
+            <w:proofErr w:type="spellStart"/>
+            <w:r>
+              <w:t>chuyển</w:t>
+            </w:r>
+            <w:proofErr w:type="spellEnd"/>
+            <w:r>
+              <w:t xml:space="preserve"> sang APPROVED, </w:t>
+            </w:r>
+            <w:proofErr w:type="spellStart"/>
+            <w:r>
+              <w:t>hệ</w:t>
+            </w:r>
+            <w:proofErr w:type="spellEnd"/>
+            <w:r>
+              <w:t xml:space="preserve"> </w:t>
+            </w:r>
+            <w:proofErr w:type="spellStart"/>
+            <w:r>
+              <w:t>thống</w:t>
             </w:r>
             <w:proofErr w:type="spellEnd"/>
             <w:r>
@@ -2406,6 +2627,102 @@
             </w:r>
             <w:proofErr w:type="spellStart"/>
             <w:r>
+              <w:t>động</w:t>
+            </w:r>
+            <w:proofErr w:type="spellEnd"/>
+            <w:r>
+              <w:t xml:space="preserve"> </w:t>
+            </w:r>
+            <w:proofErr w:type="spellStart"/>
+            <w:r>
+              <w:t>tạo</w:t>
+            </w:r>
+            <w:proofErr w:type="spellEnd"/>
+            <w:r>
+              <w:t xml:space="preserve"> checklist </w:t>
+            </w:r>
+            <w:proofErr w:type="spellStart"/>
+            <w:r>
+              <w:t>giấy</w:t>
+            </w:r>
+            <w:proofErr w:type="spellEnd"/>
+            <w:r>
+              <w:t xml:space="preserve"> </w:t>
+            </w:r>
+            <w:proofErr w:type="spellStart"/>
+            <w:r>
+              <w:t>tờ</w:t>
+            </w:r>
+            <w:proofErr w:type="spellEnd"/>
+            <w:r>
+              <w:t xml:space="preserve"> </w:t>
+            </w:r>
+            <w:proofErr w:type="spellStart"/>
+            <w:r>
+              <w:t>bắt</w:t>
+            </w:r>
+            <w:proofErr w:type="spellEnd"/>
+            <w:r>
+              <w:t xml:space="preserve"> </w:t>
+            </w:r>
+            <w:proofErr w:type="spellStart"/>
+            <w:r>
+              <w:t>buộc</w:t>
+            </w:r>
+            <w:proofErr w:type="spellEnd"/>
+            <w:r>
+              <w:t xml:space="preserve"> </w:t>
+            </w:r>
+            <w:proofErr w:type="spellStart"/>
+            <w:r>
+              <w:t>cố</w:t>
+            </w:r>
+            <w:proofErr w:type="spellEnd"/>
+            <w:r>
+              <w:t xml:space="preserve"> </w:t>
+            </w:r>
+            <w:proofErr w:type="spellStart"/>
+            <w:r>
+              <w:t>định</w:t>
+            </w:r>
+            <w:proofErr w:type="spellEnd"/>
+            <w:r>
+              <w:t xml:space="preserve"> </w:t>
+            </w:r>
+            <w:proofErr w:type="spellStart"/>
+            <w:r>
+              <w:t>của</w:t>
+            </w:r>
+            <w:proofErr w:type="spellEnd"/>
+            <w:r>
+              <w:t xml:space="preserve"> MVP </w:t>
+            </w:r>
+            <w:proofErr w:type="spellStart"/>
+            <w:r>
+              <w:t>cho</w:t>
+            </w:r>
+            <w:proofErr w:type="spellEnd"/>
+            <w:r>
+              <w:t xml:space="preserve"> </w:t>
+            </w:r>
+            <w:proofErr w:type="spellStart"/>
+            <w:r>
+              <w:t>từng</w:t>
+            </w:r>
+            <w:proofErr w:type="spellEnd"/>
+            <w:r>
+              <w:t xml:space="preserve"> Horse. TS </w:t>
+            </w:r>
+            <w:proofErr w:type="spellStart"/>
+            <w:r>
+              <w:t>không</w:t>
+            </w:r>
+            <w:proofErr w:type="spellEnd"/>
+            <w:r>
+              <w:t xml:space="preserve"> </w:t>
+            </w:r>
+            <w:proofErr w:type="spellStart"/>
+            <w:r>
               <w:t>lựa</w:t>
             </w:r>
             <w:proofErr w:type="spellEnd"/>
@@ -2422,131 +2739,11 @@
             </w:r>
             <w:proofErr w:type="spellStart"/>
             <w:r>
-              <w:t>giấy</w:t>
-            </w:r>
-            <w:proofErr w:type="spellEnd"/>
-            <w:r>
-              <w:t xml:space="preserve"> </w:t>
-            </w:r>
-            <w:proofErr w:type="spellStart"/>
-            <w:r>
-              <w:t>tờ</w:t>
-            </w:r>
-            <w:proofErr w:type="spellEnd"/>
-            <w:r>
-              <w:t xml:space="preserve"> </w:t>
-            </w:r>
-            <w:proofErr w:type="spellStart"/>
-            <w:r>
-              <w:t>bắt</w:t>
-            </w:r>
-            <w:proofErr w:type="spellEnd"/>
-            <w:r>
-              <w:t xml:space="preserve"> </w:t>
-            </w:r>
-            <w:proofErr w:type="spellStart"/>
-            <w:r>
-              <w:t>buộc</w:t>
-            </w:r>
-            <w:proofErr w:type="spellEnd"/>
-            <w:r>
-              <w:t xml:space="preserve"> </w:t>
-            </w:r>
-            <w:proofErr w:type="spellStart"/>
-            <w:r>
-              <w:t>phù</w:t>
-            </w:r>
-            <w:proofErr w:type="spellEnd"/>
-            <w:r>
-              <w:t xml:space="preserve"> </w:t>
-            </w:r>
-            <w:proofErr w:type="spellStart"/>
-            <w:r>
-              <w:t>hợp</w:t>
-            </w:r>
-            <w:proofErr w:type="spellEnd"/>
-            <w:r>
-              <w:t xml:space="preserve"> </w:t>
-            </w:r>
-            <w:proofErr w:type="spellStart"/>
-            <w:r>
-              <w:t>với</w:t>
-            </w:r>
-            <w:proofErr w:type="spellEnd"/>
-            <w:r>
-              <w:t xml:space="preserve"> destination/route </w:t>
-            </w:r>
-            <w:proofErr w:type="spellStart"/>
-            <w:r>
-              <w:t>và</w:t>
-            </w:r>
-            <w:proofErr w:type="spellEnd"/>
-            <w:r>
-              <w:t xml:space="preserve"> </w:t>
-            </w:r>
-            <w:proofErr w:type="spellStart"/>
-            <w:r>
-              <w:t>thiết</w:t>
-            </w:r>
-            <w:proofErr w:type="spellEnd"/>
-            <w:r>
-              <w:t xml:space="preserve"> </w:t>
-            </w:r>
-            <w:proofErr w:type="spellStart"/>
-            <w:r>
-              <w:t>lập</w:t>
-            </w:r>
-            <w:proofErr w:type="spellEnd"/>
-            <w:r>
-              <w:t xml:space="preserve"> </w:t>
-            </w:r>
-            <w:proofErr w:type="spellStart"/>
-            <w:r>
-              <w:t>hồ</w:t>
-            </w:r>
-            <w:proofErr w:type="spellEnd"/>
-            <w:r>
-              <w:t xml:space="preserve"> </w:t>
-            </w:r>
-            <w:proofErr w:type="spellStart"/>
-            <w:r>
-              <w:t>sơ</w:t>
-            </w:r>
-            <w:proofErr w:type="spellEnd"/>
-            <w:r>
-              <w:t xml:space="preserve"> </w:t>
-            </w:r>
-            <w:proofErr w:type="spellStart"/>
-            <w:r>
-              <w:t>pháp</w:t>
-            </w:r>
-            <w:proofErr w:type="spellEnd"/>
-            <w:r>
-              <w:t xml:space="preserve"> </w:t>
-            </w:r>
-            <w:proofErr w:type="spellStart"/>
-            <w:r>
-              <w:t>lý</w:t>
-            </w:r>
-            <w:proofErr w:type="spellEnd"/>
-            <w:r>
-              <w:t xml:space="preserve"> </w:t>
-            </w:r>
-            <w:proofErr w:type="spellStart"/>
-            <w:r>
-              <w:t>cho</w:t>
-            </w:r>
-            <w:proofErr w:type="spellEnd"/>
-            <w:r>
-              <w:t xml:space="preserve"> </w:t>
-            </w:r>
-            <w:proofErr w:type="spellStart"/>
-            <w:r>
-              <w:t>từng</w:t>
-            </w:r>
-            <w:proofErr w:type="spellEnd"/>
-            <w:r>
-              <w:t xml:space="preserve"> Horse.</w:t>
+              <w:t>theo</w:t>
+            </w:r>
+            <w:proofErr w:type="spellEnd"/>
+            <w:r>
+              <w:t xml:space="preserve"> destination/route.</w:t>
             </w:r>
           </w:p>
         </w:tc>
@@ -2593,551 +2790,6 @@
                 <w:szCs w:val="18"/>
               </w:rPr>
               <w:t>buộc</w:t>
-            </w:r>
-            <w:proofErr w:type="spellEnd"/>
-          </w:p>
-        </w:tc>
-      </w:tr>
-      <w:tr>
-        <w:tc>
-          <w:tcPr>
-            <w:tcW w:w="1100" w:type="dxa"/>
-            <w:tcMar>
-              <w:top w:w="100" w:type="dxa"/>
-              <w:left w:w="120" w:type="dxa"/>
-              <w:bottom w:w="100" w:type="dxa"/>
-              <w:right w:w="120" w:type="dxa"/>
-            </w:tcMar>
-          </w:tcPr>
-          <w:p>
-            <w:r>
-              <w:rPr>
-                <w:b/>
-                <w:bCs/>
-                <w:color w:val="1F3864"/>
-              </w:rPr>
-              <w:t>BR-03</w:t>
-            </w:r>
-          </w:p>
-        </w:tc>
-        <w:tc>
-          <w:tcPr>
-            <w:tcW w:w="6300" w:type="dxa"/>
-            <w:tcMar>
-              <w:top w:w="100" w:type="dxa"/>
-              <w:left w:w="120" w:type="dxa"/>
-              <w:bottom w:w="100" w:type="dxa"/>
-              <w:right w:w="120" w:type="dxa"/>
-            </w:tcMar>
-          </w:tcPr>
-          <w:p>
-            <w:proofErr w:type="spellStart"/>
-            <w:r>
-              <w:t>Mỗi</w:t>
-            </w:r>
-            <w:proofErr w:type="spellEnd"/>
-            <w:r>
-              <w:t xml:space="preserve"> Horse </w:t>
-            </w:r>
-            <w:proofErr w:type="spellStart"/>
-            <w:r>
-              <w:t>phải</w:t>
-            </w:r>
-            <w:proofErr w:type="spellEnd"/>
-            <w:r>
-              <w:t xml:space="preserve"> </w:t>
-            </w:r>
-            <w:proofErr w:type="spellStart"/>
-            <w:r>
-              <w:t>có</w:t>
-            </w:r>
-            <w:proofErr w:type="spellEnd"/>
-            <w:r>
-              <w:t xml:space="preserve"> </w:t>
-            </w:r>
-            <w:proofErr w:type="spellStart"/>
-            <w:r>
-              <w:t>một</w:t>
-            </w:r>
-            <w:proofErr w:type="spellEnd"/>
-            <w:r>
-              <w:t xml:space="preserve"> microchip ID </w:t>
-            </w:r>
-            <w:proofErr w:type="spellStart"/>
-            <w:r>
-              <w:t>duy</w:t>
-            </w:r>
-            <w:proofErr w:type="spellEnd"/>
-            <w:r>
-              <w:t xml:space="preserve"> </w:t>
-            </w:r>
-            <w:proofErr w:type="spellStart"/>
-            <w:r>
-              <w:t>nhất</w:t>
-            </w:r>
-            <w:proofErr w:type="spellEnd"/>
-            <w:r>
-              <w:t xml:space="preserve"> </w:t>
-            </w:r>
-            <w:proofErr w:type="spellStart"/>
-            <w:r>
-              <w:t>và</w:t>
-            </w:r>
-            <w:proofErr w:type="spellEnd"/>
-            <w:r>
-              <w:t xml:space="preserve"> </w:t>
-            </w:r>
-            <w:proofErr w:type="spellStart"/>
-            <w:r>
-              <w:t>không</w:t>
-            </w:r>
-            <w:proofErr w:type="spellEnd"/>
-            <w:r>
-              <w:t xml:space="preserve"> </w:t>
-            </w:r>
-            <w:proofErr w:type="spellStart"/>
-            <w:r>
-              <w:t>được</w:t>
-            </w:r>
-            <w:proofErr w:type="spellEnd"/>
-            <w:r>
-              <w:t xml:space="preserve"> </w:t>
-            </w:r>
-            <w:proofErr w:type="spellStart"/>
-            <w:r>
-              <w:t>để</w:t>
-            </w:r>
-            <w:proofErr w:type="spellEnd"/>
-            <w:r>
-              <w:t xml:space="preserve"> </w:t>
-            </w:r>
-            <w:proofErr w:type="spellStart"/>
-            <w:r>
-              <w:t>trống</w:t>
-            </w:r>
-            <w:proofErr w:type="spellEnd"/>
-            <w:r>
-              <w:t xml:space="preserve">. Microchip ID </w:t>
-            </w:r>
-            <w:proofErr w:type="spellStart"/>
-            <w:r>
-              <w:t>được</w:t>
-            </w:r>
-            <w:proofErr w:type="spellEnd"/>
-            <w:r>
-              <w:t xml:space="preserve"> </w:t>
-            </w:r>
-            <w:proofErr w:type="spellStart"/>
-            <w:r>
-              <w:t>lưu</w:t>
-            </w:r>
-            <w:proofErr w:type="spellEnd"/>
-            <w:r>
-              <w:t xml:space="preserve"> ở </w:t>
-            </w:r>
-            <w:proofErr w:type="spellStart"/>
-            <w:r>
-              <w:t>hồ</w:t>
-            </w:r>
-            <w:proofErr w:type="spellEnd"/>
-            <w:r>
-              <w:t xml:space="preserve"> </w:t>
-            </w:r>
-            <w:proofErr w:type="spellStart"/>
-            <w:r>
-              <w:t>sơ</w:t>
-            </w:r>
-            <w:proofErr w:type="spellEnd"/>
-            <w:r>
-              <w:t xml:space="preserve"> Horse </w:t>
-            </w:r>
-            <w:proofErr w:type="spellStart"/>
-            <w:r>
-              <w:t>và</w:t>
-            </w:r>
-            <w:proofErr w:type="spellEnd"/>
-            <w:r>
-              <w:t xml:space="preserve"> </w:t>
-            </w:r>
-            <w:proofErr w:type="spellStart"/>
-            <w:r>
-              <w:t>không</w:t>
-            </w:r>
-            <w:proofErr w:type="spellEnd"/>
-            <w:r>
-              <w:t xml:space="preserve"> </w:t>
-            </w:r>
-            <w:proofErr w:type="spellStart"/>
-            <w:r>
-              <w:t>được</w:t>
-            </w:r>
-            <w:proofErr w:type="spellEnd"/>
-            <w:r>
-              <w:t xml:space="preserve"> </w:t>
-            </w:r>
-            <w:proofErr w:type="spellStart"/>
-            <w:r>
-              <w:t>trùng</w:t>
-            </w:r>
-            <w:proofErr w:type="spellEnd"/>
-            <w:r>
-              <w:t xml:space="preserve"> </w:t>
-            </w:r>
-            <w:proofErr w:type="spellStart"/>
-            <w:r>
-              <w:t>giữa</w:t>
-            </w:r>
-            <w:proofErr w:type="spellEnd"/>
-            <w:r>
-              <w:t xml:space="preserve"> </w:t>
-            </w:r>
-            <w:proofErr w:type="spellStart"/>
-            <w:r>
-              <w:t>các</w:t>
-            </w:r>
-            <w:proofErr w:type="spellEnd"/>
-            <w:r>
-              <w:t xml:space="preserve"> Horse.</w:t>
-            </w:r>
-          </w:p>
-        </w:tc>
-        <w:tc>
-          <w:tcPr>
-            <w:tcW w:w="1950" w:type="dxa"/>
-            <w:tcMar>
-              <w:top w:w="100" w:type="dxa"/>
-              <w:left w:w="120" w:type="dxa"/>
-              <w:bottom w:w="100" w:type="dxa"/>
-              <w:right w:w="120" w:type="dxa"/>
-            </w:tcMar>
-          </w:tcPr>
-          <w:p>
-            <w:proofErr w:type="spellStart"/>
-            <w:r>
-              <w:rPr>
-                <w:i/>
-                <w:iCs/>
-                <w:color w:val="595959"/>
-                <w:sz w:val="18"/>
-                <w:szCs w:val="18"/>
-              </w:rPr>
-              <w:t>Bắt</w:t>
-            </w:r>
-            <w:proofErr w:type="spellEnd"/>
-            <w:r>
-              <w:rPr>
-                <w:i/>
-                <w:iCs/>
-                <w:color w:val="595959"/>
-                <w:sz w:val="18"/>
-                <w:szCs w:val="18"/>
-              </w:rPr>
-              <w:t xml:space="preserve"> </w:t>
-            </w:r>
-            <w:proofErr w:type="spellStart"/>
-            <w:r>
-              <w:rPr>
-                <w:i/>
-                <w:iCs/>
-                <w:color w:val="595959"/>
-                <w:sz w:val="18"/>
-                <w:szCs w:val="18"/>
-              </w:rPr>
-              <w:t>buộc</w:t>
-            </w:r>
-            <w:proofErr w:type="spellEnd"/>
-          </w:p>
-        </w:tc>
-      </w:tr>
-      <w:tr>
-        <w:tc>
-          <w:tcPr>
-            <w:tcW w:w="1100" w:type="dxa"/>
-            <w:tcMar>
-              <w:top w:w="100" w:type="dxa"/>
-              <w:left w:w="120" w:type="dxa"/>
-              <w:bottom w:w="100" w:type="dxa"/>
-              <w:right w:w="120" w:type="dxa"/>
-            </w:tcMar>
-          </w:tcPr>
-          <w:p>
-            <w:r>
-              <w:rPr>
-                <w:b/>
-                <w:bCs/>
-                <w:color w:val="1F3864"/>
-              </w:rPr>
-              <w:t>BR-04</w:t>
-            </w:r>
-          </w:p>
-        </w:tc>
-        <w:tc>
-          <w:tcPr>
-            <w:tcW w:w="6300" w:type="dxa"/>
-            <w:tcMar>
-              <w:top w:w="100" w:type="dxa"/>
-              <w:left w:w="120" w:type="dxa"/>
-              <w:bottom w:w="100" w:type="dxa"/>
-              <w:right w:w="120" w:type="dxa"/>
-            </w:tcMar>
-          </w:tcPr>
-          <w:p>
-            <w:r>
-              <w:t xml:space="preserve">Transport Specialist (TS) </w:t>
-            </w:r>
-            <w:proofErr w:type="spellStart"/>
-            <w:r>
-              <w:t>phải</w:t>
-            </w:r>
-            <w:proofErr w:type="spellEnd"/>
-            <w:r>
-              <w:t xml:space="preserve"> </w:t>
-            </w:r>
-            <w:proofErr w:type="spellStart"/>
-            <w:r>
-              <w:t>nhập</w:t>
-            </w:r>
-            <w:proofErr w:type="spellEnd"/>
-            <w:r>
-              <w:t xml:space="preserve"> </w:t>
-            </w:r>
-            <w:proofErr w:type="spellStart"/>
-            <w:r>
-              <w:t>minimum_processing_days</w:t>
-            </w:r>
-            <w:proofErr w:type="spellEnd"/>
-            <w:r>
-              <w:t xml:space="preserve"> </w:t>
-            </w:r>
-            <w:proofErr w:type="spellStart"/>
-            <w:r>
-              <w:t>cho</w:t>
-            </w:r>
-            <w:proofErr w:type="spellEnd"/>
-            <w:r>
-              <w:t xml:space="preserve"> </w:t>
-            </w:r>
-            <w:proofErr w:type="spellStart"/>
-            <w:r>
-              <w:t>từng</w:t>
-            </w:r>
-            <w:proofErr w:type="spellEnd"/>
-            <w:r>
-              <w:t xml:space="preserve"> order </w:t>
-            </w:r>
-            <w:proofErr w:type="spellStart"/>
-            <w:r>
-              <w:t>dựa</w:t>
-            </w:r>
-            <w:proofErr w:type="spellEnd"/>
-            <w:r>
-              <w:t xml:space="preserve"> </w:t>
-            </w:r>
-            <w:proofErr w:type="spellStart"/>
-            <w:r>
-              <w:t>trên</w:t>
-            </w:r>
-            <w:proofErr w:type="spellEnd"/>
-            <w:r>
-              <w:t xml:space="preserve"> </w:t>
-            </w:r>
-            <w:proofErr w:type="spellStart"/>
-            <w:r>
-              <w:t>quy</w:t>
-            </w:r>
-            <w:proofErr w:type="spellEnd"/>
-            <w:r>
-              <w:t xml:space="preserve"> </w:t>
-            </w:r>
-            <w:proofErr w:type="spellStart"/>
-            <w:r>
-              <w:t>định</w:t>
-            </w:r>
-            <w:proofErr w:type="spellEnd"/>
-            <w:r>
-              <w:t xml:space="preserve"> </w:t>
-            </w:r>
-            <w:proofErr w:type="spellStart"/>
-            <w:r>
-              <w:t>được</w:t>
-            </w:r>
-            <w:proofErr w:type="spellEnd"/>
-            <w:r>
-              <w:t xml:space="preserve"> TS review </w:t>
-            </w:r>
-            <w:proofErr w:type="spellStart"/>
-            <w:r>
-              <w:t>bên</w:t>
-            </w:r>
-            <w:proofErr w:type="spellEnd"/>
-            <w:r>
-              <w:t xml:space="preserve"> </w:t>
-            </w:r>
-            <w:proofErr w:type="spellStart"/>
-            <w:r>
-              <w:t>ngoài</w:t>
-            </w:r>
-            <w:proofErr w:type="spellEnd"/>
-            <w:r>
-              <w:t xml:space="preserve">. LM </w:t>
-            </w:r>
-            <w:proofErr w:type="spellStart"/>
-            <w:r>
-              <w:t>không</w:t>
-            </w:r>
-            <w:proofErr w:type="spellEnd"/>
-            <w:r>
-              <w:t xml:space="preserve"> </w:t>
-            </w:r>
-            <w:proofErr w:type="spellStart"/>
-            <w:r>
-              <w:t>được</w:t>
-            </w:r>
-            <w:proofErr w:type="spellEnd"/>
-            <w:r>
-              <w:t xml:space="preserve"> </w:t>
-            </w:r>
-            <w:proofErr w:type="spellStart"/>
-            <w:r>
-              <w:t>phê</w:t>
-            </w:r>
-            <w:proofErr w:type="spellEnd"/>
-            <w:r>
-              <w:t xml:space="preserve"> </w:t>
-            </w:r>
-            <w:proofErr w:type="spellStart"/>
-            <w:r>
-              <w:t>duyệt</w:t>
-            </w:r>
-            <w:proofErr w:type="spellEnd"/>
-            <w:r>
-              <w:t xml:space="preserve"> order </w:t>
-            </w:r>
-            <w:proofErr w:type="spellStart"/>
-            <w:r>
-              <w:t>nếu</w:t>
-            </w:r>
-            <w:proofErr w:type="spellEnd"/>
-            <w:r>
-              <w:t xml:space="preserve"> </w:t>
-            </w:r>
-            <w:proofErr w:type="spellStart"/>
-            <w:r>
-              <w:t>requested_departure_at</w:t>
-            </w:r>
-            <w:proofErr w:type="spellEnd"/>
-            <w:r>
-              <w:t xml:space="preserve"> </w:t>
-            </w:r>
-            <w:proofErr w:type="spellStart"/>
-            <w:r>
-              <w:t>sớm</w:t>
-            </w:r>
-            <w:proofErr w:type="spellEnd"/>
-            <w:r>
-              <w:t xml:space="preserve"> </w:t>
-            </w:r>
-            <w:proofErr w:type="spellStart"/>
-            <w:r>
-              <w:t>hơn</w:t>
-            </w:r>
-            <w:proofErr w:type="spellEnd"/>
-            <w:r>
-              <w:t xml:space="preserve"> </w:t>
-            </w:r>
-            <w:proofErr w:type="spellStart"/>
-            <w:r>
-              <w:t>created_at</w:t>
-            </w:r>
-            <w:proofErr w:type="spellEnd"/>
-            <w:r>
-              <w:t xml:space="preserve"> + </w:t>
-            </w:r>
-            <w:proofErr w:type="spellStart"/>
-            <w:r>
-              <w:t>minimum_processing_days</w:t>
-            </w:r>
-            <w:proofErr w:type="spellEnd"/>
-            <w:r>
-              <w:t>.</w:t>
-            </w:r>
-          </w:p>
-        </w:tc>
-        <w:tc>
-          <w:tcPr>
-            <w:tcW w:w="1950" w:type="dxa"/>
-            <w:tcMar>
-              <w:top w:w="100" w:type="dxa"/>
-              <w:left w:w="120" w:type="dxa"/>
-              <w:bottom w:w="100" w:type="dxa"/>
-              <w:right w:w="120" w:type="dxa"/>
-            </w:tcMar>
-          </w:tcPr>
-          <w:p>
-            <w:proofErr w:type="spellStart"/>
-            <w:r>
-              <w:rPr>
-                <w:b/>
-                <w:bCs/>
-                <w:i/>
-                <w:iCs/>
-                <w:color w:val="833C0C"/>
-                <w:sz w:val="18"/>
-                <w:szCs w:val="18"/>
-              </w:rPr>
-              <w:t>Cần</w:t>
-            </w:r>
-            <w:proofErr w:type="spellEnd"/>
-            <w:r>
-              <w:rPr>
-                <w:b/>
-                <w:bCs/>
-                <w:i/>
-                <w:iCs/>
-                <w:color w:val="833C0C"/>
-                <w:sz w:val="18"/>
-                <w:szCs w:val="18"/>
-              </w:rPr>
-              <w:t xml:space="preserve"> </w:t>
-            </w:r>
-            <w:proofErr w:type="spellStart"/>
-            <w:r>
-              <w:rPr>
-                <w:b/>
-                <w:bCs/>
-                <w:i/>
-                <w:iCs/>
-                <w:color w:val="833C0C"/>
-                <w:sz w:val="18"/>
-                <w:szCs w:val="18"/>
-              </w:rPr>
-              <w:t>xác</w:t>
-            </w:r>
-            <w:proofErr w:type="spellEnd"/>
-            <w:r>
-              <w:rPr>
-                <w:b/>
-                <w:bCs/>
-                <w:i/>
-                <w:iCs/>
-                <w:color w:val="833C0C"/>
-                <w:sz w:val="18"/>
-                <w:szCs w:val="18"/>
-              </w:rPr>
-              <w:t xml:space="preserve"> </w:t>
-            </w:r>
-            <w:proofErr w:type="spellStart"/>
-            <w:r>
-              <w:rPr>
-                <w:b/>
-                <w:bCs/>
-                <w:i/>
-                <w:iCs/>
-                <w:color w:val="833C0C"/>
-                <w:sz w:val="18"/>
-                <w:szCs w:val="18"/>
-              </w:rPr>
-              <w:t>nhận</w:t>
             </w:r>
             <w:proofErr w:type="spellEnd"/>
           </w:p>
@@ -3178,7 +2830,812 @@
                 <w:color w:val="1F3864"/>
                 <w:lang w:val="vi-VN"/>
               </w:rPr>
-              <w:t xml:space="preserve">-05 </w:t>
+              <w:t>-03</w:t>
+            </w:r>
+          </w:p>
+        </w:tc>
+        <w:tc>
+          <w:tcPr>
+            <w:tcW w:w="6300" w:type="dxa"/>
+            <w:tcMar>
+              <w:top w:w="100" w:type="dxa"/>
+              <w:left w:w="120" w:type="dxa"/>
+              <w:bottom w:w="100" w:type="dxa"/>
+              <w:right w:w="120" w:type="dxa"/>
+            </w:tcMar>
+          </w:tcPr>
+          <w:p>
+            <w:pPr>
+              <w:rPr>
+                <w:lang w:val="vi-VN"/>
+              </w:rPr>
+            </w:pPr>
+            <w:r>
+              <w:rPr>
+                <w:lang w:val="vi-VN"/>
+              </w:rPr>
+              <w:t>Nếu đến Document Completion Deadline mà Order vẫn còn mandatory document ở trạng thái missing, DRAFT hoặc chưa Submit, hệ thống tự động chuyển Order sang CANCELLED và thực hiện hoàn trả 100% Deposit cho Customer thông qua Stripe.</w:t>
+            </w:r>
+          </w:p>
+          <w:p>
+            <w:proofErr w:type="spellStart"/>
+            <w:r>
+              <w:t>Nếu</w:t>
+            </w:r>
+            <w:proofErr w:type="spellEnd"/>
+            <w:r>
+              <w:t xml:space="preserve"> </w:t>
+            </w:r>
+            <w:proofErr w:type="spellStart"/>
+            <w:r>
+              <w:t>tất</w:t>
+            </w:r>
+            <w:proofErr w:type="spellEnd"/>
+            <w:r>
+              <w:t xml:space="preserve"> </w:t>
+            </w:r>
+            <w:proofErr w:type="spellStart"/>
+            <w:r>
+              <w:t>cả</w:t>
+            </w:r>
+            <w:proofErr w:type="spellEnd"/>
+            <w:r>
+              <w:t xml:space="preserve"> mandatory documents </w:t>
+            </w:r>
+            <w:proofErr w:type="spellStart"/>
+            <w:r>
+              <w:t>đang</w:t>
+            </w:r>
+            <w:proofErr w:type="spellEnd"/>
+            <w:r>
+              <w:t xml:space="preserve"> ở </w:t>
+            </w:r>
+            <w:proofErr w:type="spellStart"/>
+            <w:r>
+              <w:t>trạng</w:t>
+            </w:r>
+            <w:proofErr w:type="spellEnd"/>
+            <w:r>
+              <w:t xml:space="preserve"> </w:t>
+            </w:r>
+            <w:proofErr w:type="spellStart"/>
+            <w:r>
+              <w:t>thái</w:t>
+            </w:r>
+            <w:proofErr w:type="spellEnd"/>
+            <w:r>
+              <w:t xml:space="preserve"> PENDING_REVIEW </w:t>
+            </w:r>
+            <w:proofErr w:type="spellStart"/>
+            <w:r>
+              <w:t>tại</w:t>
+            </w:r>
+            <w:proofErr w:type="spellEnd"/>
+            <w:r>
+              <w:t xml:space="preserve"> </w:t>
+            </w:r>
+            <w:proofErr w:type="spellStart"/>
+            <w:r>
+              <w:t>thời</w:t>
+            </w:r>
+            <w:proofErr w:type="spellEnd"/>
+            <w:r>
+              <w:t xml:space="preserve"> </w:t>
+            </w:r>
+            <w:proofErr w:type="spellStart"/>
+            <w:r>
+              <w:t>điểm</w:t>
+            </w:r>
+            <w:proofErr w:type="spellEnd"/>
+            <w:r>
+              <w:t xml:space="preserve"> Deadline, </w:t>
+            </w:r>
+            <w:proofErr w:type="spellStart"/>
+            <w:r>
+              <w:t>hệ</w:t>
+            </w:r>
+            <w:proofErr w:type="spellEnd"/>
+            <w:r>
+              <w:t xml:space="preserve"> </w:t>
+            </w:r>
+            <w:proofErr w:type="spellStart"/>
+            <w:r>
+              <w:t>thống</w:t>
+            </w:r>
+            <w:proofErr w:type="spellEnd"/>
+            <w:r>
+              <w:t xml:space="preserve"> </w:t>
+            </w:r>
+            <w:proofErr w:type="spellStart"/>
+            <w:r>
+              <w:t>không</w:t>
+            </w:r>
+            <w:proofErr w:type="spellEnd"/>
+            <w:r>
+              <w:t xml:space="preserve"> </w:t>
+            </w:r>
+            <w:proofErr w:type="spellStart"/>
+            <w:r>
+              <w:t>tự</w:t>
+            </w:r>
+            <w:proofErr w:type="spellEnd"/>
+            <w:r>
+              <w:t xml:space="preserve"> </w:t>
+            </w:r>
+            <w:proofErr w:type="spellStart"/>
+            <w:r>
+              <w:t>động</w:t>
+            </w:r>
+            <w:proofErr w:type="spellEnd"/>
+            <w:r>
+              <w:t xml:space="preserve"> cancel. </w:t>
+            </w:r>
+            <w:proofErr w:type="spellStart"/>
+            <w:r>
+              <w:t>Nếu</w:t>
+            </w:r>
+            <w:proofErr w:type="spellEnd"/>
+            <w:r>
+              <w:t xml:space="preserve"> TS Reject </w:t>
+            </w:r>
+            <w:proofErr w:type="spellStart"/>
+            <w:r>
+              <w:t>một</w:t>
+            </w:r>
+            <w:proofErr w:type="spellEnd"/>
+            <w:r>
+              <w:t xml:space="preserve"> document </w:t>
+            </w:r>
+            <w:proofErr w:type="spellStart"/>
+            <w:r>
+              <w:t>sau</w:t>
+            </w:r>
+            <w:proofErr w:type="spellEnd"/>
+            <w:r>
+              <w:t xml:space="preserve"> Deadline, Order </w:t>
+            </w:r>
+            <w:proofErr w:type="spellStart"/>
+            <w:r>
+              <w:t>được</w:t>
+            </w:r>
+            <w:proofErr w:type="spellEnd"/>
+            <w:r>
+              <w:t xml:space="preserve"> </w:t>
+            </w:r>
+            <w:proofErr w:type="spellStart"/>
+            <w:r>
+              <w:t>chuyển</w:t>
+            </w:r>
+            <w:proofErr w:type="spellEnd"/>
+            <w:r>
+              <w:t xml:space="preserve"> sang CANCELLED </w:t>
+            </w:r>
+            <w:proofErr w:type="spellStart"/>
+            <w:r>
+              <w:t>và</w:t>
+            </w:r>
+            <w:proofErr w:type="spellEnd"/>
+            <w:r>
+              <w:t xml:space="preserve"> </w:t>
+            </w:r>
+            <w:proofErr w:type="spellStart"/>
+            <w:r>
+              <w:t>hệ</w:t>
+            </w:r>
+            <w:proofErr w:type="spellEnd"/>
+            <w:r>
+              <w:t xml:space="preserve"> </w:t>
+            </w:r>
+            <w:proofErr w:type="spellStart"/>
+            <w:r>
+              <w:t>thống</w:t>
+            </w:r>
+            <w:proofErr w:type="spellEnd"/>
+            <w:r>
+              <w:t xml:space="preserve"> </w:t>
+            </w:r>
+            <w:proofErr w:type="spellStart"/>
+            <w:r>
+              <w:t>thực</w:t>
+            </w:r>
+            <w:proofErr w:type="spellEnd"/>
+            <w:r>
+              <w:t xml:space="preserve"> </w:t>
+            </w:r>
+            <w:proofErr w:type="spellStart"/>
+            <w:r>
+              <w:t>hiện</w:t>
+            </w:r>
+            <w:proofErr w:type="spellEnd"/>
+            <w:r>
+              <w:t xml:space="preserve"> </w:t>
+            </w:r>
+            <w:proofErr w:type="spellStart"/>
+            <w:r>
+              <w:t>hoàn</w:t>
+            </w:r>
+            <w:proofErr w:type="spellEnd"/>
+            <w:r>
+              <w:t xml:space="preserve"> </w:t>
+            </w:r>
+            <w:proofErr w:type="spellStart"/>
+            <w:r>
+              <w:t>trả</w:t>
+            </w:r>
+            <w:proofErr w:type="spellEnd"/>
+            <w:r>
+              <w:t xml:space="preserve"> 100% Deposit.</w:t>
+            </w:r>
+          </w:p>
+          <w:p>
+            <w:pPr>
+              <w:rPr>
+                <w:lang w:val="vi-VN"/>
+              </w:rPr>
+            </w:pPr>
+            <w:proofErr w:type="spellStart"/>
+            <w:r>
+              <w:t>Việc</w:t>
+            </w:r>
+            <w:proofErr w:type="spellEnd"/>
+            <w:r>
+              <w:t xml:space="preserve"> cancellation </w:t>
+            </w:r>
+            <w:proofErr w:type="spellStart"/>
+            <w:r>
+              <w:t>và</w:t>
+            </w:r>
+            <w:proofErr w:type="spellEnd"/>
+            <w:r>
+              <w:t xml:space="preserve"> refund </w:t>
+            </w:r>
+            <w:proofErr w:type="spellStart"/>
+            <w:r>
+              <w:t>không</w:t>
+            </w:r>
+            <w:proofErr w:type="spellEnd"/>
+            <w:r>
+              <w:t xml:space="preserve"> </w:t>
+            </w:r>
+            <w:proofErr w:type="spellStart"/>
+            <w:r>
+              <w:t>yêu</w:t>
+            </w:r>
+            <w:proofErr w:type="spellEnd"/>
+            <w:r>
+              <w:t xml:space="preserve"> </w:t>
+            </w:r>
+            <w:proofErr w:type="spellStart"/>
+            <w:r>
+              <w:t>cầu</w:t>
+            </w:r>
+            <w:proofErr w:type="spellEnd"/>
+            <w:r>
+              <w:t xml:space="preserve"> LM approval.</w:t>
+            </w:r>
+          </w:p>
+        </w:tc>
+        <w:tc>
+          <w:tcPr>
+            <w:tcW w:w="1950" w:type="dxa"/>
+            <w:tcMar>
+              <w:top w:w="100" w:type="dxa"/>
+              <w:left w:w="120" w:type="dxa"/>
+              <w:bottom w:w="100" w:type="dxa"/>
+              <w:right w:w="120" w:type="dxa"/>
+            </w:tcMar>
+          </w:tcPr>
+          <w:p>
+            <w:pPr>
+              <w:rPr>
+                <w:i/>
+                <w:iCs/>
+                <w:color w:val="595959"/>
+                <w:sz w:val="18"/>
+                <w:szCs w:val="18"/>
+                <w:lang w:val="vi-VN"/>
+              </w:rPr>
+            </w:pPr>
+            <w:proofErr w:type="spellStart"/>
+            <w:r>
+              <w:rPr>
+                <w:i/>
+                <w:iCs/>
+                <w:color w:val="595959"/>
+                <w:sz w:val="18"/>
+                <w:szCs w:val="18"/>
+              </w:rPr>
+              <w:t>Bắt</w:t>
+            </w:r>
+            <w:proofErr w:type="spellEnd"/>
+            <w:r>
+              <w:rPr>
+                <w:i/>
+                <w:iCs/>
+                <w:color w:val="595959"/>
+                <w:sz w:val="18"/>
+                <w:szCs w:val="18"/>
+                <w:lang w:val="vi-VN"/>
+              </w:rPr>
+              <w:t xml:space="preserve"> buộc</w:t>
+            </w:r>
+          </w:p>
+        </w:tc>
+      </w:tr>
+      <w:tr>
+        <w:tc>
+          <w:tcPr>
+            <w:tcW w:w="1100" w:type="dxa"/>
+            <w:tcMar>
+              <w:top w:w="100" w:type="dxa"/>
+              <w:left w:w="120" w:type="dxa"/>
+              <w:bottom w:w="100" w:type="dxa"/>
+              <w:right w:w="120" w:type="dxa"/>
+            </w:tcMar>
+          </w:tcPr>
+          <w:p>
+            <w:pPr>
+              <w:rPr>
+                <w:lang w:val="vi-VN"/>
+              </w:rPr>
+            </w:pPr>
+            <w:r>
+              <w:rPr>
+                <w:b/>
+                <w:bCs/>
+                <w:color w:val="1F3864"/>
+              </w:rPr>
+              <w:t>BR-</w:t>
+            </w:r>
+            <w:r>
+              <w:rPr>
+                <w:b/>
+                <w:bCs/>
+                <w:color w:val="1F3864"/>
+              </w:rPr>
+              <w:t>04</w:t>
+            </w:r>
+          </w:p>
+        </w:tc>
+        <w:tc>
+          <w:tcPr>
+            <w:tcW w:w="6300" w:type="dxa"/>
+            <w:tcMar>
+              <w:top w:w="100" w:type="dxa"/>
+              <w:left w:w="120" w:type="dxa"/>
+              <w:bottom w:w="100" w:type="dxa"/>
+              <w:right w:w="120" w:type="dxa"/>
+            </w:tcMar>
+          </w:tcPr>
+          <w:p>
+            <w:pPr>
+              <w:rPr>
+                <w:lang w:val="vi-VN"/>
+              </w:rPr>
+            </w:pPr>
+            <w:r>
+              <w:rPr>
+                <w:lang w:val="vi-VN"/>
+              </w:rPr>
+              <w:t xml:space="preserve">Mỗi Horse phải có một microchip ID duy nhất và không được để trống. </w:t>
+            </w:r>
+            <w:r>
+              <w:rPr>
+                <w:lang w:val="vi-VN"/>
+              </w:rPr>
+              <w:t>Microchip ID được lưu ở hồ sơ Horse và không được trùng giữa các Horse.</w:t>
+            </w:r>
+          </w:p>
+        </w:tc>
+        <w:tc>
+          <w:tcPr>
+            <w:tcW w:w="1950" w:type="dxa"/>
+            <w:tcMar>
+              <w:top w:w="100" w:type="dxa"/>
+              <w:left w:w="120" w:type="dxa"/>
+              <w:bottom w:w="100" w:type="dxa"/>
+              <w:right w:w="120" w:type="dxa"/>
+            </w:tcMar>
+          </w:tcPr>
+          <w:p>
+            <w:proofErr w:type="spellStart"/>
+            <w:r>
+              <w:rPr>
+                <w:i/>
+                <w:iCs/>
+                <w:color w:val="595959"/>
+                <w:sz w:val="18"/>
+                <w:szCs w:val="18"/>
+              </w:rPr>
+              <w:t>Bắt</w:t>
+            </w:r>
+            <w:proofErr w:type="spellEnd"/>
+            <w:r>
+              <w:rPr>
+                <w:i/>
+                <w:iCs/>
+                <w:color w:val="595959"/>
+                <w:sz w:val="18"/>
+                <w:szCs w:val="18"/>
+              </w:rPr>
+              <w:t xml:space="preserve"> </w:t>
+            </w:r>
+            <w:proofErr w:type="spellStart"/>
+            <w:r>
+              <w:rPr>
+                <w:i/>
+                <w:iCs/>
+                <w:color w:val="595959"/>
+                <w:sz w:val="18"/>
+                <w:szCs w:val="18"/>
+              </w:rPr>
+              <w:t>buộc</w:t>
+            </w:r>
+            <w:proofErr w:type="spellEnd"/>
+          </w:p>
+        </w:tc>
+      </w:tr>
+      <w:tr>
+        <w:tc>
+          <w:tcPr>
+            <w:tcW w:w="1100" w:type="dxa"/>
+            <w:tcMar>
+              <w:top w:w="100" w:type="dxa"/>
+              <w:left w:w="120" w:type="dxa"/>
+              <w:bottom w:w="100" w:type="dxa"/>
+              <w:right w:w="120" w:type="dxa"/>
+            </w:tcMar>
+          </w:tcPr>
+          <w:p>
+            <w:pPr>
+              <w:rPr>
+                <w:lang w:val="vi-VN"/>
+              </w:rPr>
+            </w:pPr>
+            <w:r>
+              <w:rPr>
+                <w:b/>
+                <w:bCs/>
+                <w:color w:val="1F3864"/>
+              </w:rPr>
+              <w:t>BR-</w:t>
+            </w:r>
+            <w:r>
+              <w:rPr>
+                <w:b/>
+                <w:bCs/>
+                <w:color w:val="1F3864"/>
+              </w:rPr>
+              <w:t>05</w:t>
+            </w:r>
+          </w:p>
+        </w:tc>
+        <w:tc>
+          <w:tcPr>
+            <w:tcW w:w="6300" w:type="dxa"/>
+            <w:tcMar>
+              <w:top w:w="100" w:type="dxa"/>
+              <w:left w:w="120" w:type="dxa"/>
+              <w:bottom w:w="100" w:type="dxa"/>
+              <w:right w:w="120" w:type="dxa"/>
+            </w:tcMar>
+          </w:tcPr>
+          <w:p>
+            <w:r>
+              <w:t xml:space="preserve">Transport Specialist (TS) </w:t>
+            </w:r>
+            <w:proofErr w:type="spellStart"/>
+            <w:r>
+              <w:t>phải</w:t>
+            </w:r>
+            <w:proofErr w:type="spellEnd"/>
+            <w:r>
+              <w:t xml:space="preserve"> </w:t>
+            </w:r>
+            <w:proofErr w:type="spellStart"/>
+            <w:r>
+              <w:t>nhập</w:t>
+            </w:r>
+            <w:proofErr w:type="spellEnd"/>
+            <w:r>
+              <w:t xml:space="preserve"> </w:t>
+            </w:r>
+            <w:proofErr w:type="spellStart"/>
+            <w:r>
+              <w:t>minimum_processing_days</w:t>
+            </w:r>
+            <w:proofErr w:type="spellEnd"/>
+            <w:r>
+              <w:t xml:space="preserve"> </w:t>
+            </w:r>
+            <w:proofErr w:type="spellStart"/>
+            <w:r>
+              <w:t>cho</w:t>
+            </w:r>
+            <w:proofErr w:type="spellEnd"/>
+            <w:r>
+              <w:t xml:space="preserve"> </w:t>
+            </w:r>
+            <w:proofErr w:type="spellStart"/>
+            <w:r>
+              <w:t>từng</w:t>
+            </w:r>
+            <w:proofErr w:type="spellEnd"/>
+            <w:r>
+              <w:t xml:space="preserve"> order </w:t>
+            </w:r>
+            <w:proofErr w:type="spellStart"/>
+            <w:r>
+              <w:t>dựa</w:t>
+            </w:r>
+            <w:proofErr w:type="spellEnd"/>
+            <w:r>
+              <w:t xml:space="preserve"> </w:t>
+            </w:r>
+            <w:proofErr w:type="spellStart"/>
+            <w:r>
+              <w:t>trên</w:t>
+            </w:r>
+            <w:proofErr w:type="spellEnd"/>
+            <w:r>
+              <w:t xml:space="preserve"> </w:t>
+            </w:r>
+            <w:proofErr w:type="spellStart"/>
+            <w:r>
+              <w:t>quy</w:t>
+            </w:r>
+            <w:proofErr w:type="spellEnd"/>
+            <w:r>
+              <w:t xml:space="preserve"> </w:t>
+            </w:r>
+            <w:proofErr w:type="spellStart"/>
+            <w:r>
+              <w:t>định</w:t>
+            </w:r>
+            <w:proofErr w:type="spellEnd"/>
+            <w:r>
+              <w:t xml:space="preserve"> </w:t>
+            </w:r>
+            <w:proofErr w:type="spellStart"/>
+            <w:r>
+              <w:t>được</w:t>
+            </w:r>
+            <w:proofErr w:type="spellEnd"/>
+            <w:r>
+              <w:t xml:space="preserve"> TS review </w:t>
+            </w:r>
+            <w:proofErr w:type="spellStart"/>
+            <w:r>
+              <w:t>bên</w:t>
+            </w:r>
+            <w:proofErr w:type="spellEnd"/>
+            <w:r>
+              <w:t xml:space="preserve"> </w:t>
+            </w:r>
+            <w:proofErr w:type="spellStart"/>
+            <w:r>
+              <w:t>ngoài</w:t>
+            </w:r>
+            <w:proofErr w:type="spellEnd"/>
+            <w:r>
+              <w:t xml:space="preserve">. LM </w:t>
+            </w:r>
+            <w:proofErr w:type="spellStart"/>
+            <w:r>
+              <w:t>không</w:t>
+            </w:r>
+            <w:proofErr w:type="spellEnd"/>
+            <w:r>
+              <w:t xml:space="preserve"> </w:t>
+            </w:r>
+            <w:proofErr w:type="spellStart"/>
+            <w:r>
+              <w:t>được</w:t>
+            </w:r>
+            <w:proofErr w:type="spellEnd"/>
+            <w:r>
+              <w:t xml:space="preserve"> </w:t>
+            </w:r>
+            <w:proofErr w:type="spellStart"/>
+            <w:r>
+              <w:t>phê</w:t>
+            </w:r>
+            <w:proofErr w:type="spellEnd"/>
+            <w:r>
+              <w:t xml:space="preserve"> </w:t>
+            </w:r>
+            <w:proofErr w:type="spellStart"/>
+            <w:r>
+              <w:t>duyệt</w:t>
+            </w:r>
+            <w:proofErr w:type="spellEnd"/>
+            <w:r>
+              <w:t xml:space="preserve"> order </w:t>
+            </w:r>
+            <w:proofErr w:type="spellStart"/>
+            <w:r>
+              <w:t>nếu</w:t>
+            </w:r>
+            <w:proofErr w:type="spellEnd"/>
+            <w:r>
+              <w:t xml:space="preserve"> </w:t>
+            </w:r>
+            <w:proofErr w:type="spellStart"/>
+            <w:r>
+              <w:t>requested_departure_at</w:t>
+            </w:r>
+            <w:proofErr w:type="spellEnd"/>
+            <w:r>
+              <w:t xml:space="preserve"> </w:t>
+            </w:r>
+            <w:proofErr w:type="spellStart"/>
+            <w:r>
+              <w:t>sớm</w:t>
+            </w:r>
+            <w:proofErr w:type="spellEnd"/>
+            <w:r>
+              <w:t xml:space="preserve"> </w:t>
+            </w:r>
+            <w:proofErr w:type="spellStart"/>
+            <w:r>
+              <w:t>hơn</w:t>
+            </w:r>
+            <w:proofErr w:type="spellEnd"/>
+            <w:r>
+              <w:t xml:space="preserve"> </w:t>
+            </w:r>
+            <w:proofErr w:type="spellStart"/>
+            <w:r>
+              <w:t>created_at</w:t>
+            </w:r>
+            <w:proofErr w:type="spellEnd"/>
+            <w:r>
+              <w:t xml:space="preserve"> + </w:t>
+            </w:r>
+            <w:proofErr w:type="spellStart"/>
+            <w:r>
+              <w:t>minimum_processing_days</w:t>
+            </w:r>
+            <w:proofErr w:type="spellEnd"/>
+            <w:r>
+              <w:t>.</w:t>
+            </w:r>
+          </w:p>
+        </w:tc>
+        <w:tc>
+          <w:tcPr>
+            <w:tcW w:w="1950" w:type="dxa"/>
+            <w:tcMar>
+              <w:top w:w="100" w:type="dxa"/>
+              <w:left w:w="120" w:type="dxa"/>
+              <w:bottom w:w="100" w:type="dxa"/>
+              <w:right w:w="120" w:type="dxa"/>
+            </w:tcMar>
+          </w:tcPr>
+          <w:p>
+            <w:proofErr w:type="spellStart"/>
+            <w:r>
+              <w:rPr>
+                <w:b/>
+                <w:bCs/>
+                <w:i/>
+                <w:iCs/>
+                <w:color w:val="833C0C"/>
+                <w:sz w:val="18"/>
+                <w:szCs w:val="18"/>
+              </w:rPr>
+              <w:t>Cần</w:t>
+            </w:r>
+            <w:proofErr w:type="spellEnd"/>
+            <w:r>
+              <w:rPr>
+                <w:b/>
+                <w:bCs/>
+                <w:i/>
+                <w:iCs/>
+                <w:color w:val="833C0C"/>
+                <w:sz w:val="18"/>
+                <w:szCs w:val="18"/>
+              </w:rPr>
+              <w:t xml:space="preserve"> </w:t>
+            </w:r>
+            <w:proofErr w:type="spellStart"/>
+            <w:r>
+              <w:rPr>
+                <w:b/>
+                <w:bCs/>
+                <w:i/>
+                <w:iCs/>
+                <w:color w:val="833C0C"/>
+                <w:sz w:val="18"/>
+                <w:szCs w:val="18"/>
+              </w:rPr>
+              <w:t>xác</w:t>
+            </w:r>
+            <w:proofErr w:type="spellEnd"/>
+            <w:r>
+              <w:rPr>
+                <w:b/>
+                <w:bCs/>
+                <w:i/>
+                <w:iCs/>
+                <w:color w:val="833C0C"/>
+                <w:sz w:val="18"/>
+                <w:szCs w:val="18"/>
+              </w:rPr>
+              <w:t xml:space="preserve"> </w:t>
+            </w:r>
+            <w:proofErr w:type="spellStart"/>
+            <w:r>
+              <w:rPr>
+                <w:b/>
+                <w:bCs/>
+                <w:i/>
+                <w:iCs/>
+                <w:color w:val="833C0C"/>
+                <w:sz w:val="18"/>
+                <w:szCs w:val="18"/>
+              </w:rPr>
+              <w:t>nhận</w:t>
+            </w:r>
+            <w:proofErr w:type="spellEnd"/>
+          </w:p>
+        </w:tc>
+      </w:tr>
+      <w:tr>
+        <w:tc>
+          <w:tcPr>
+            <w:tcW w:w="1100" w:type="dxa"/>
+            <w:tcMar>
+              <w:top w:w="100" w:type="dxa"/>
+              <w:left w:w="120" w:type="dxa"/>
+              <w:bottom w:w="100" w:type="dxa"/>
+              <w:right w:w="120" w:type="dxa"/>
+            </w:tcMar>
+          </w:tcPr>
+          <w:p>
+            <w:pPr>
+              <w:rPr>
+                <w:b/>
+                <w:bCs/>
+                <w:color w:val="1F3864"/>
+                <w:lang w:val="vi-VN"/>
+              </w:rPr>
+            </w:pPr>
+            <w:r>
+              <w:rPr>
+                <w:b/>
+                <w:bCs/>
+                <w:color w:val="1F3864"/>
+              </w:rPr>
+              <w:t>BR</w:t>
+            </w:r>
+            <w:r>
+              <w:rPr>
+                <w:b/>
+                <w:bCs/>
+                <w:color w:val="1F3864"/>
+                <w:lang w:val="vi-VN"/>
+              </w:rPr>
+              <w:t>-</w:t>
+            </w:r>
+            <w:r>
+              <w:rPr>
+                <w:b/>
+                <w:bCs/>
+                <w:color w:val="1F3864"/>
+                <w:lang w:val="vi-VN"/>
+              </w:rPr>
+              <w:t>06</w:t>
+            </w:r>
+            <w:r>
+              <w:rPr>
+                <w:b/>
+                <w:bCs/>
+                <w:color w:val="1F3864"/>
+                <w:lang w:val="vi-VN"/>
+              </w:rPr>
+              <w:t xml:space="preserve"> </w:t>
             </w:r>
           </w:p>
         </w:tc>
@@ -3253,6 +3710,7 @@
                 <w:szCs w:val="18"/>
                 <w:lang w:val="vi-VN"/>
               </w:rPr>
+              <w:lastRenderedPageBreak/>
               <w:t>Bắt buộc</w:t>
             </w:r>
           </w:p>
@@ -3557,7 +4015,7 @@
                 <w:bCs/>
                 <w:color w:val="1F3864"/>
               </w:rPr>
-              <w:t>06</w:t>
+              <w:t>07</w:t>
             </w:r>
           </w:p>
         </w:tc>
@@ -3792,7 +4250,7 @@
                 <w:bCs/>
                 <w:color w:val="1F3864"/>
               </w:rPr>
-              <w:t>07</w:t>
+              <w:t>08</w:t>
             </w:r>
           </w:p>
         </w:tc>
@@ -3905,7 +4363,6 @@
             </w:r>
             <w:proofErr w:type="spellStart"/>
             <w:r>
-              <w:lastRenderedPageBreak/>
               <w:t>planned_stop_duration_minutes</w:t>
             </w:r>
             <w:proofErr w:type="spellEnd"/>
@@ -4030,7 +4487,6 @@
                 <w:sz w:val="18"/>
                 <w:szCs w:val="18"/>
               </w:rPr>
-              <w:lastRenderedPageBreak/>
               <w:t>Bắt</w:t>
             </w:r>
             <w:proofErr w:type="spellEnd"/>
@@ -4091,7 +4547,7 @@
                 <w:bCs/>
                 <w:color w:val="1F3864"/>
               </w:rPr>
-              <w:t>08</w:t>
+              <w:t>09</w:t>
             </w:r>
           </w:p>
         </w:tc>
@@ -4166,6 +4622,329 @@
               <w:t>buộc</w:t>
             </w:r>
             <w:proofErr w:type="spellEnd"/>
+          </w:p>
+        </w:tc>
+      </w:tr>
+      <w:tr>
+        <w:tc>
+          <w:tcPr>
+            <w:tcW w:w="1100" w:type="dxa"/>
+            <w:shd w:val="clear" w:color="auto" w:fill="F2F6FB"/>
+            <w:tcMar>
+              <w:top w:w="100" w:type="dxa"/>
+              <w:left w:w="120" w:type="dxa"/>
+              <w:bottom w:w="100" w:type="dxa"/>
+              <w:right w:w="120" w:type="dxa"/>
+            </w:tcMar>
+          </w:tcPr>
+          <w:p>
+            <w:pPr>
+              <w:rPr>
+                <w:b/>
+                <w:bCs/>
+                <w:color w:val="1F3864"/>
+                <w:lang w:val="vi-VN"/>
+              </w:rPr>
+            </w:pPr>
+            <w:r>
+              <w:rPr>
+                <w:b/>
+                <w:bCs/>
+                <w:color w:val="1F3864"/>
+              </w:rPr>
+              <w:t>BR</w:t>
+            </w:r>
+            <w:r>
+              <w:rPr>
+                <w:b/>
+                <w:bCs/>
+                <w:color w:val="1F3864"/>
+                <w:lang w:val="vi-VN"/>
+              </w:rPr>
+              <w:t>-</w:t>
+            </w:r>
+            <w:r>
+              <w:rPr>
+                <w:b/>
+                <w:bCs/>
+                <w:color w:val="1F3864"/>
+                <w:lang w:val="vi-VN"/>
+              </w:rPr>
+              <w:t>10</w:t>
+            </w:r>
+          </w:p>
+        </w:tc>
+        <w:tc>
+          <w:tcPr>
+            <w:tcW w:w="6300" w:type="dxa"/>
+            <w:shd w:val="clear" w:color="auto" w:fill="F2F6FB"/>
+            <w:tcMar>
+              <w:top w:w="100" w:type="dxa"/>
+              <w:left w:w="120" w:type="dxa"/>
+              <w:bottom w:w="100" w:type="dxa"/>
+              <w:right w:w="120" w:type="dxa"/>
+            </w:tcMar>
+          </w:tcPr>
+          <w:p>
+            <w:pPr>
+              <w:rPr>
+                <w:lang w:val="vi-VN"/>
+              </w:rPr>
+            </w:pPr>
+            <w:r>
+              <w:t xml:space="preserve">Sau </w:t>
+            </w:r>
+            <w:proofErr w:type="spellStart"/>
+            <w:r>
+              <w:t>khi</w:t>
+            </w:r>
+            <w:proofErr w:type="spellEnd"/>
+            <w:r>
+              <w:t xml:space="preserve"> TS </w:t>
+            </w:r>
+            <w:proofErr w:type="spellStart"/>
+            <w:r>
+              <w:t>thực</w:t>
+            </w:r>
+            <w:proofErr w:type="spellEnd"/>
+            <w:r>
+              <w:t xml:space="preserve"> </w:t>
+            </w:r>
+            <w:proofErr w:type="spellStart"/>
+            <w:r>
+              <w:t>hiện</w:t>
+            </w:r>
+            <w:proofErr w:type="spellEnd"/>
+            <w:r>
+              <w:t xml:space="preserve"> Final Confirm </w:t>
+            </w:r>
+            <w:proofErr w:type="spellStart"/>
+            <w:r>
+              <w:t>và</w:t>
+            </w:r>
+            <w:proofErr w:type="spellEnd"/>
+            <w:r>
+              <w:t xml:space="preserve"> </w:t>
+            </w:r>
+            <w:proofErr w:type="spellStart"/>
+            <w:r>
+              <w:t>tất</w:t>
+            </w:r>
+            <w:proofErr w:type="spellEnd"/>
+            <w:r>
+              <w:t xml:space="preserve"> </w:t>
+            </w:r>
+            <w:proofErr w:type="spellStart"/>
+            <w:r>
+              <w:t>cả</w:t>
+            </w:r>
+            <w:proofErr w:type="spellEnd"/>
+            <w:r>
+              <w:t xml:space="preserve"> mandatory documents </w:t>
+            </w:r>
+            <w:proofErr w:type="spellStart"/>
+            <w:r>
+              <w:t>của</w:t>
+            </w:r>
+            <w:proofErr w:type="spellEnd"/>
+            <w:r>
+              <w:t xml:space="preserve"> Order </w:t>
+            </w:r>
+            <w:proofErr w:type="spellStart"/>
+            <w:r>
+              <w:t>đã</w:t>
+            </w:r>
+            <w:proofErr w:type="spellEnd"/>
+            <w:r>
+              <w:t xml:space="preserve"> </w:t>
+            </w:r>
+            <w:proofErr w:type="spellStart"/>
+            <w:r>
+              <w:t>được</w:t>
+            </w:r>
+            <w:proofErr w:type="spellEnd"/>
+            <w:r>
+              <w:t xml:space="preserve"> APPROVED, Customer </w:t>
+            </w:r>
+            <w:proofErr w:type="spellStart"/>
+            <w:r>
+              <w:t>phải</w:t>
+            </w:r>
+            <w:proofErr w:type="spellEnd"/>
+            <w:r>
+              <w:t xml:space="preserve"> </w:t>
+            </w:r>
+            <w:proofErr w:type="spellStart"/>
+            <w:r>
+              <w:t>thanh</w:t>
+            </w:r>
+            <w:proofErr w:type="spellEnd"/>
+            <w:r>
+              <w:t xml:space="preserve"> </w:t>
+            </w:r>
+            <w:proofErr w:type="spellStart"/>
+            <w:r>
+              <w:t>toán</w:t>
+            </w:r>
+            <w:proofErr w:type="spellEnd"/>
+            <w:r>
+              <w:t xml:space="preserve"> Remaining Balance </w:t>
+            </w:r>
+            <w:proofErr w:type="spellStart"/>
+            <w:r>
+              <w:t>theo</w:t>
+            </w:r>
+            <w:proofErr w:type="spellEnd"/>
+            <w:r>
+              <w:t xml:space="preserve"> quotation </w:t>
+            </w:r>
+            <w:proofErr w:type="spellStart"/>
+            <w:r>
+              <w:t>đã</w:t>
+            </w:r>
+            <w:proofErr w:type="spellEnd"/>
+            <w:r>
+              <w:t xml:space="preserve"> </w:t>
+            </w:r>
+            <w:proofErr w:type="spellStart"/>
+            <w:r>
+              <w:t>được</w:t>
+            </w:r>
+            <w:proofErr w:type="spellEnd"/>
+            <w:r>
+              <w:t xml:space="preserve"> </w:t>
+            </w:r>
+            <w:proofErr w:type="spellStart"/>
+            <w:r>
+              <w:t>khóa</w:t>
+            </w:r>
+            <w:proofErr w:type="spellEnd"/>
+            <w:r>
+              <w:t xml:space="preserve">. Order </w:t>
+            </w:r>
+            <w:proofErr w:type="spellStart"/>
+            <w:r>
+              <w:t>chỉ</w:t>
+            </w:r>
+            <w:proofErr w:type="spellEnd"/>
+            <w:r>
+              <w:t xml:space="preserve"> </w:t>
+            </w:r>
+            <w:proofErr w:type="spellStart"/>
+            <w:r>
+              <w:t>được</w:t>
+            </w:r>
+            <w:proofErr w:type="spellEnd"/>
+            <w:r>
+              <w:t xml:space="preserve"> </w:t>
+            </w:r>
+            <w:proofErr w:type="spellStart"/>
+            <w:r>
+              <w:t>chuyển</w:t>
+            </w:r>
+            <w:proofErr w:type="spellEnd"/>
+            <w:r>
+              <w:t xml:space="preserve"> sang Route Planning </w:t>
+            </w:r>
+            <w:proofErr w:type="spellStart"/>
+            <w:r>
+              <w:t>sau</w:t>
+            </w:r>
+            <w:proofErr w:type="spellEnd"/>
+            <w:r>
+              <w:t xml:space="preserve"> </w:t>
+            </w:r>
+            <w:proofErr w:type="spellStart"/>
+            <w:r>
+              <w:t>khi</w:t>
+            </w:r>
+            <w:proofErr w:type="spellEnd"/>
+            <w:r>
+              <w:t xml:space="preserve"> Stripe </w:t>
+            </w:r>
+            <w:proofErr w:type="spellStart"/>
+            <w:r>
+              <w:t>xác</w:t>
+            </w:r>
+            <w:proofErr w:type="spellEnd"/>
+            <w:r>
+              <w:t xml:space="preserve"> </w:t>
+            </w:r>
+            <w:proofErr w:type="spellStart"/>
+            <w:r>
+              <w:t>nhận</w:t>
+            </w:r>
+            <w:proofErr w:type="spellEnd"/>
+            <w:r>
+              <w:t xml:space="preserve"> </w:t>
+            </w:r>
+            <w:proofErr w:type="spellStart"/>
+            <w:r>
+              <w:t>thanh</w:t>
+            </w:r>
+            <w:proofErr w:type="spellEnd"/>
+            <w:r>
+              <w:t xml:space="preserve"> </w:t>
+            </w:r>
+            <w:proofErr w:type="spellStart"/>
+            <w:r>
+              <w:t>toán</w:t>
+            </w:r>
+            <w:proofErr w:type="spellEnd"/>
+            <w:r>
+              <w:t xml:space="preserve"> Remaining Balance </w:t>
+            </w:r>
+            <w:proofErr w:type="spellStart"/>
+            <w:r>
+              <w:t>thành</w:t>
+            </w:r>
+            <w:proofErr w:type="spellEnd"/>
+            <w:r>
+              <w:t xml:space="preserve"> </w:t>
+            </w:r>
+            <w:proofErr w:type="spellStart"/>
+            <w:r>
+              <w:t>công</w:t>
+            </w:r>
+            <w:proofErr w:type="spellEnd"/>
+            <w:r>
+              <w:t>.</w:t>
+            </w:r>
+          </w:p>
+        </w:tc>
+        <w:tc>
+          <w:tcPr>
+            <w:tcW w:w="1950" w:type="dxa"/>
+            <w:shd w:val="clear" w:color="auto" w:fill="F2F6FB"/>
+            <w:tcMar>
+              <w:top w:w="100" w:type="dxa"/>
+              <w:left w:w="120" w:type="dxa"/>
+              <w:bottom w:w="100" w:type="dxa"/>
+              <w:right w:w="120" w:type="dxa"/>
+            </w:tcMar>
+          </w:tcPr>
+          <w:p>
+            <w:pPr>
+              <w:rPr>
+                <w:i/>
+                <w:iCs/>
+                <w:color w:val="595959"/>
+                <w:sz w:val="18"/>
+                <w:szCs w:val="18"/>
+                <w:lang w:val="vi-VN"/>
+              </w:rPr>
+            </w:pPr>
+            <w:r>
+              <w:rPr>
+                <w:i/>
+                <w:iCs/>
+                <w:color w:val="595959"/>
+                <w:sz w:val="18"/>
+                <w:szCs w:val="18"/>
+                <w:lang w:val="vi-VN"/>
+              </w:rPr>
+              <w:t>Bắt buộc</w:t>
+            </w:r>
           </w:p>
         </w:tc>
       </w:tr>
@@ -4201,7 +4980,7 @@
                 <w:bCs/>
                 <w:color w:val="1F3864"/>
               </w:rPr>
-              <w:t>09</w:t>
+              <w:t>11</w:t>
             </w:r>
           </w:p>
         </w:tc>
@@ -4538,7 +5317,27 @@
           <w:sz w:val="24"/>
           <w:szCs w:val="24"/>
         </w:rPr>
-        <w:t xml:space="preserve"> sơ </w:t>
+        <w:t xml:space="preserve"> </w:t>
+      </w:r>
+      <w:proofErr w:type="spellStart"/>
+      <w:r>
+        <w:rPr>
+          <w:b/>
+          <w:bCs/>
+          <w:sz w:val="24"/>
+          <w:szCs w:val="24"/>
+        </w:rPr>
+        <w:t>sơ</w:t>
+      </w:r>
+      <w:proofErr w:type="spellEnd"/>
+      <w:r>
+        <w:rPr>
+          <w:b/>
+          <w:bCs/>
+          <w:sz w:val="24"/>
+          <w:szCs w:val="24"/>
+        </w:rPr>
+        <w:t xml:space="preserve"> </w:t>
       </w:r>
       <w:proofErr w:type="spellStart"/>
       <w:r>
@@ -4797,7 +5596,7 @@
                 <w:bCs/>
                 <w:color w:val="1F3864"/>
               </w:rPr>
-              <w:t>10</w:t>
+              <w:t>12</w:t>
             </w:r>
           </w:p>
         </w:tc>
@@ -5072,7 +5871,7 @@
                 <w:bCs/>
                 <w:color w:val="1F3864"/>
               </w:rPr>
-              <w:t>11</w:t>
+              <w:t>13</w:t>
             </w:r>
           </w:p>
         </w:tc>
@@ -5310,7 +6109,7 @@
                 <w:bCs/>
                 <w:color w:val="1F3864"/>
               </w:rPr>
-              <w:t>12</w:t>
+              <w:t>14</w:t>
             </w:r>
           </w:p>
         </w:tc>
@@ -5704,7 +6503,7 @@
                 <w:bCs/>
                 <w:color w:val="1F3864"/>
               </w:rPr>
-              <w:t>13</w:t>
+              <w:t>15</w:t>
             </w:r>
           </w:p>
         </w:tc>
@@ -6038,6 +6837,339 @@
               <w:t>buộc</w:t>
             </w:r>
             <w:proofErr w:type="spellEnd"/>
+          </w:p>
+        </w:tc>
+      </w:tr>
+      <w:tr>
+        <w:tc>
+          <w:tcPr>
+            <w:tcW w:w="1100" w:type="dxa"/>
+            <w:tcMar>
+              <w:top w:w="100" w:type="dxa"/>
+              <w:left w:w="120" w:type="dxa"/>
+              <w:bottom w:w="100" w:type="dxa"/>
+              <w:right w:w="120" w:type="dxa"/>
+            </w:tcMar>
+          </w:tcPr>
+          <w:p>
+            <w:pPr>
+              <w:rPr>
+                <w:b/>
+                <w:bCs/>
+                <w:color w:val="1F3864"/>
+                <w:lang w:val="vi-VN"/>
+              </w:rPr>
+            </w:pPr>
+            <w:r>
+              <w:rPr>
+                <w:b/>
+                <w:bCs/>
+                <w:color w:val="1F3864"/>
+              </w:rPr>
+              <w:t>BR-</w:t>
+            </w:r>
+            <w:r>
+              <w:rPr>
+                <w:b/>
+                <w:bCs/>
+                <w:color w:val="1F3864"/>
+              </w:rPr>
+              <w:t>16</w:t>
+            </w:r>
+          </w:p>
+        </w:tc>
+        <w:tc>
+          <w:tcPr>
+            <w:tcW w:w="6300" w:type="dxa"/>
+            <w:tcMar>
+              <w:top w:w="100" w:type="dxa"/>
+              <w:left w:w="120" w:type="dxa"/>
+              <w:bottom w:w="100" w:type="dxa"/>
+              <w:right w:w="120" w:type="dxa"/>
+            </w:tcMar>
+          </w:tcPr>
+          <w:p>
+            <w:r>
+              <w:rPr>
+                <w:lang w:val="vi-VN"/>
+              </w:rPr>
+              <w:t xml:space="preserve">Sau khi Route Plan được LM Confirm, hệ thống tự động phân công nhân sự thực hiện. </w:t>
+            </w:r>
+            <w:proofErr w:type="spellStart"/>
+            <w:r>
+              <w:t>Mỗi</w:t>
+            </w:r>
+            <w:proofErr w:type="spellEnd"/>
+            <w:r>
+              <w:t xml:space="preserve"> ROAD Vehicle </w:t>
+            </w:r>
+            <w:proofErr w:type="spellStart"/>
+            <w:r>
+              <w:t>phải</w:t>
+            </w:r>
+            <w:proofErr w:type="spellEnd"/>
+            <w:r>
+              <w:t xml:space="preserve"> </w:t>
+            </w:r>
+            <w:proofErr w:type="spellStart"/>
+            <w:r>
+              <w:t>được</w:t>
+            </w:r>
+            <w:proofErr w:type="spellEnd"/>
+            <w:r>
+              <w:t xml:space="preserve"> </w:t>
+            </w:r>
+            <w:proofErr w:type="spellStart"/>
+            <w:r>
+              <w:t>phân</w:t>
+            </w:r>
+            <w:proofErr w:type="spellEnd"/>
+            <w:r>
+              <w:t xml:space="preserve"> </w:t>
+            </w:r>
+            <w:proofErr w:type="spellStart"/>
+            <w:r>
+              <w:t>công</w:t>
+            </w:r>
+            <w:proofErr w:type="spellEnd"/>
+            <w:r>
+              <w:t xml:space="preserve"> </w:t>
+            </w:r>
+            <w:proofErr w:type="spellStart"/>
+            <w:r>
+              <w:t>đúng</w:t>
+            </w:r>
+            <w:proofErr w:type="spellEnd"/>
+            <w:r>
+              <w:t xml:space="preserve"> 1 Driver </w:t>
+            </w:r>
+            <w:proofErr w:type="spellStart"/>
+            <w:r>
+              <w:t>và</w:t>
+            </w:r>
+            <w:proofErr w:type="spellEnd"/>
+            <w:r>
+              <w:t xml:space="preserve"> 1 </w:t>
+            </w:r>
+            <w:r>
+              <w:lastRenderedPageBreak/>
+              <w:t xml:space="preserve">Escort. </w:t>
+            </w:r>
+            <w:proofErr w:type="spellStart"/>
+            <w:r>
+              <w:t>Mỗi</w:t>
+            </w:r>
+            <w:proofErr w:type="spellEnd"/>
+            <w:r>
+              <w:t xml:space="preserve"> AIR </w:t>
+            </w:r>
+            <w:proofErr w:type="spellStart"/>
+            <w:r>
+              <w:t>RouteLeg</w:t>
+            </w:r>
+            <w:proofErr w:type="spellEnd"/>
+            <w:r>
+              <w:t xml:space="preserve"> </w:t>
+            </w:r>
+            <w:proofErr w:type="spellStart"/>
+            <w:r>
+              <w:t>phải</w:t>
+            </w:r>
+            <w:proofErr w:type="spellEnd"/>
+            <w:r>
+              <w:t xml:space="preserve"> </w:t>
+            </w:r>
+            <w:proofErr w:type="spellStart"/>
+            <w:r>
+              <w:t>được</w:t>
+            </w:r>
+            <w:proofErr w:type="spellEnd"/>
+            <w:r>
+              <w:t xml:space="preserve"> </w:t>
+            </w:r>
+            <w:proofErr w:type="spellStart"/>
+            <w:r>
+              <w:t>phân</w:t>
+            </w:r>
+            <w:proofErr w:type="spellEnd"/>
+            <w:r>
+              <w:t xml:space="preserve"> </w:t>
+            </w:r>
+            <w:proofErr w:type="spellStart"/>
+            <w:r>
+              <w:t>công</w:t>
+            </w:r>
+            <w:proofErr w:type="spellEnd"/>
+            <w:r>
+              <w:t xml:space="preserve"> </w:t>
+            </w:r>
+            <w:proofErr w:type="spellStart"/>
+            <w:r>
+              <w:t>đúng</w:t>
+            </w:r>
+            <w:proofErr w:type="spellEnd"/>
+            <w:r>
+              <w:t xml:space="preserve"> 1 Escort. </w:t>
+            </w:r>
+            <w:proofErr w:type="spellStart"/>
+            <w:r>
+              <w:t>Một</w:t>
+            </w:r>
+            <w:proofErr w:type="spellEnd"/>
+            <w:r>
+              <w:t xml:space="preserve"> </w:t>
+            </w:r>
+            <w:proofErr w:type="spellStart"/>
+            <w:r>
+              <w:t>RouteLeg</w:t>
+            </w:r>
+            <w:proofErr w:type="spellEnd"/>
+            <w:r>
+              <w:t xml:space="preserve"> </w:t>
+            </w:r>
+            <w:proofErr w:type="spellStart"/>
+            <w:r>
+              <w:t>có</w:t>
+            </w:r>
+            <w:proofErr w:type="spellEnd"/>
+            <w:r>
+              <w:t xml:space="preserve"> </w:t>
+            </w:r>
+            <w:proofErr w:type="spellStart"/>
+            <w:r>
+              <w:t>thể</w:t>
+            </w:r>
+            <w:proofErr w:type="spellEnd"/>
+            <w:r>
+              <w:t xml:space="preserve"> </w:t>
+            </w:r>
+            <w:proofErr w:type="spellStart"/>
+            <w:r>
+              <w:t>sử</w:t>
+            </w:r>
+            <w:proofErr w:type="spellEnd"/>
+            <w:r>
+              <w:t xml:space="preserve"> </w:t>
+            </w:r>
+            <w:proofErr w:type="spellStart"/>
+            <w:r>
+              <w:t>dụng</w:t>
+            </w:r>
+            <w:proofErr w:type="spellEnd"/>
+            <w:r>
+              <w:t xml:space="preserve"> </w:t>
+            </w:r>
+            <w:proofErr w:type="spellStart"/>
+            <w:r>
+              <w:t>các</w:t>
+            </w:r>
+            <w:proofErr w:type="spellEnd"/>
+            <w:r>
+              <w:t xml:space="preserve"> </w:t>
+            </w:r>
+            <w:proofErr w:type="spellStart"/>
+            <w:r>
+              <w:t>nhân</w:t>
+            </w:r>
+            <w:proofErr w:type="spellEnd"/>
+            <w:r>
+              <w:t xml:space="preserve"> </w:t>
+            </w:r>
+            <w:proofErr w:type="spellStart"/>
+            <w:r>
+              <w:t>sự</w:t>
+            </w:r>
+            <w:proofErr w:type="spellEnd"/>
+            <w:r>
+              <w:t xml:space="preserve"> </w:t>
+            </w:r>
+            <w:proofErr w:type="spellStart"/>
+            <w:r>
+              <w:t>khác</w:t>
+            </w:r>
+            <w:proofErr w:type="spellEnd"/>
+            <w:r>
+              <w:t xml:space="preserve"> </w:t>
+            </w:r>
+            <w:proofErr w:type="spellStart"/>
+            <w:r>
+              <w:t>nhau</w:t>
+            </w:r>
+            <w:proofErr w:type="spellEnd"/>
+            <w:r>
+              <w:t xml:space="preserve"> so </w:t>
+            </w:r>
+            <w:proofErr w:type="spellStart"/>
+            <w:r>
+              <w:t>với</w:t>
+            </w:r>
+            <w:proofErr w:type="spellEnd"/>
+            <w:r>
+              <w:t xml:space="preserve"> </w:t>
+            </w:r>
+            <w:proofErr w:type="spellStart"/>
+            <w:r>
+              <w:t>RouteLeg</w:t>
+            </w:r>
+            <w:proofErr w:type="spellEnd"/>
+            <w:r>
+              <w:t xml:space="preserve"> </w:t>
+            </w:r>
+            <w:proofErr w:type="spellStart"/>
+            <w:r>
+              <w:t>khác</w:t>
+            </w:r>
+            <w:proofErr w:type="spellEnd"/>
+            <w:r>
+              <w:t>.</w:t>
+            </w:r>
+          </w:p>
+        </w:tc>
+        <w:tc>
+          <w:tcPr>
+            <w:tcW w:w="1950" w:type="dxa"/>
+            <w:tcMar>
+              <w:top w:w="100" w:type="dxa"/>
+              <w:left w:w="120" w:type="dxa"/>
+              <w:bottom w:w="100" w:type="dxa"/>
+              <w:right w:w="120" w:type="dxa"/>
+            </w:tcMar>
+          </w:tcPr>
+          <w:p>
+            <w:pPr>
+              <w:rPr>
+                <w:i/>
+                <w:iCs/>
+                <w:color w:val="595959"/>
+                <w:sz w:val="18"/>
+                <w:szCs w:val="18"/>
+                <w:lang w:val="vi-VN"/>
+              </w:rPr>
+            </w:pPr>
+            <w:proofErr w:type="spellStart"/>
+            <w:r>
+              <w:rPr>
+                <w:i/>
+                <w:iCs/>
+                <w:color w:val="595959"/>
+                <w:sz w:val="18"/>
+                <w:szCs w:val="18"/>
+              </w:rPr>
+              <w:lastRenderedPageBreak/>
+              <w:t>Bắt</w:t>
+            </w:r>
+            <w:proofErr w:type="spellEnd"/>
+            <w:r>
+              <w:rPr>
+                <w:i/>
+                <w:iCs/>
+                <w:color w:val="595959"/>
+                <w:sz w:val="18"/>
+                <w:szCs w:val="18"/>
+                <w:lang w:val="vi-VN"/>
+              </w:rPr>
+              <w:t xml:space="preserve"> buộc</w:t>
+            </w:r>
           </w:p>
         </w:tc>
       </w:tr>
@@ -6290,7 +7422,6 @@
         <w:tc>
           <w:tcPr>
             <w:tcW w:w="1100" w:type="dxa"/>
-            <w:shd w:val="clear" w:color="auto" w:fill="F2F6FB"/>
             <w:tcMar>
               <w:top w:w="100" w:type="dxa"/>
               <w:left w:w="120" w:type="dxa"/>
@@ -6318,14 +7449,13 @@
                 <w:bCs/>
                 <w:color w:val="1F3864"/>
               </w:rPr>
-              <w:t>14</w:t>
+              <w:t>17</w:t>
             </w:r>
           </w:p>
         </w:tc>
         <w:tc>
           <w:tcPr>
             <w:tcW w:w="6300" w:type="dxa"/>
-            <w:shd w:val="clear" w:color="auto" w:fill="F2F6FB"/>
             <w:tcMar>
               <w:top w:w="100" w:type="dxa"/>
               <w:left w:w="120" w:type="dxa"/>
@@ -6376,99 +7506,98 @@
             </w:r>
             <w:proofErr w:type="spellStart"/>
             <w:r>
+              <w:t>được</w:t>
+            </w:r>
+            <w:proofErr w:type="spellEnd"/>
+            <w:r>
+              <w:t xml:space="preserve"> </w:t>
+            </w:r>
+            <w:proofErr w:type="spellStart"/>
+            <w:r>
+              <w:t>phân</w:t>
+            </w:r>
+            <w:proofErr w:type="spellEnd"/>
+            <w:r>
+              <w:t xml:space="preserve"> </w:t>
+            </w:r>
+            <w:proofErr w:type="spellStart"/>
+            <w:r>
+              <w:t>công</w:t>
+            </w:r>
+            <w:proofErr w:type="spellEnd"/>
+            <w:r>
+              <w:t xml:space="preserve"> ở </w:t>
+            </w:r>
+            <w:proofErr w:type="spellStart"/>
+            <w:r>
+              <w:t>cấp</w:t>
+            </w:r>
+            <w:proofErr w:type="spellEnd"/>
+            <w:r>
+              <w:t xml:space="preserve"> Order. </w:t>
+            </w:r>
+            <w:proofErr w:type="spellStart"/>
+            <w:r>
+              <w:t>Mỗi</w:t>
+            </w:r>
+            <w:proofErr w:type="spellEnd"/>
+            <w:r>
+              <w:t xml:space="preserve"> ROAD </w:t>
+            </w:r>
+            <w:proofErr w:type="spellStart"/>
+            <w:r>
+              <w:t>RouteLeg</w:t>
+            </w:r>
+            <w:proofErr w:type="spellEnd"/>
+            <w:r>
+              <w:t xml:space="preserve"> </w:t>
+            </w:r>
+            <w:proofErr w:type="spellStart"/>
+            <w:r>
+              <w:t>phải</w:t>
+            </w:r>
+            <w:proofErr w:type="spellEnd"/>
+            <w:r>
+              <w:t xml:space="preserve"> </w:t>
+            </w:r>
+            <w:proofErr w:type="spellStart"/>
+            <w:r>
+              <w:t>có</w:t>
+            </w:r>
+            <w:proofErr w:type="spellEnd"/>
+            <w:r>
+              <w:t xml:space="preserve"> </w:t>
+            </w:r>
+            <w:proofErr w:type="spellStart"/>
+            <w:r>
+              <w:t>thể</w:t>
+            </w:r>
+            <w:proofErr w:type="spellEnd"/>
+            <w:r>
+              <w:rPr>
+                <w:lang w:val="vi-VN"/>
+              </w:rPr>
+              <w:t xml:space="preserve"> có nhiều </w:t>
+            </w:r>
+            <w:r>
+              <w:t xml:space="preserve">Driver </w:t>
+            </w:r>
+            <w:proofErr w:type="spellStart"/>
+            <w:r>
               <w:t>và</w:t>
             </w:r>
             <w:proofErr w:type="spellEnd"/>
             <w:r>
-              <w:t xml:space="preserve"> </w:t>
-            </w:r>
-            <w:proofErr w:type="spellStart"/>
-            <w:r>
-              <w:t>đúng</w:t>
-            </w:r>
-            <w:proofErr w:type="spellEnd"/>
-            <w:r>
-              <w:t xml:space="preserve"> 1 Escort </w:t>
-            </w:r>
-            <w:proofErr w:type="spellStart"/>
-            <w:r>
-              <w:t>được</w:t>
-            </w:r>
-            <w:proofErr w:type="spellEnd"/>
-            <w:r>
-              <w:t xml:space="preserve"> </w:t>
-            </w:r>
-            <w:proofErr w:type="spellStart"/>
-            <w:r>
-              <w:t>phân</w:t>
-            </w:r>
-            <w:proofErr w:type="spellEnd"/>
-            <w:r>
-              <w:t xml:space="preserve"> </w:t>
-            </w:r>
-            <w:proofErr w:type="spellStart"/>
-            <w:r>
-              <w:t>công</w:t>
-            </w:r>
-            <w:proofErr w:type="spellEnd"/>
-            <w:r>
-              <w:t xml:space="preserve"> ở </w:t>
-            </w:r>
-            <w:proofErr w:type="spellStart"/>
-            <w:r>
-              <w:t>cấp</w:t>
-            </w:r>
-            <w:proofErr w:type="spellEnd"/>
-            <w:r>
-              <w:t xml:space="preserve"> Order. </w:t>
-            </w:r>
-            <w:proofErr w:type="spellStart"/>
-            <w:r>
-              <w:t>Mỗi</w:t>
-            </w:r>
-            <w:proofErr w:type="spellEnd"/>
-            <w:r>
-              <w:t xml:space="preserve"> ROAD </w:t>
-            </w:r>
-            <w:proofErr w:type="spellStart"/>
-            <w:r>
-              <w:t>RouteLeg</w:t>
-            </w:r>
-            <w:proofErr w:type="spellEnd"/>
-            <w:r>
-              <w:t xml:space="preserve"> </w:t>
-            </w:r>
-            <w:proofErr w:type="spellStart"/>
-            <w:r>
-              <w:t>phải</w:t>
-            </w:r>
-            <w:proofErr w:type="spellEnd"/>
-            <w:r>
-              <w:t xml:space="preserve"> </w:t>
-            </w:r>
-            <w:proofErr w:type="spellStart"/>
-            <w:r>
-              <w:t>có</w:t>
-            </w:r>
-            <w:proofErr w:type="spellEnd"/>
-            <w:r>
-              <w:t xml:space="preserve"> </w:t>
-            </w:r>
-            <w:proofErr w:type="spellStart"/>
-            <w:r>
-              <w:t>ít</w:t>
-            </w:r>
-            <w:proofErr w:type="spellEnd"/>
-            <w:r>
-              <w:t xml:space="preserve"> </w:t>
-            </w:r>
-            <w:proofErr w:type="spellStart"/>
-            <w:r>
-              <w:t>nhất</w:t>
-            </w:r>
-            <w:proofErr w:type="spellEnd"/>
-            <w:r>
-              <w:t xml:space="preserve"> 1 Driver </w:t>
+              <w:rPr>
+                <w:lang w:val="vi-VN"/>
+              </w:rPr>
+              <w:t xml:space="preserve"> </w:t>
+            </w:r>
+            <w:r>
+              <w:rPr>
+                <w:lang w:val="vi-VN"/>
+              </w:rPr>
+              <w:t xml:space="preserve">Escoct </w:t>
             </w:r>
             <w:proofErr w:type="spellStart"/>
             <w:r>
@@ -6531,7 +7660,6 @@
         <w:tc>
           <w:tcPr>
             <w:tcW w:w="1950" w:type="dxa"/>
-            <w:shd w:val="clear" w:color="auto" w:fill="F2F6FB"/>
             <w:tcMar>
               <w:top w:w="100" w:type="dxa"/>
               <w:left w:w="120" w:type="dxa"/>
@@ -6609,7 +7737,7 @@
                 <w:bCs/>
                 <w:color w:val="1F3864"/>
               </w:rPr>
-              <w:t>15</w:t>
+              <w:t>18</w:t>
             </w:r>
           </w:p>
         </w:tc>
@@ -6975,174 +8103,6 @@
                 <w:szCs w:val="18"/>
               </w:rPr>
               <w:t>nhận</w:t>
-            </w:r>
-            <w:proofErr w:type="spellEnd"/>
-          </w:p>
-        </w:tc>
-      </w:tr>
-      <w:tr>
-        <w:tc>
-          <w:tcPr>
-            <w:tcW w:w="1100" w:type="dxa"/>
-            <w:shd w:val="clear" w:color="auto" w:fill="F2F6FB"/>
-            <w:tcMar>
-              <w:top w:w="100" w:type="dxa"/>
-              <w:left w:w="120" w:type="dxa"/>
-              <w:bottom w:w="100" w:type="dxa"/>
-              <w:right w:w="120" w:type="dxa"/>
-            </w:tcMar>
-          </w:tcPr>
-          <w:p>
-            <w:pPr>
-              <w:rPr>
-                <w:lang w:val="vi-VN"/>
-              </w:rPr>
-            </w:pPr>
-            <w:r>
-              <w:rPr>
-                <w:b/>
-                <w:bCs/>
-                <w:color w:val="1F3864"/>
-              </w:rPr>
-              <w:t>BR-</w:t>
-            </w:r>
-            <w:r>
-              <w:rPr>
-                <w:b/>
-                <w:bCs/>
-                <w:color w:val="1F3864"/>
-              </w:rPr>
-              <w:t>16</w:t>
-            </w:r>
-          </w:p>
-        </w:tc>
-        <w:tc>
-          <w:tcPr>
-            <w:tcW w:w="6300" w:type="dxa"/>
-            <w:shd w:val="clear" w:color="auto" w:fill="F2F6FB"/>
-            <w:tcMar>
-              <w:top w:w="100" w:type="dxa"/>
-              <w:left w:w="120" w:type="dxa"/>
-              <w:bottom w:w="100" w:type="dxa"/>
-              <w:right w:w="120" w:type="dxa"/>
-            </w:tcMar>
-          </w:tcPr>
-          <w:p>
-            <w:r>
-              <w:t>Không áp dụng trong MVP. Quy tắc legacy này đã được loại khỏi phạm vi MVP.</w:t>
-            </w:r>
-            <w:proofErr w:type="spellStart"/>
-            <w:r/>
-            <w:proofErr w:type="spellEnd"/>
-            <w:r/>
-            <w:proofErr w:type="spellStart"/>
-            <w:r/>
-            <w:proofErr w:type="spellEnd"/>
-            <w:r/>
-            <w:proofErr w:type="spellStart"/>
-            <w:r/>
-            <w:proofErr w:type="spellEnd"/>
-            <w:r/>
-            <w:proofErr w:type="spellStart"/>
-            <w:r/>
-            <w:proofErr w:type="spellEnd"/>
-            <w:r/>
-            <w:proofErr w:type="spellStart"/>
-            <w:r/>
-            <w:proofErr w:type="spellEnd"/>
-            <w:r/>
-            <w:proofErr w:type="spellStart"/>
-            <w:r/>
-            <w:proofErr w:type="spellEnd"/>
-            <w:r/>
-            <w:proofErr w:type="spellStart"/>
-            <w:r/>
-            <w:proofErr w:type="spellEnd"/>
-            <w:r/>
-            <w:proofErr w:type="spellStart"/>
-            <w:r/>
-            <w:proofErr w:type="spellEnd"/>
-            <w:r/>
-            <w:proofErr w:type="spellStart"/>
-            <w:r/>
-            <w:proofErr w:type="spellEnd"/>
-            <w:r/>
-            <w:proofErr w:type="spellStart"/>
-            <w:r/>
-            <w:proofErr w:type="spellEnd"/>
-            <w:r/>
-            <w:proofErr w:type="spellStart"/>
-            <w:r/>
-            <w:proofErr w:type="spellEnd"/>
-            <w:r/>
-            <w:proofErr w:type="spellStart"/>
-            <w:r/>
-            <w:proofErr w:type="spellEnd"/>
-            <w:r/>
-            <w:proofErr w:type="spellStart"/>
-            <w:r/>
-            <w:proofErr w:type="spellEnd"/>
-            <w:r/>
-            <w:proofErr w:type="spellStart"/>
-            <w:r/>
-            <w:proofErr w:type="spellEnd"/>
-            <w:r/>
-            <w:proofErr w:type="spellStart"/>
-            <w:r/>
-            <w:proofErr w:type="spellEnd"/>
-            <w:r/>
-            <w:proofErr w:type="spellStart"/>
-            <w:r/>
-            <w:proofErr w:type="spellEnd"/>
-            <w:r/>
-            <w:proofErr w:type="spellStart"/>
-            <w:r/>
-            <w:proofErr w:type="spellEnd"/>
-            <w:r/>
-          </w:p>
-        </w:tc>
-        <w:tc>
-          <w:tcPr>
-            <w:tcW w:w="1950" w:type="dxa"/>
-            <w:shd w:val="clear" w:color="auto" w:fill="F2F6FB"/>
-            <w:tcMar>
-              <w:top w:w="100" w:type="dxa"/>
-              <w:left w:w="120" w:type="dxa"/>
-              <w:bottom w:w="100" w:type="dxa"/>
-              <w:right w:w="120" w:type="dxa"/>
-            </w:tcMar>
-          </w:tcPr>
-          <w:p>
-            <w:proofErr w:type="spellStart"/>
-            <w:r>
-              <w:rPr>
-                <w:i/>
-                <w:iCs/>
-                <w:color w:val="595959"/>
-                <w:sz w:val="18"/>
-                <w:szCs w:val="18"/>
-              </w:rPr>
-              <w:t>Ngoài phạm vi MVP</w:t>
-            </w:r>
-            <w:proofErr w:type="spellEnd"/>
-            <w:r>
-              <w:rPr>
-                <w:i/>
-                <w:iCs/>
-                <w:color w:val="595959"/>
-                <w:sz w:val="18"/>
-                <w:szCs w:val="18"/>
-              </w:rPr>
-            </w:r>
-            <w:proofErr w:type="spellStart"/>
-            <w:r>
-              <w:rPr>
-                <w:i/>
-                <w:iCs/>
-                <w:color w:val="595959"/>
-                <w:sz w:val="18"/>
-                <w:szCs w:val="18"/>
-              </w:rPr>
             </w:r>
             <w:proofErr w:type="spellEnd"/>
           </w:p>
@@ -7398,7 +8358,7 @@
                 <w:bCs/>
                 <w:color w:val="1F3864"/>
               </w:rPr>
-              <w:t>17</w:t>
+              <w:t>20</w:t>
             </w:r>
           </w:p>
         </w:tc>
@@ -7689,7 +8649,7 @@
                 <w:bCs/>
                 <w:color w:val="1F3864"/>
               </w:rPr>
-              <w:t>18</w:t>
+              <w:t>21</w:t>
             </w:r>
           </w:p>
         </w:tc>
@@ -8218,7 +9178,7 @@
                 <w:bCs/>
                 <w:color w:val="1F3864"/>
               </w:rPr>
-              <w:t>19</w:t>
+              <w:t>22</w:t>
             </w:r>
           </w:p>
         </w:tc>
@@ -8249,7 +9209,7 @@
               <w:rPr>
                 <w:lang w:val="vi-VN"/>
               </w:rPr>
-              <w:t xml:space="preserve"> entity gồm TransportOrder, TransportOrderHorse, HorseDocumentVersion, RouteLeg và Quotation phải tạo một StatusAuditLog chứa trạng thái trước, trạng thái sau, người thực hiện, thời gian và lý do nếu có. </w:t>
+              <w:t xml:space="preserve"> entity gồm TransportOrder, TransportOrderHorse, HorseDocumentVersion, RouteLeg, Quotation và phải tạo một StatusAuditLog chứa trạng thái trước, trạng thái sau, người thực hiện, thời gian và lý do nếu có. </w:t>
             </w:r>
             <w:r>
               <w:t xml:space="preserve">Audit log </w:t>

</xml_diff>

<commit_message>
docs: update order approval and deposit rules
</commit_message>
<xml_diff>
--- a/docs/business-rules/Business_Rules.docx
+++ b/docs/business-rules/Business_Rules.docx
@@ -1993,7 +1993,263 @@
             </w:r>
             <w:proofErr w:type="spellEnd"/>
             <w:r>
-              <w:t xml:space="preserve"> Logistics Manager (LM) </w:t>
+              <w:t xml:space="preserve"> Customer </w:t>
+            </w:r>
+            <w:proofErr w:type="spellStart"/>
+            <w:r>
+              <w:t>thanh</w:t>
+            </w:r>
+            <w:proofErr w:type="spellEnd"/>
+            <w:r>
+              <w:t xml:space="preserve"> </w:t>
+            </w:r>
+            <w:proofErr w:type="spellStart"/>
+            <w:r>
+              <w:t>toán</w:t>
+            </w:r>
+            <w:proofErr w:type="spellEnd"/>
+            <w:r>
+              <w:t xml:space="preserve"> Deposit </w:t>
+            </w:r>
+            <w:proofErr w:type="spellStart"/>
+            <w:r>
+              <w:t>thành</w:t>
+            </w:r>
+            <w:proofErr w:type="spellEnd"/>
+            <w:r>
+              <w:t xml:space="preserve"> </w:t>
+            </w:r>
+            <w:proofErr w:type="spellStart"/>
+            <w:r>
+              <w:t>công</w:t>
+            </w:r>
+            <w:proofErr w:type="spellEnd"/>
+            <w:r>
+              <w:t xml:space="preserve"> </w:t>
+            </w:r>
+            <w:proofErr w:type="spellStart"/>
+            <w:r>
+              <w:t>thông</w:t>
+            </w:r>
+            <w:proofErr w:type="spellEnd"/>
+            <w:r>
+              <w:t xml:space="preserve"> qua Stripe </w:t>
+            </w:r>
+            <w:proofErr w:type="spellStart"/>
+            <w:r>
+              <w:t>cho</w:t>
+            </w:r>
+            <w:proofErr w:type="spellEnd"/>
+            <w:r>
+              <w:t xml:space="preserve"> quotation </w:t>
+            </w:r>
+            <w:proofErr w:type="spellStart"/>
+            <w:r>
+              <w:t>đã</w:t>
+            </w:r>
+            <w:proofErr w:type="spellEnd"/>
+            <w:r>
+              <w:t xml:space="preserve"> </w:t>
+            </w:r>
+            <w:proofErr w:type="spellStart"/>
+            <w:r>
+              <w:t>được</w:t>
+            </w:r>
+            <w:proofErr w:type="spellEnd"/>
+            <w:r>
+              <w:t xml:space="preserve"> </w:t>
+            </w:r>
+            <w:proofErr w:type="spellStart"/>
+            <w:r>
+              <w:t>gửi</w:t>
+            </w:r>
+            <w:proofErr w:type="spellEnd"/>
+            <w:r>
+              <w:t xml:space="preserve"> </w:t>
+            </w:r>
+            <w:proofErr w:type="spellStart"/>
+            <w:r>
+              <w:t>và</w:t>
+            </w:r>
+            <w:proofErr w:type="spellEnd"/>
+            <w:r>
+              <w:t xml:space="preserve"> </w:t>
+            </w:r>
+            <w:proofErr w:type="spellStart"/>
+            <w:r>
+              <w:t>khóa</w:t>
+            </w:r>
+            <w:proofErr w:type="spellEnd"/>
+            <w:r>
+              <w:t xml:space="preserve">. </w:t>
+            </w:r>
+            <w:proofErr w:type="spellStart"/>
+            <w:r>
+              <w:t>Hệ</w:t>
+            </w:r>
+            <w:proofErr w:type="spellEnd"/>
+            <w:r>
+              <w:t xml:space="preserve"> </w:t>
+            </w:r>
+            <w:proofErr w:type="spellStart"/>
+            <w:r>
+              <w:t>thống</w:t>
+            </w:r>
+            <w:proofErr w:type="spellEnd"/>
+            <w:r>
+              <w:t xml:space="preserve"> </w:t>
+            </w:r>
+            <w:proofErr w:type="spellStart"/>
+            <w:r>
+              <w:t>tự</w:t>
+            </w:r>
+            <w:proofErr w:type="spellEnd"/>
+            <w:r>
+              <w:t xml:space="preserve"> </w:t>
+            </w:r>
+            <w:proofErr w:type="spellStart"/>
+            <w:r>
+              <w:t>động</w:t>
+            </w:r>
+            <w:proofErr w:type="spellEnd"/>
+            <w:r>
+              <w:t xml:space="preserve"> </w:t>
+            </w:r>
+            <w:proofErr w:type="spellStart"/>
+            <w:r>
+              <w:t>chuyển</w:t>
+            </w:r>
+            <w:proofErr w:type="spellEnd"/>
+            <w:r>
+              <w:t xml:space="preserve"> </w:t>
+            </w:r>
+            <w:proofErr w:type="spellStart"/>
+            <w:r>
+              <w:t>đơn</w:t>
+            </w:r>
+            <w:proofErr w:type="spellEnd"/>
+            <w:r>
+              <w:t xml:space="preserve"> </w:t>
+            </w:r>
+            <w:proofErr w:type="spellStart"/>
+            <w:r>
+              <w:t>hàng</w:t>
+            </w:r>
+            <w:proofErr w:type="spellEnd"/>
+            <w:r>
+              <w:t xml:space="preserve"> sang APPROVED </w:t>
+            </w:r>
+            <w:proofErr w:type="spellStart"/>
+            <w:r>
+              <w:t>sau</w:t>
+            </w:r>
+            <w:proofErr w:type="spellEnd"/>
+            <w:r>
+              <w:t xml:space="preserve"> </w:t>
+            </w:r>
+            <w:proofErr w:type="spellStart"/>
+            <w:r>
+              <w:t>khi</w:t>
+            </w:r>
+            <w:proofErr w:type="spellEnd"/>
+            <w:r>
+              <w:t xml:space="preserve"> </w:t>
+            </w:r>
+            <w:proofErr w:type="spellStart"/>
+            <w:r>
+              <w:t>nhận</w:t>
+            </w:r>
+            <w:proofErr w:type="spellEnd"/>
+            <w:r>
+              <w:t xml:space="preserve"> </w:t>
+            </w:r>
+            <w:proofErr w:type="spellStart"/>
+            <w:r>
+              <w:t>được</w:t>
+            </w:r>
+            <w:proofErr w:type="spellEnd"/>
+            <w:r>
+              <w:t xml:space="preserve"> </w:t>
+            </w:r>
+            <w:proofErr w:type="spellStart"/>
+            <w:r>
+              <w:t>xác</w:t>
+            </w:r>
+            <w:proofErr w:type="spellEnd"/>
+            <w:r>
+              <w:t xml:space="preserve"> </w:t>
+            </w:r>
+            <w:proofErr w:type="spellStart"/>
+            <w:r>
+              <w:t>nhận</w:t>
+            </w:r>
+            <w:proofErr w:type="spellEnd"/>
+            <w:r>
+              <w:t xml:space="preserve"> </w:t>
+            </w:r>
+            <w:proofErr w:type="spellStart"/>
+            <w:r>
+              <w:t>thanh</w:t>
+            </w:r>
+            <w:proofErr w:type="spellEnd"/>
+            <w:r>
+              <w:t xml:space="preserve"> </w:t>
+            </w:r>
+            <w:proofErr w:type="spellStart"/>
+            <w:r>
+              <w:t>toán</w:t>
+            </w:r>
+            <w:proofErr w:type="spellEnd"/>
+            <w:r>
+              <w:t xml:space="preserve"> </w:t>
+            </w:r>
+            <w:proofErr w:type="spellStart"/>
+            <w:r>
+              <w:t>thành</w:t>
+            </w:r>
+            <w:proofErr w:type="spellEnd"/>
+            <w:r>
+              <w:t xml:space="preserve"> </w:t>
+            </w:r>
+            <w:proofErr w:type="spellStart"/>
+            <w:r>
+              <w:t>công</w:t>
+            </w:r>
+            <w:proofErr w:type="spellEnd"/>
+            <w:r>
+              <w:t xml:space="preserve"> </w:t>
+            </w:r>
+            <w:proofErr w:type="spellStart"/>
+            <w:r>
+              <w:t>từ</w:t>
+            </w:r>
+            <w:proofErr w:type="spellEnd"/>
+            <w:r>
+              <w:t xml:space="preserve"> Stripe. </w:t>
+            </w:r>
+            <w:proofErr w:type="spellStart"/>
+            <w:r>
+              <w:t>Không</w:t>
+            </w:r>
+            <w:proofErr w:type="spellEnd"/>
+            <w:r>
+              <w:t xml:space="preserve"> </w:t>
+            </w:r>
+            <w:proofErr w:type="spellStart"/>
+            <w:r>
+              <w:t>yêu</w:t>
+            </w:r>
+            <w:proofErr w:type="spellEnd"/>
+            <w:r>
+              <w:t xml:space="preserve"> </w:t>
+            </w:r>
+            <w:proofErr w:type="spellStart"/>
+            <w:r>
+              <w:t>cầu</w:t>
+            </w:r>
+            <w:proofErr w:type="spellEnd"/>
+            <w:r>
+              <w:t xml:space="preserve"> Customer </w:t>
             </w:r>
             <w:proofErr w:type="spellStart"/>
             <w:r>
@@ -2013,6 +2269,62 @@
             </w:r>
             <w:proofErr w:type="spellStart"/>
             <w:r>
+              <w:t>thao</w:t>
+            </w:r>
+            <w:proofErr w:type="spellEnd"/>
+            <w:r>
+              <w:t xml:space="preserve"> </w:t>
+            </w:r>
+            <w:proofErr w:type="spellStart"/>
+            <w:r>
+              <w:t>tác</w:t>
+            </w:r>
+            <w:proofErr w:type="spellEnd"/>
+            <w:r>
+              <w:t xml:space="preserve"> ACCEPT quotation </w:t>
+            </w:r>
+            <w:proofErr w:type="spellStart"/>
+            <w:r>
+              <w:t>riêng</w:t>
+            </w:r>
+            <w:proofErr w:type="spellEnd"/>
+            <w:r>
+              <w:t xml:space="preserve"> </w:t>
+            </w:r>
+            <w:proofErr w:type="spellStart"/>
+            <w:r>
+              <w:t>và</w:t>
+            </w:r>
+            <w:proofErr w:type="spellEnd"/>
+            <w:r>
+              <w:t xml:space="preserve"> </w:t>
+            </w:r>
+            <w:proofErr w:type="spellStart"/>
+            <w:r>
+              <w:t>không</w:t>
+            </w:r>
+            <w:proofErr w:type="spellEnd"/>
+            <w:r>
+              <w:t xml:space="preserve"> </w:t>
+            </w:r>
+            <w:proofErr w:type="spellStart"/>
+            <w:r>
+              <w:t>yêu</w:t>
+            </w:r>
+            <w:proofErr w:type="spellEnd"/>
+            <w:r>
+              <w:t xml:space="preserve"> </w:t>
+            </w:r>
+            <w:proofErr w:type="spellStart"/>
+            <w:r>
+              <w:t>cầu</w:t>
+            </w:r>
+            <w:proofErr w:type="spellEnd"/>
+            <w:r>
+              <w:t xml:space="preserve"> LM </w:t>
+            </w:r>
+            <w:proofErr w:type="spellStart"/>
+            <w:r>
               <w:t>phê</w:t>
             </w:r>
             <w:proofErr w:type="spellEnd"/>
@@ -2029,132 +2341,25 @@
             </w:r>
             <w:proofErr w:type="spellStart"/>
             <w:r>
-              <w:t>chính</w:t>
-            </w:r>
-            <w:proofErr w:type="spellEnd"/>
-            <w:r>
-              <w:t xml:space="preserve"> </w:t>
-            </w:r>
-            <w:proofErr w:type="spellStart"/>
-            <w:r>
-              <w:t>thức</w:t>
-            </w:r>
-            <w:proofErr w:type="spellEnd"/>
-            <w:r>
-              <w:t xml:space="preserve"> </w:t>
-            </w:r>
-            <w:proofErr w:type="spellStart"/>
-            <w:r>
-              <w:t>và</w:t>
-            </w:r>
-            <w:proofErr w:type="spellEnd"/>
-            <w:r>
-              <w:t xml:space="preserve"> quotation </w:t>
-            </w:r>
-            <w:proofErr w:type="spellStart"/>
-            <w:r>
-              <w:t>tương</w:t>
-            </w:r>
-            <w:proofErr w:type="spellEnd"/>
-            <w:r>
-              <w:t xml:space="preserve"> </w:t>
-            </w:r>
-            <w:proofErr w:type="spellStart"/>
-            <w:r>
-              <w:t>ứng</w:t>
-            </w:r>
-            <w:proofErr w:type="spellEnd"/>
-            <w:r>
-              <w:t xml:space="preserve"> </w:t>
-            </w:r>
-            <w:proofErr w:type="spellStart"/>
-            <w:r>
-              <w:t>đã</w:t>
-            </w:r>
-            <w:proofErr w:type="spellEnd"/>
-            <w:r>
-              <w:t xml:space="preserve"> </w:t>
-            </w:r>
-            <w:proofErr w:type="spellStart"/>
-            <w:r>
-              <w:t>được</w:t>
-            </w:r>
-            <w:proofErr w:type="spellEnd"/>
-            <w:r>
-              <w:t xml:space="preserve"> Customer ACCEPTED. </w:t>
-            </w:r>
-            <w:proofErr w:type="spellStart"/>
-            <w:r>
-              <w:t>Hệ</w:t>
-            </w:r>
-            <w:proofErr w:type="spellEnd"/>
-            <w:r>
-              <w:t xml:space="preserve"> </w:t>
-            </w:r>
-            <w:proofErr w:type="spellStart"/>
-            <w:r>
-              <w:t>thống</w:t>
-            </w:r>
-            <w:proofErr w:type="spellEnd"/>
-            <w:r>
-              <w:t xml:space="preserve"> </w:t>
-            </w:r>
-            <w:proofErr w:type="spellStart"/>
-            <w:r>
-              <w:t>không</w:t>
-            </w:r>
-            <w:proofErr w:type="spellEnd"/>
-            <w:r>
-              <w:t xml:space="preserve"> </w:t>
-            </w:r>
-            <w:proofErr w:type="spellStart"/>
-            <w:r>
-              <w:t>tự</w:t>
-            </w:r>
-            <w:proofErr w:type="spellEnd"/>
-            <w:r>
-              <w:t xml:space="preserve"> </w:t>
-            </w:r>
-            <w:proofErr w:type="spellStart"/>
-            <w:r>
-              <w:t>động</w:t>
-            </w:r>
-            <w:proofErr w:type="spellEnd"/>
-            <w:r>
-              <w:t xml:space="preserve"> </w:t>
-            </w:r>
-            <w:proofErr w:type="spellStart"/>
-            <w:r>
-              <w:t>phê</w:t>
-            </w:r>
-            <w:proofErr w:type="spellEnd"/>
-            <w:r>
-              <w:t xml:space="preserve"> </w:t>
-            </w:r>
-            <w:proofErr w:type="spellStart"/>
-            <w:r>
-              <w:t>duyệt</w:t>
-            </w:r>
-            <w:proofErr w:type="spellEnd"/>
-            <w:r>
-              <w:t xml:space="preserve"> </w:t>
-            </w:r>
-            <w:proofErr w:type="spellStart"/>
-            <w:r>
-              <w:t>đơn</w:t>
-            </w:r>
-            <w:proofErr w:type="spellEnd"/>
-            <w:r>
-              <w:t xml:space="preserve"> </w:t>
-            </w:r>
-            <w:proofErr w:type="spellStart"/>
-            <w:r>
-              <w:t>hàng</w:t>
+              <w:t>thủ</w:t>
+            </w:r>
+            <w:proofErr w:type="spellEnd"/>
+            <w:r>
+              <w:t xml:space="preserve"> </w:t>
+            </w:r>
+            <w:proofErr w:type="spellStart"/>
+            <w:proofErr w:type="gramStart"/>
+            <w:r>
+              <w:t>công</w:t>
             </w:r>
             <w:proofErr w:type="spellEnd"/>
             <w:r>
               <w:t>.</w:t>
             </w:r>
+            <w:r>
+              <w:t>.</w:t>
+            </w:r>
+            <w:proofErr w:type="gramEnd"/>
           </w:p>
         </w:tc>
         <w:tc>
@@ -2314,23 +2519,7 @@
             </w:r>
             <w:proofErr w:type="spellEnd"/>
             <w:r>
-              <w:t xml:space="preserve"> LM </w:t>
-            </w:r>
-            <w:proofErr w:type="spellStart"/>
-            <w:r>
-              <w:t>phê</w:t>
-            </w:r>
-            <w:proofErr w:type="spellEnd"/>
-            <w:r>
-              <w:t xml:space="preserve"> </w:t>
-            </w:r>
-            <w:proofErr w:type="spellStart"/>
-            <w:r>
-              <w:t>duyệt</w:t>
-            </w:r>
-            <w:proofErr w:type="spellEnd"/>
-            <w:r>
-              <w:t xml:space="preserve">. Transport Specialist (TS) </w:t>
+              <w:t xml:space="preserve"> Order </w:t>
             </w:r>
             <w:proofErr w:type="spellStart"/>
             <w:r>
@@ -2342,7 +2531,47 @@
             </w:r>
             <w:proofErr w:type="spellStart"/>
             <w:r>
-              <w:t>phân</w:t>
+              <w:t>chuyển</w:t>
+            </w:r>
+            <w:proofErr w:type="spellEnd"/>
+            <w:r>
+              <w:t xml:space="preserve"> sang APPROVED. Sau </w:t>
+            </w:r>
+            <w:proofErr w:type="spellStart"/>
+            <w:r>
+              <w:t>khi</w:t>
+            </w:r>
+            <w:proofErr w:type="spellEnd"/>
+            <w:r>
+              <w:t xml:space="preserve"> Deposit </w:t>
+            </w:r>
+            <w:proofErr w:type="spellStart"/>
+            <w:r>
+              <w:t>được</w:t>
+            </w:r>
+            <w:proofErr w:type="spellEnd"/>
+            <w:r>
+              <w:t xml:space="preserve"> </w:t>
+            </w:r>
+            <w:proofErr w:type="spellStart"/>
+            <w:r>
+              <w:t>thanh</w:t>
+            </w:r>
+            <w:proofErr w:type="spellEnd"/>
+            <w:r>
+              <w:t xml:space="preserve"> </w:t>
+            </w:r>
+            <w:proofErr w:type="spellStart"/>
+            <w:r>
+              <w:t>toán</w:t>
+            </w:r>
+            <w:proofErr w:type="spellEnd"/>
+            <w:r>
+              <w:t xml:space="preserve"> </w:t>
+            </w:r>
+            <w:proofErr w:type="spellStart"/>
+            <w:r>
+              <w:t>thành</w:t>
             </w:r>
             <w:proofErr w:type="spellEnd"/>
             <w:r>
@@ -2358,39 +2587,31 @@
             </w:r>
             <w:proofErr w:type="spellStart"/>
             <w:r>
-              <w:t>trước</w:t>
-            </w:r>
-            <w:proofErr w:type="spellEnd"/>
-            <w:r>
-              <w:t xml:space="preserve"> </w:t>
-            </w:r>
-            <w:proofErr w:type="spellStart"/>
-            <w:r>
-              <w:t>khi</w:t>
-            </w:r>
-            <w:proofErr w:type="spellEnd"/>
-            <w:r>
-              <w:t xml:space="preserve"> LM </w:t>
-            </w:r>
-            <w:proofErr w:type="spellStart"/>
-            <w:r>
-              <w:t>phê</w:t>
-            </w:r>
-            <w:proofErr w:type="spellEnd"/>
-            <w:r>
-              <w:t xml:space="preserve"> </w:t>
-            </w:r>
-            <w:proofErr w:type="spellStart"/>
-            <w:r>
-              <w:t>duyệt</w:t>
-            </w:r>
-            <w:proofErr w:type="spellEnd"/>
-            <w:r>
-              <w:t xml:space="preserve"> </w:t>
-            </w:r>
-            <w:proofErr w:type="spellStart"/>
-            <w:r>
-              <w:t>để</w:t>
+              <w:t>và</w:t>
+            </w:r>
+            <w:proofErr w:type="spellEnd"/>
+            <w:r>
+              <w:t xml:space="preserve"> Order </w:t>
+            </w:r>
+            <w:proofErr w:type="spellStart"/>
+            <w:r>
+              <w:t>chuyển</w:t>
+            </w:r>
+            <w:proofErr w:type="spellEnd"/>
+            <w:r>
+              <w:t xml:space="preserve"> sang APPROVED, </w:t>
+            </w:r>
+            <w:proofErr w:type="spellStart"/>
+            <w:r>
+              <w:t>hệ</w:t>
+            </w:r>
+            <w:proofErr w:type="spellEnd"/>
+            <w:r>
+              <w:t xml:space="preserve"> </w:t>
+            </w:r>
+            <w:proofErr w:type="spellStart"/>
+            <w:r>
+              <w:t>thống</w:t>
             </w:r>
             <w:proofErr w:type="spellEnd"/>
             <w:r>
@@ -2406,6 +2627,102 @@
             </w:r>
             <w:proofErr w:type="spellStart"/>
             <w:r>
+              <w:t>động</w:t>
+            </w:r>
+            <w:proofErr w:type="spellEnd"/>
+            <w:r>
+              <w:t xml:space="preserve"> </w:t>
+            </w:r>
+            <w:proofErr w:type="spellStart"/>
+            <w:r>
+              <w:t>tạo</w:t>
+            </w:r>
+            <w:proofErr w:type="spellEnd"/>
+            <w:r>
+              <w:t xml:space="preserve"> checklist </w:t>
+            </w:r>
+            <w:proofErr w:type="spellStart"/>
+            <w:r>
+              <w:t>giấy</w:t>
+            </w:r>
+            <w:proofErr w:type="spellEnd"/>
+            <w:r>
+              <w:t xml:space="preserve"> </w:t>
+            </w:r>
+            <w:proofErr w:type="spellStart"/>
+            <w:r>
+              <w:t>tờ</w:t>
+            </w:r>
+            <w:proofErr w:type="spellEnd"/>
+            <w:r>
+              <w:t xml:space="preserve"> </w:t>
+            </w:r>
+            <w:proofErr w:type="spellStart"/>
+            <w:r>
+              <w:t>bắt</w:t>
+            </w:r>
+            <w:proofErr w:type="spellEnd"/>
+            <w:r>
+              <w:t xml:space="preserve"> </w:t>
+            </w:r>
+            <w:proofErr w:type="spellStart"/>
+            <w:r>
+              <w:t>buộc</w:t>
+            </w:r>
+            <w:proofErr w:type="spellEnd"/>
+            <w:r>
+              <w:t xml:space="preserve"> </w:t>
+            </w:r>
+            <w:proofErr w:type="spellStart"/>
+            <w:r>
+              <w:t>cố</w:t>
+            </w:r>
+            <w:proofErr w:type="spellEnd"/>
+            <w:r>
+              <w:t xml:space="preserve"> </w:t>
+            </w:r>
+            <w:proofErr w:type="spellStart"/>
+            <w:r>
+              <w:t>định</w:t>
+            </w:r>
+            <w:proofErr w:type="spellEnd"/>
+            <w:r>
+              <w:t xml:space="preserve"> </w:t>
+            </w:r>
+            <w:proofErr w:type="spellStart"/>
+            <w:r>
+              <w:t>của</w:t>
+            </w:r>
+            <w:proofErr w:type="spellEnd"/>
+            <w:r>
+              <w:t xml:space="preserve"> MVP </w:t>
+            </w:r>
+            <w:proofErr w:type="spellStart"/>
+            <w:r>
+              <w:t>cho</w:t>
+            </w:r>
+            <w:proofErr w:type="spellEnd"/>
+            <w:r>
+              <w:t xml:space="preserve"> </w:t>
+            </w:r>
+            <w:proofErr w:type="spellStart"/>
+            <w:r>
+              <w:t>từng</w:t>
+            </w:r>
+            <w:proofErr w:type="spellEnd"/>
+            <w:r>
+              <w:t xml:space="preserve"> Horse. TS </w:t>
+            </w:r>
+            <w:proofErr w:type="spellStart"/>
+            <w:r>
+              <w:t>không</w:t>
+            </w:r>
+            <w:proofErr w:type="spellEnd"/>
+            <w:r>
+              <w:t xml:space="preserve"> </w:t>
+            </w:r>
+            <w:proofErr w:type="spellStart"/>
+            <w:r>
               <w:t>lựa</w:t>
             </w:r>
             <w:proofErr w:type="spellEnd"/>
@@ -2422,131 +2739,11 @@
             </w:r>
             <w:proofErr w:type="spellStart"/>
             <w:r>
-              <w:t>giấy</w:t>
-            </w:r>
-            <w:proofErr w:type="spellEnd"/>
-            <w:r>
-              <w:t xml:space="preserve"> </w:t>
-            </w:r>
-            <w:proofErr w:type="spellStart"/>
-            <w:r>
-              <w:t>tờ</w:t>
-            </w:r>
-            <w:proofErr w:type="spellEnd"/>
-            <w:r>
-              <w:t xml:space="preserve"> </w:t>
-            </w:r>
-            <w:proofErr w:type="spellStart"/>
-            <w:r>
-              <w:t>bắt</w:t>
-            </w:r>
-            <w:proofErr w:type="spellEnd"/>
-            <w:r>
-              <w:t xml:space="preserve"> </w:t>
-            </w:r>
-            <w:proofErr w:type="spellStart"/>
-            <w:r>
-              <w:t>buộc</w:t>
-            </w:r>
-            <w:proofErr w:type="spellEnd"/>
-            <w:r>
-              <w:t xml:space="preserve"> </w:t>
-            </w:r>
-            <w:proofErr w:type="spellStart"/>
-            <w:r>
-              <w:t>phù</w:t>
-            </w:r>
-            <w:proofErr w:type="spellEnd"/>
-            <w:r>
-              <w:t xml:space="preserve"> </w:t>
-            </w:r>
-            <w:proofErr w:type="spellStart"/>
-            <w:r>
-              <w:t>hợp</w:t>
-            </w:r>
-            <w:proofErr w:type="spellEnd"/>
-            <w:r>
-              <w:t xml:space="preserve"> </w:t>
-            </w:r>
-            <w:proofErr w:type="spellStart"/>
-            <w:r>
-              <w:t>với</w:t>
-            </w:r>
-            <w:proofErr w:type="spellEnd"/>
-            <w:r>
-              <w:t xml:space="preserve"> destination/route </w:t>
-            </w:r>
-            <w:proofErr w:type="spellStart"/>
-            <w:r>
-              <w:t>và</w:t>
-            </w:r>
-            <w:proofErr w:type="spellEnd"/>
-            <w:r>
-              <w:t xml:space="preserve"> </w:t>
-            </w:r>
-            <w:proofErr w:type="spellStart"/>
-            <w:r>
-              <w:t>thiết</w:t>
-            </w:r>
-            <w:proofErr w:type="spellEnd"/>
-            <w:r>
-              <w:t xml:space="preserve"> </w:t>
-            </w:r>
-            <w:proofErr w:type="spellStart"/>
-            <w:r>
-              <w:t>lập</w:t>
-            </w:r>
-            <w:proofErr w:type="spellEnd"/>
-            <w:r>
-              <w:t xml:space="preserve"> </w:t>
-            </w:r>
-            <w:proofErr w:type="spellStart"/>
-            <w:r>
-              <w:t>hồ</w:t>
-            </w:r>
-            <w:proofErr w:type="spellEnd"/>
-            <w:r>
-              <w:t xml:space="preserve"> </w:t>
-            </w:r>
-            <w:proofErr w:type="spellStart"/>
-            <w:r>
-              <w:t>sơ</w:t>
-            </w:r>
-            <w:proofErr w:type="spellEnd"/>
-            <w:r>
-              <w:t xml:space="preserve"> </w:t>
-            </w:r>
-            <w:proofErr w:type="spellStart"/>
-            <w:r>
-              <w:t>pháp</w:t>
-            </w:r>
-            <w:proofErr w:type="spellEnd"/>
-            <w:r>
-              <w:t xml:space="preserve"> </w:t>
-            </w:r>
-            <w:proofErr w:type="spellStart"/>
-            <w:r>
-              <w:t>lý</w:t>
-            </w:r>
-            <w:proofErr w:type="spellEnd"/>
-            <w:r>
-              <w:t xml:space="preserve"> </w:t>
-            </w:r>
-            <w:proofErr w:type="spellStart"/>
-            <w:r>
-              <w:t>cho</w:t>
-            </w:r>
-            <w:proofErr w:type="spellEnd"/>
-            <w:r>
-              <w:t xml:space="preserve"> </w:t>
-            </w:r>
-            <w:proofErr w:type="spellStart"/>
-            <w:r>
-              <w:t>từng</w:t>
-            </w:r>
-            <w:proofErr w:type="spellEnd"/>
-            <w:r>
-              <w:t xml:space="preserve"> Horse.</w:t>
+              <w:t>theo</w:t>
+            </w:r>
+            <w:proofErr w:type="spellEnd"/>
+            <w:r>
+              <w:t xml:space="preserve"> destination/route.</w:t>
             </w:r>
           </w:p>
         </w:tc>
@@ -2593,551 +2790,6 @@
                 <w:szCs w:val="18"/>
               </w:rPr>
               <w:t>buộc</w:t>
-            </w:r>
-            <w:proofErr w:type="spellEnd"/>
-          </w:p>
-        </w:tc>
-      </w:tr>
-      <w:tr>
-        <w:tc>
-          <w:tcPr>
-            <w:tcW w:w="1100" w:type="dxa"/>
-            <w:tcMar>
-              <w:top w:w="100" w:type="dxa"/>
-              <w:left w:w="120" w:type="dxa"/>
-              <w:bottom w:w="100" w:type="dxa"/>
-              <w:right w:w="120" w:type="dxa"/>
-            </w:tcMar>
-          </w:tcPr>
-          <w:p>
-            <w:r>
-              <w:rPr>
-                <w:b/>
-                <w:bCs/>
-                <w:color w:val="1F3864"/>
-              </w:rPr>
-              <w:t>BR-03</w:t>
-            </w:r>
-          </w:p>
-        </w:tc>
-        <w:tc>
-          <w:tcPr>
-            <w:tcW w:w="6300" w:type="dxa"/>
-            <w:tcMar>
-              <w:top w:w="100" w:type="dxa"/>
-              <w:left w:w="120" w:type="dxa"/>
-              <w:bottom w:w="100" w:type="dxa"/>
-              <w:right w:w="120" w:type="dxa"/>
-            </w:tcMar>
-          </w:tcPr>
-          <w:p>
-            <w:proofErr w:type="spellStart"/>
-            <w:r>
-              <w:t>Mỗi</w:t>
-            </w:r>
-            <w:proofErr w:type="spellEnd"/>
-            <w:r>
-              <w:t xml:space="preserve"> Horse </w:t>
-            </w:r>
-            <w:proofErr w:type="spellStart"/>
-            <w:r>
-              <w:t>phải</w:t>
-            </w:r>
-            <w:proofErr w:type="spellEnd"/>
-            <w:r>
-              <w:t xml:space="preserve"> </w:t>
-            </w:r>
-            <w:proofErr w:type="spellStart"/>
-            <w:r>
-              <w:t>có</w:t>
-            </w:r>
-            <w:proofErr w:type="spellEnd"/>
-            <w:r>
-              <w:t xml:space="preserve"> </w:t>
-            </w:r>
-            <w:proofErr w:type="spellStart"/>
-            <w:r>
-              <w:t>một</w:t>
-            </w:r>
-            <w:proofErr w:type="spellEnd"/>
-            <w:r>
-              <w:t xml:space="preserve"> microchip ID </w:t>
-            </w:r>
-            <w:proofErr w:type="spellStart"/>
-            <w:r>
-              <w:t>duy</w:t>
-            </w:r>
-            <w:proofErr w:type="spellEnd"/>
-            <w:r>
-              <w:t xml:space="preserve"> </w:t>
-            </w:r>
-            <w:proofErr w:type="spellStart"/>
-            <w:r>
-              <w:t>nhất</w:t>
-            </w:r>
-            <w:proofErr w:type="spellEnd"/>
-            <w:r>
-              <w:t xml:space="preserve"> </w:t>
-            </w:r>
-            <w:proofErr w:type="spellStart"/>
-            <w:r>
-              <w:t>và</w:t>
-            </w:r>
-            <w:proofErr w:type="spellEnd"/>
-            <w:r>
-              <w:t xml:space="preserve"> </w:t>
-            </w:r>
-            <w:proofErr w:type="spellStart"/>
-            <w:r>
-              <w:t>không</w:t>
-            </w:r>
-            <w:proofErr w:type="spellEnd"/>
-            <w:r>
-              <w:t xml:space="preserve"> </w:t>
-            </w:r>
-            <w:proofErr w:type="spellStart"/>
-            <w:r>
-              <w:t>được</w:t>
-            </w:r>
-            <w:proofErr w:type="spellEnd"/>
-            <w:r>
-              <w:t xml:space="preserve"> </w:t>
-            </w:r>
-            <w:proofErr w:type="spellStart"/>
-            <w:r>
-              <w:t>để</w:t>
-            </w:r>
-            <w:proofErr w:type="spellEnd"/>
-            <w:r>
-              <w:t xml:space="preserve"> </w:t>
-            </w:r>
-            <w:proofErr w:type="spellStart"/>
-            <w:r>
-              <w:t>trống</w:t>
-            </w:r>
-            <w:proofErr w:type="spellEnd"/>
-            <w:r>
-              <w:t xml:space="preserve">. Microchip ID </w:t>
-            </w:r>
-            <w:proofErr w:type="spellStart"/>
-            <w:r>
-              <w:t>được</w:t>
-            </w:r>
-            <w:proofErr w:type="spellEnd"/>
-            <w:r>
-              <w:t xml:space="preserve"> </w:t>
-            </w:r>
-            <w:proofErr w:type="spellStart"/>
-            <w:r>
-              <w:t>lưu</w:t>
-            </w:r>
-            <w:proofErr w:type="spellEnd"/>
-            <w:r>
-              <w:t xml:space="preserve"> ở </w:t>
-            </w:r>
-            <w:proofErr w:type="spellStart"/>
-            <w:r>
-              <w:t>hồ</w:t>
-            </w:r>
-            <w:proofErr w:type="spellEnd"/>
-            <w:r>
-              <w:t xml:space="preserve"> </w:t>
-            </w:r>
-            <w:proofErr w:type="spellStart"/>
-            <w:r>
-              <w:t>sơ</w:t>
-            </w:r>
-            <w:proofErr w:type="spellEnd"/>
-            <w:r>
-              <w:t xml:space="preserve"> Horse </w:t>
-            </w:r>
-            <w:proofErr w:type="spellStart"/>
-            <w:r>
-              <w:t>và</w:t>
-            </w:r>
-            <w:proofErr w:type="spellEnd"/>
-            <w:r>
-              <w:t xml:space="preserve"> </w:t>
-            </w:r>
-            <w:proofErr w:type="spellStart"/>
-            <w:r>
-              <w:t>không</w:t>
-            </w:r>
-            <w:proofErr w:type="spellEnd"/>
-            <w:r>
-              <w:t xml:space="preserve"> </w:t>
-            </w:r>
-            <w:proofErr w:type="spellStart"/>
-            <w:r>
-              <w:t>được</w:t>
-            </w:r>
-            <w:proofErr w:type="spellEnd"/>
-            <w:r>
-              <w:t xml:space="preserve"> </w:t>
-            </w:r>
-            <w:proofErr w:type="spellStart"/>
-            <w:r>
-              <w:t>trùng</w:t>
-            </w:r>
-            <w:proofErr w:type="spellEnd"/>
-            <w:r>
-              <w:t xml:space="preserve"> </w:t>
-            </w:r>
-            <w:proofErr w:type="spellStart"/>
-            <w:r>
-              <w:t>giữa</w:t>
-            </w:r>
-            <w:proofErr w:type="spellEnd"/>
-            <w:r>
-              <w:t xml:space="preserve"> </w:t>
-            </w:r>
-            <w:proofErr w:type="spellStart"/>
-            <w:r>
-              <w:t>các</w:t>
-            </w:r>
-            <w:proofErr w:type="spellEnd"/>
-            <w:r>
-              <w:t xml:space="preserve"> Horse.</w:t>
-            </w:r>
-          </w:p>
-        </w:tc>
-        <w:tc>
-          <w:tcPr>
-            <w:tcW w:w="1950" w:type="dxa"/>
-            <w:tcMar>
-              <w:top w:w="100" w:type="dxa"/>
-              <w:left w:w="120" w:type="dxa"/>
-              <w:bottom w:w="100" w:type="dxa"/>
-              <w:right w:w="120" w:type="dxa"/>
-            </w:tcMar>
-          </w:tcPr>
-          <w:p>
-            <w:proofErr w:type="spellStart"/>
-            <w:r>
-              <w:rPr>
-                <w:i/>
-                <w:iCs/>
-                <w:color w:val="595959"/>
-                <w:sz w:val="18"/>
-                <w:szCs w:val="18"/>
-              </w:rPr>
-              <w:t>Bắt</w:t>
-            </w:r>
-            <w:proofErr w:type="spellEnd"/>
-            <w:r>
-              <w:rPr>
-                <w:i/>
-                <w:iCs/>
-                <w:color w:val="595959"/>
-                <w:sz w:val="18"/>
-                <w:szCs w:val="18"/>
-              </w:rPr>
-              <w:t xml:space="preserve"> </w:t>
-            </w:r>
-            <w:proofErr w:type="spellStart"/>
-            <w:r>
-              <w:rPr>
-                <w:i/>
-                <w:iCs/>
-                <w:color w:val="595959"/>
-                <w:sz w:val="18"/>
-                <w:szCs w:val="18"/>
-              </w:rPr>
-              <w:t>buộc</w:t>
-            </w:r>
-            <w:proofErr w:type="spellEnd"/>
-          </w:p>
-        </w:tc>
-      </w:tr>
-      <w:tr>
-        <w:tc>
-          <w:tcPr>
-            <w:tcW w:w="1100" w:type="dxa"/>
-            <w:tcMar>
-              <w:top w:w="100" w:type="dxa"/>
-              <w:left w:w="120" w:type="dxa"/>
-              <w:bottom w:w="100" w:type="dxa"/>
-              <w:right w:w="120" w:type="dxa"/>
-            </w:tcMar>
-          </w:tcPr>
-          <w:p>
-            <w:r>
-              <w:rPr>
-                <w:b/>
-                <w:bCs/>
-                <w:color w:val="1F3864"/>
-              </w:rPr>
-              <w:t>BR-04</w:t>
-            </w:r>
-          </w:p>
-        </w:tc>
-        <w:tc>
-          <w:tcPr>
-            <w:tcW w:w="6300" w:type="dxa"/>
-            <w:tcMar>
-              <w:top w:w="100" w:type="dxa"/>
-              <w:left w:w="120" w:type="dxa"/>
-              <w:bottom w:w="100" w:type="dxa"/>
-              <w:right w:w="120" w:type="dxa"/>
-            </w:tcMar>
-          </w:tcPr>
-          <w:p>
-            <w:r>
-              <w:t xml:space="preserve">Transport Specialist (TS) </w:t>
-            </w:r>
-            <w:proofErr w:type="spellStart"/>
-            <w:r>
-              <w:t>phải</w:t>
-            </w:r>
-            <w:proofErr w:type="spellEnd"/>
-            <w:r>
-              <w:t xml:space="preserve"> </w:t>
-            </w:r>
-            <w:proofErr w:type="spellStart"/>
-            <w:r>
-              <w:t>nhập</w:t>
-            </w:r>
-            <w:proofErr w:type="spellEnd"/>
-            <w:r>
-              <w:t xml:space="preserve"> </w:t>
-            </w:r>
-            <w:proofErr w:type="spellStart"/>
-            <w:r>
-              <w:t>minimum_processing_days</w:t>
-            </w:r>
-            <w:proofErr w:type="spellEnd"/>
-            <w:r>
-              <w:t xml:space="preserve"> </w:t>
-            </w:r>
-            <w:proofErr w:type="spellStart"/>
-            <w:r>
-              <w:t>cho</w:t>
-            </w:r>
-            <w:proofErr w:type="spellEnd"/>
-            <w:r>
-              <w:t xml:space="preserve"> </w:t>
-            </w:r>
-            <w:proofErr w:type="spellStart"/>
-            <w:r>
-              <w:t>từng</w:t>
-            </w:r>
-            <w:proofErr w:type="spellEnd"/>
-            <w:r>
-              <w:t xml:space="preserve"> order </w:t>
-            </w:r>
-            <w:proofErr w:type="spellStart"/>
-            <w:r>
-              <w:t>dựa</w:t>
-            </w:r>
-            <w:proofErr w:type="spellEnd"/>
-            <w:r>
-              <w:t xml:space="preserve"> </w:t>
-            </w:r>
-            <w:proofErr w:type="spellStart"/>
-            <w:r>
-              <w:t>trên</w:t>
-            </w:r>
-            <w:proofErr w:type="spellEnd"/>
-            <w:r>
-              <w:t xml:space="preserve"> </w:t>
-            </w:r>
-            <w:proofErr w:type="spellStart"/>
-            <w:r>
-              <w:t>quy</w:t>
-            </w:r>
-            <w:proofErr w:type="spellEnd"/>
-            <w:r>
-              <w:t xml:space="preserve"> </w:t>
-            </w:r>
-            <w:proofErr w:type="spellStart"/>
-            <w:r>
-              <w:t>định</w:t>
-            </w:r>
-            <w:proofErr w:type="spellEnd"/>
-            <w:r>
-              <w:t xml:space="preserve"> </w:t>
-            </w:r>
-            <w:proofErr w:type="spellStart"/>
-            <w:r>
-              <w:t>được</w:t>
-            </w:r>
-            <w:proofErr w:type="spellEnd"/>
-            <w:r>
-              <w:t xml:space="preserve"> TS review </w:t>
-            </w:r>
-            <w:proofErr w:type="spellStart"/>
-            <w:r>
-              <w:t>bên</w:t>
-            </w:r>
-            <w:proofErr w:type="spellEnd"/>
-            <w:r>
-              <w:t xml:space="preserve"> </w:t>
-            </w:r>
-            <w:proofErr w:type="spellStart"/>
-            <w:r>
-              <w:t>ngoài</w:t>
-            </w:r>
-            <w:proofErr w:type="spellEnd"/>
-            <w:r>
-              <w:t xml:space="preserve">. LM </w:t>
-            </w:r>
-            <w:proofErr w:type="spellStart"/>
-            <w:r>
-              <w:t>không</w:t>
-            </w:r>
-            <w:proofErr w:type="spellEnd"/>
-            <w:r>
-              <w:t xml:space="preserve"> </w:t>
-            </w:r>
-            <w:proofErr w:type="spellStart"/>
-            <w:r>
-              <w:t>được</w:t>
-            </w:r>
-            <w:proofErr w:type="spellEnd"/>
-            <w:r>
-              <w:t xml:space="preserve"> </w:t>
-            </w:r>
-            <w:proofErr w:type="spellStart"/>
-            <w:r>
-              <w:t>phê</w:t>
-            </w:r>
-            <w:proofErr w:type="spellEnd"/>
-            <w:r>
-              <w:t xml:space="preserve"> </w:t>
-            </w:r>
-            <w:proofErr w:type="spellStart"/>
-            <w:r>
-              <w:t>duyệt</w:t>
-            </w:r>
-            <w:proofErr w:type="spellEnd"/>
-            <w:r>
-              <w:t xml:space="preserve"> order </w:t>
-            </w:r>
-            <w:proofErr w:type="spellStart"/>
-            <w:r>
-              <w:t>nếu</w:t>
-            </w:r>
-            <w:proofErr w:type="spellEnd"/>
-            <w:r>
-              <w:t xml:space="preserve"> </w:t>
-            </w:r>
-            <w:proofErr w:type="spellStart"/>
-            <w:r>
-              <w:t>requested_departure_at</w:t>
-            </w:r>
-            <w:proofErr w:type="spellEnd"/>
-            <w:r>
-              <w:t xml:space="preserve"> </w:t>
-            </w:r>
-            <w:proofErr w:type="spellStart"/>
-            <w:r>
-              <w:t>sớm</w:t>
-            </w:r>
-            <w:proofErr w:type="spellEnd"/>
-            <w:r>
-              <w:t xml:space="preserve"> </w:t>
-            </w:r>
-            <w:proofErr w:type="spellStart"/>
-            <w:r>
-              <w:t>hơn</w:t>
-            </w:r>
-            <w:proofErr w:type="spellEnd"/>
-            <w:r>
-              <w:t xml:space="preserve"> </w:t>
-            </w:r>
-            <w:proofErr w:type="spellStart"/>
-            <w:r>
-              <w:t>created_at</w:t>
-            </w:r>
-            <w:proofErr w:type="spellEnd"/>
-            <w:r>
-              <w:t xml:space="preserve"> + </w:t>
-            </w:r>
-            <w:proofErr w:type="spellStart"/>
-            <w:r>
-              <w:t>minimum_processing_days</w:t>
-            </w:r>
-            <w:proofErr w:type="spellEnd"/>
-            <w:r>
-              <w:t>.</w:t>
-            </w:r>
-          </w:p>
-        </w:tc>
-        <w:tc>
-          <w:tcPr>
-            <w:tcW w:w="1950" w:type="dxa"/>
-            <w:tcMar>
-              <w:top w:w="100" w:type="dxa"/>
-              <w:left w:w="120" w:type="dxa"/>
-              <w:bottom w:w="100" w:type="dxa"/>
-              <w:right w:w="120" w:type="dxa"/>
-            </w:tcMar>
-          </w:tcPr>
-          <w:p>
-            <w:proofErr w:type="spellStart"/>
-            <w:r>
-              <w:rPr>
-                <w:b/>
-                <w:bCs/>
-                <w:i/>
-                <w:iCs/>
-                <w:color w:val="833C0C"/>
-                <w:sz w:val="18"/>
-                <w:szCs w:val="18"/>
-              </w:rPr>
-              <w:t>Cần</w:t>
-            </w:r>
-            <w:proofErr w:type="spellEnd"/>
-            <w:r>
-              <w:rPr>
-                <w:b/>
-                <w:bCs/>
-                <w:i/>
-                <w:iCs/>
-                <w:color w:val="833C0C"/>
-                <w:sz w:val="18"/>
-                <w:szCs w:val="18"/>
-              </w:rPr>
-              <w:t xml:space="preserve"> </w:t>
-            </w:r>
-            <w:proofErr w:type="spellStart"/>
-            <w:r>
-              <w:rPr>
-                <w:b/>
-                <w:bCs/>
-                <w:i/>
-                <w:iCs/>
-                <w:color w:val="833C0C"/>
-                <w:sz w:val="18"/>
-                <w:szCs w:val="18"/>
-              </w:rPr>
-              <w:t>xác</w:t>
-            </w:r>
-            <w:proofErr w:type="spellEnd"/>
-            <w:r>
-              <w:rPr>
-                <w:b/>
-                <w:bCs/>
-                <w:i/>
-                <w:iCs/>
-                <w:color w:val="833C0C"/>
-                <w:sz w:val="18"/>
-                <w:szCs w:val="18"/>
-              </w:rPr>
-              <w:t xml:space="preserve"> </w:t>
-            </w:r>
-            <w:proofErr w:type="spellStart"/>
-            <w:r>
-              <w:rPr>
-                <w:b/>
-                <w:bCs/>
-                <w:i/>
-                <w:iCs/>
-                <w:color w:val="833C0C"/>
-                <w:sz w:val="18"/>
-                <w:szCs w:val="18"/>
-              </w:rPr>
-              <w:t>nhận</w:t>
             </w:r>
             <w:proofErr w:type="spellEnd"/>
           </w:p>
@@ -3178,7 +2830,812 @@
                 <w:color w:val="1F3864"/>
                 <w:lang w:val="vi-VN"/>
               </w:rPr>
-              <w:t xml:space="preserve">-05 </w:t>
+              <w:t>-03</w:t>
+            </w:r>
+          </w:p>
+        </w:tc>
+        <w:tc>
+          <w:tcPr>
+            <w:tcW w:w="6300" w:type="dxa"/>
+            <w:tcMar>
+              <w:top w:w="100" w:type="dxa"/>
+              <w:left w:w="120" w:type="dxa"/>
+              <w:bottom w:w="100" w:type="dxa"/>
+              <w:right w:w="120" w:type="dxa"/>
+            </w:tcMar>
+          </w:tcPr>
+          <w:p>
+            <w:pPr>
+              <w:rPr>
+                <w:lang w:val="vi-VN"/>
+              </w:rPr>
+            </w:pPr>
+            <w:r>
+              <w:rPr>
+                <w:lang w:val="vi-VN"/>
+              </w:rPr>
+              <w:t>Nếu đến Document Completion Deadline mà Order vẫn còn mandatory document ở trạng thái missing, DRAFT hoặc chưa Submit, hệ thống tự động chuyển Order sang CANCELLED và thực hiện hoàn trả 100% Deposit cho Customer thông qua Stripe.</w:t>
+            </w:r>
+          </w:p>
+          <w:p>
+            <w:proofErr w:type="spellStart"/>
+            <w:r>
+              <w:t>Nếu</w:t>
+            </w:r>
+            <w:proofErr w:type="spellEnd"/>
+            <w:r>
+              <w:t xml:space="preserve"> </w:t>
+            </w:r>
+            <w:proofErr w:type="spellStart"/>
+            <w:r>
+              <w:t>tất</w:t>
+            </w:r>
+            <w:proofErr w:type="spellEnd"/>
+            <w:r>
+              <w:t xml:space="preserve"> </w:t>
+            </w:r>
+            <w:proofErr w:type="spellStart"/>
+            <w:r>
+              <w:t>cả</w:t>
+            </w:r>
+            <w:proofErr w:type="spellEnd"/>
+            <w:r>
+              <w:t xml:space="preserve"> mandatory documents </w:t>
+            </w:r>
+            <w:proofErr w:type="spellStart"/>
+            <w:r>
+              <w:t>đang</w:t>
+            </w:r>
+            <w:proofErr w:type="spellEnd"/>
+            <w:r>
+              <w:t xml:space="preserve"> ở </w:t>
+            </w:r>
+            <w:proofErr w:type="spellStart"/>
+            <w:r>
+              <w:t>trạng</w:t>
+            </w:r>
+            <w:proofErr w:type="spellEnd"/>
+            <w:r>
+              <w:t xml:space="preserve"> </w:t>
+            </w:r>
+            <w:proofErr w:type="spellStart"/>
+            <w:r>
+              <w:t>thái</w:t>
+            </w:r>
+            <w:proofErr w:type="spellEnd"/>
+            <w:r>
+              <w:t xml:space="preserve"> PENDING_REVIEW </w:t>
+            </w:r>
+            <w:proofErr w:type="spellStart"/>
+            <w:r>
+              <w:t>tại</w:t>
+            </w:r>
+            <w:proofErr w:type="spellEnd"/>
+            <w:r>
+              <w:t xml:space="preserve"> </w:t>
+            </w:r>
+            <w:proofErr w:type="spellStart"/>
+            <w:r>
+              <w:t>thời</w:t>
+            </w:r>
+            <w:proofErr w:type="spellEnd"/>
+            <w:r>
+              <w:t xml:space="preserve"> </w:t>
+            </w:r>
+            <w:proofErr w:type="spellStart"/>
+            <w:r>
+              <w:t>điểm</w:t>
+            </w:r>
+            <w:proofErr w:type="spellEnd"/>
+            <w:r>
+              <w:t xml:space="preserve"> Deadline, </w:t>
+            </w:r>
+            <w:proofErr w:type="spellStart"/>
+            <w:r>
+              <w:t>hệ</w:t>
+            </w:r>
+            <w:proofErr w:type="spellEnd"/>
+            <w:r>
+              <w:t xml:space="preserve"> </w:t>
+            </w:r>
+            <w:proofErr w:type="spellStart"/>
+            <w:r>
+              <w:t>thống</w:t>
+            </w:r>
+            <w:proofErr w:type="spellEnd"/>
+            <w:r>
+              <w:t xml:space="preserve"> </w:t>
+            </w:r>
+            <w:proofErr w:type="spellStart"/>
+            <w:r>
+              <w:t>không</w:t>
+            </w:r>
+            <w:proofErr w:type="spellEnd"/>
+            <w:r>
+              <w:t xml:space="preserve"> </w:t>
+            </w:r>
+            <w:proofErr w:type="spellStart"/>
+            <w:r>
+              <w:t>tự</w:t>
+            </w:r>
+            <w:proofErr w:type="spellEnd"/>
+            <w:r>
+              <w:t xml:space="preserve"> </w:t>
+            </w:r>
+            <w:proofErr w:type="spellStart"/>
+            <w:r>
+              <w:t>động</w:t>
+            </w:r>
+            <w:proofErr w:type="spellEnd"/>
+            <w:r>
+              <w:t xml:space="preserve"> cancel. </w:t>
+            </w:r>
+            <w:proofErr w:type="spellStart"/>
+            <w:r>
+              <w:t>Nếu</w:t>
+            </w:r>
+            <w:proofErr w:type="spellEnd"/>
+            <w:r>
+              <w:t xml:space="preserve"> TS Reject </w:t>
+            </w:r>
+            <w:proofErr w:type="spellStart"/>
+            <w:r>
+              <w:t>một</w:t>
+            </w:r>
+            <w:proofErr w:type="spellEnd"/>
+            <w:r>
+              <w:t xml:space="preserve"> document </w:t>
+            </w:r>
+            <w:proofErr w:type="spellStart"/>
+            <w:r>
+              <w:t>sau</w:t>
+            </w:r>
+            <w:proofErr w:type="spellEnd"/>
+            <w:r>
+              <w:t xml:space="preserve"> Deadline, Order </w:t>
+            </w:r>
+            <w:proofErr w:type="spellStart"/>
+            <w:r>
+              <w:t>được</w:t>
+            </w:r>
+            <w:proofErr w:type="spellEnd"/>
+            <w:r>
+              <w:t xml:space="preserve"> </w:t>
+            </w:r>
+            <w:proofErr w:type="spellStart"/>
+            <w:r>
+              <w:t>chuyển</w:t>
+            </w:r>
+            <w:proofErr w:type="spellEnd"/>
+            <w:r>
+              <w:t xml:space="preserve"> sang CANCELLED </w:t>
+            </w:r>
+            <w:proofErr w:type="spellStart"/>
+            <w:r>
+              <w:t>và</w:t>
+            </w:r>
+            <w:proofErr w:type="spellEnd"/>
+            <w:r>
+              <w:t xml:space="preserve"> </w:t>
+            </w:r>
+            <w:proofErr w:type="spellStart"/>
+            <w:r>
+              <w:t>hệ</w:t>
+            </w:r>
+            <w:proofErr w:type="spellEnd"/>
+            <w:r>
+              <w:t xml:space="preserve"> </w:t>
+            </w:r>
+            <w:proofErr w:type="spellStart"/>
+            <w:r>
+              <w:t>thống</w:t>
+            </w:r>
+            <w:proofErr w:type="spellEnd"/>
+            <w:r>
+              <w:t xml:space="preserve"> </w:t>
+            </w:r>
+            <w:proofErr w:type="spellStart"/>
+            <w:r>
+              <w:t>thực</w:t>
+            </w:r>
+            <w:proofErr w:type="spellEnd"/>
+            <w:r>
+              <w:t xml:space="preserve"> </w:t>
+            </w:r>
+            <w:proofErr w:type="spellStart"/>
+            <w:r>
+              <w:t>hiện</w:t>
+            </w:r>
+            <w:proofErr w:type="spellEnd"/>
+            <w:r>
+              <w:t xml:space="preserve"> </w:t>
+            </w:r>
+            <w:proofErr w:type="spellStart"/>
+            <w:r>
+              <w:t>hoàn</w:t>
+            </w:r>
+            <w:proofErr w:type="spellEnd"/>
+            <w:r>
+              <w:t xml:space="preserve"> </w:t>
+            </w:r>
+            <w:proofErr w:type="spellStart"/>
+            <w:r>
+              <w:t>trả</w:t>
+            </w:r>
+            <w:proofErr w:type="spellEnd"/>
+            <w:r>
+              <w:t xml:space="preserve"> 100% Deposit.</w:t>
+            </w:r>
+          </w:p>
+          <w:p>
+            <w:pPr>
+              <w:rPr>
+                <w:lang w:val="vi-VN"/>
+              </w:rPr>
+            </w:pPr>
+            <w:proofErr w:type="spellStart"/>
+            <w:r>
+              <w:t>Việc</w:t>
+            </w:r>
+            <w:proofErr w:type="spellEnd"/>
+            <w:r>
+              <w:t xml:space="preserve"> cancellation </w:t>
+            </w:r>
+            <w:proofErr w:type="spellStart"/>
+            <w:r>
+              <w:t>và</w:t>
+            </w:r>
+            <w:proofErr w:type="spellEnd"/>
+            <w:r>
+              <w:t xml:space="preserve"> refund </w:t>
+            </w:r>
+            <w:proofErr w:type="spellStart"/>
+            <w:r>
+              <w:t>không</w:t>
+            </w:r>
+            <w:proofErr w:type="spellEnd"/>
+            <w:r>
+              <w:t xml:space="preserve"> </w:t>
+            </w:r>
+            <w:proofErr w:type="spellStart"/>
+            <w:r>
+              <w:t>yêu</w:t>
+            </w:r>
+            <w:proofErr w:type="spellEnd"/>
+            <w:r>
+              <w:t xml:space="preserve"> </w:t>
+            </w:r>
+            <w:proofErr w:type="spellStart"/>
+            <w:r>
+              <w:t>cầu</w:t>
+            </w:r>
+            <w:proofErr w:type="spellEnd"/>
+            <w:r>
+              <w:t xml:space="preserve"> LM approval.</w:t>
+            </w:r>
+          </w:p>
+        </w:tc>
+        <w:tc>
+          <w:tcPr>
+            <w:tcW w:w="1950" w:type="dxa"/>
+            <w:tcMar>
+              <w:top w:w="100" w:type="dxa"/>
+              <w:left w:w="120" w:type="dxa"/>
+              <w:bottom w:w="100" w:type="dxa"/>
+              <w:right w:w="120" w:type="dxa"/>
+            </w:tcMar>
+          </w:tcPr>
+          <w:p>
+            <w:pPr>
+              <w:rPr>
+                <w:i/>
+                <w:iCs/>
+                <w:color w:val="595959"/>
+                <w:sz w:val="18"/>
+                <w:szCs w:val="18"/>
+                <w:lang w:val="vi-VN"/>
+              </w:rPr>
+            </w:pPr>
+            <w:proofErr w:type="spellStart"/>
+            <w:r>
+              <w:rPr>
+                <w:i/>
+                <w:iCs/>
+                <w:color w:val="595959"/>
+                <w:sz w:val="18"/>
+                <w:szCs w:val="18"/>
+              </w:rPr>
+              <w:t>Bắt</w:t>
+            </w:r>
+            <w:proofErr w:type="spellEnd"/>
+            <w:r>
+              <w:rPr>
+                <w:i/>
+                <w:iCs/>
+                <w:color w:val="595959"/>
+                <w:sz w:val="18"/>
+                <w:szCs w:val="18"/>
+                <w:lang w:val="vi-VN"/>
+              </w:rPr>
+              <w:t xml:space="preserve"> buộc</w:t>
+            </w:r>
+          </w:p>
+        </w:tc>
+      </w:tr>
+      <w:tr>
+        <w:tc>
+          <w:tcPr>
+            <w:tcW w:w="1100" w:type="dxa"/>
+            <w:tcMar>
+              <w:top w:w="100" w:type="dxa"/>
+              <w:left w:w="120" w:type="dxa"/>
+              <w:bottom w:w="100" w:type="dxa"/>
+              <w:right w:w="120" w:type="dxa"/>
+            </w:tcMar>
+          </w:tcPr>
+          <w:p>
+            <w:pPr>
+              <w:rPr>
+                <w:lang w:val="vi-VN"/>
+              </w:rPr>
+            </w:pPr>
+            <w:r>
+              <w:rPr>
+                <w:b/>
+                <w:bCs/>
+                <w:color w:val="1F3864"/>
+              </w:rPr>
+              <w:t>BR-</w:t>
+            </w:r>
+            <w:r>
+              <w:rPr>
+                <w:b/>
+                <w:bCs/>
+                <w:color w:val="1F3864"/>
+              </w:rPr>
+              <w:t>04</w:t>
+            </w:r>
+          </w:p>
+        </w:tc>
+        <w:tc>
+          <w:tcPr>
+            <w:tcW w:w="6300" w:type="dxa"/>
+            <w:tcMar>
+              <w:top w:w="100" w:type="dxa"/>
+              <w:left w:w="120" w:type="dxa"/>
+              <w:bottom w:w="100" w:type="dxa"/>
+              <w:right w:w="120" w:type="dxa"/>
+            </w:tcMar>
+          </w:tcPr>
+          <w:p>
+            <w:pPr>
+              <w:rPr>
+                <w:lang w:val="vi-VN"/>
+              </w:rPr>
+            </w:pPr>
+            <w:r>
+              <w:rPr>
+                <w:lang w:val="vi-VN"/>
+              </w:rPr>
+              <w:t xml:space="preserve">Mỗi Horse phải có một microchip ID duy nhất và không được để trống. </w:t>
+            </w:r>
+            <w:r>
+              <w:rPr>
+                <w:lang w:val="vi-VN"/>
+              </w:rPr>
+              <w:t>Microchip ID được lưu ở hồ sơ Horse và không được trùng giữa các Horse.</w:t>
+            </w:r>
+          </w:p>
+        </w:tc>
+        <w:tc>
+          <w:tcPr>
+            <w:tcW w:w="1950" w:type="dxa"/>
+            <w:tcMar>
+              <w:top w:w="100" w:type="dxa"/>
+              <w:left w:w="120" w:type="dxa"/>
+              <w:bottom w:w="100" w:type="dxa"/>
+              <w:right w:w="120" w:type="dxa"/>
+            </w:tcMar>
+          </w:tcPr>
+          <w:p>
+            <w:proofErr w:type="spellStart"/>
+            <w:r>
+              <w:rPr>
+                <w:i/>
+                <w:iCs/>
+                <w:color w:val="595959"/>
+                <w:sz w:val="18"/>
+                <w:szCs w:val="18"/>
+              </w:rPr>
+              <w:t>Bắt</w:t>
+            </w:r>
+            <w:proofErr w:type="spellEnd"/>
+            <w:r>
+              <w:rPr>
+                <w:i/>
+                <w:iCs/>
+                <w:color w:val="595959"/>
+                <w:sz w:val="18"/>
+                <w:szCs w:val="18"/>
+              </w:rPr>
+              <w:t xml:space="preserve"> </w:t>
+            </w:r>
+            <w:proofErr w:type="spellStart"/>
+            <w:r>
+              <w:rPr>
+                <w:i/>
+                <w:iCs/>
+                <w:color w:val="595959"/>
+                <w:sz w:val="18"/>
+                <w:szCs w:val="18"/>
+              </w:rPr>
+              <w:t>buộc</w:t>
+            </w:r>
+            <w:proofErr w:type="spellEnd"/>
+          </w:p>
+        </w:tc>
+      </w:tr>
+      <w:tr>
+        <w:tc>
+          <w:tcPr>
+            <w:tcW w:w="1100" w:type="dxa"/>
+            <w:tcMar>
+              <w:top w:w="100" w:type="dxa"/>
+              <w:left w:w="120" w:type="dxa"/>
+              <w:bottom w:w="100" w:type="dxa"/>
+              <w:right w:w="120" w:type="dxa"/>
+            </w:tcMar>
+          </w:tcPr>
+          <w:p>
+            <w:pPr>
+              <w:rPr>
+                <w:lang w:val="vi-VN"/>
+              </w:rPr>
+            </w:pPr>
+            <w:r>
+              <w:rPr>
+                <w:b/>
+                <w:bCs/>
+                <w:color w:val="1F3864"/>
+              </w:rPr>
+              <w:t>BR-</w:t>
+            </w:r>
+            <w:r>
+              <w:rPr>
+                <w:b/>
+                <w:bCs/>
+                <w:color w:val="1F3864"/>
+              </w:rPr>
+              <w:t>05</w:t>
+            </w:r>
+          </w:p>
+        </w:tc>
+        <w:tc>
+          <w:tcPr>
+            <w:tcW w:w="6300" w:type="dxa"/>
+            <w:tcMar>
+              <w:top w:w="100" w:type="dxa"/>
+              <w:left w:w="120" w:type="dxa"/>
+              <w:bottom w:w="100" w:type="dxa"/>
+              <w:right w:w="120" w:type="dxa"/>
+            </w:tcMar>
+          </w:tcPr>
+          <w:p>
+            <w:r>
+              <w:t xml:space="preserve">Transport Specialist (TS) </w:t>
+            </w:r>
+            <w:proofErr w:type="spellStart"/>
+            <w:r>
+              <w:t>phải</w:t>
+            </w:r>
+            <w:proofErr w:type="spellEnd"/>
+            <w:r>
+              <w:t xml:space="preserve"> </w:t>
+            </w:r>
+            <w:proofErr w:type="spellStart"/>
+            <w:r>
+              <w:t>nhập</w:t>
+            </w:r>
+            <w:proofErr w:type="spellEnd"/>
+            <w:r>
+              <w:t xml:space="preserve"> </w:t>
+            </w:r>
+            <w:proofErr w:type="spellStart"/>
+            <w:r>
+              <w:t>minimum_processing_days</w:t>
+            </w:r>
+            <w:proofErr w:type="spellEnd"/>
+            <w:r>
+              <w:t xml:space="preserve"> </w:t>
+            </w:r>
+            <w:proofErr w:type="spellStart"/>
+            <w:r>
+              <w:t>cho</w:t>
+            </w:r>
+            <w:proofErr w:type="spellEnd"/>
+            <w:r>
+              <w:t xml:space="preserve"> </w:t>
+            </w:r>
+            <w:proofErr w:type="spellStart"/>
+            <w:r>
+              <w:t>từng</w:t>
+            </w:r>
+            <w:proofErr w:type="spellEnd"/>
+            <w:r>
+              <w:t xml:space="preserve"> order </w:t>
+            </w:r>
+            <w:proofErr w:type="spellStart"/>
+            <w:r>
+              <w:t>dựa</w:t>
+            </w:r>
+            <w:proofErr w:type="spellEnd"/>
+            <w:r>
+              <w:t xml:space="preserve"> </w:t>
+            </w:r>
+            <w:proofErr w:type="spellStart"/>
+            <w:r>
+              <w:t>trên</w:t>
+            </w:r>
+            <w:proofErr w:type="spellEnd"/>
+            <w:r>
+              <w:t xml:space="preserve"> </w:t>
+            </w:r>
+            <w:proofErr w:type="spellStart"/>
+            <w:r>
+              <w:t>quy</w:t>
+            </w:r>
+            <w:proofErr w:type="spellEnd"/>
+            <w:r>
+              <w:t xml:space="preserve"> </w:t>
+            </w:r>
+            <w:proofErr w:type="spellStart"/>
+            <w:r>
+              <w:t>định</w:t>
+            </w:r>
+            <w:proofErr w:type="spellEnd"/>
+            <w:r>
+              <w:t xml:space="preserve"> </w:t>
+            </w:r>
+            <w:proofErr w:type="spellStart"/>
+            <w:r>
+              <w:t>được</w:t>
+            </w:r>
+            <w:proofErr w:type="spellEnd"/>
+            <w:r>
+              <w:t xml:space="preserve"> TS review </w:t>
+            </w:r>
+            <w:proofErr w:type="spellStart"/>
+            <w:r>
+              <w:t>bên</w:t>
+            </w:r>
+            <w:proofErr w:type="spellEnd"/>
+            <w:r>
+              <w:t xml:space="preserve"> </w:t>
+            </w:r>
+            <w:proofErr w:type="spellStart"/>
+            <w:r>
+              <w:t>ngoài</w:t>
+            </w:r>
+            <w:proofErr w:type="spellEnd"/>
+            <w:r>
+              <w:t xml:space="preserve">. LM </w:t>
+            </w:r>
+            <w:proofErr w:type="spellStart"/>
+            <w:r>
+              <w:t>không</w:t>
+            </w:r>
+            <w:proofErr w:type="spellEnd"/>
+            <w:r>
+              <w:t xml:space="preserve"> </w:t>
+            </w:r>
+            <w:proofErr w:type="spellStart"/>
+            <w:r>
+              <w:t>được</w:t>
+            </w:r>
+            <w:proofErr w:type="spellEnd"/>
+            <w:r>
+              <w:t xml:space="preserve"> </w:t>
+            </w:r>
+            <w:proofErr w:type="spellStart"/>
+            <w:r>
+              <w:t>phê</w:t>
+            </w:r>
+            <w:proofErr w:type="spellEnd"/>
+            <w:r>
+              <w:t xml:space="preserve"> </w:t>
+            </w:r>
+            <w:proofErr w:type="spellStart"/>
+            <w:r>
+              <w:t>duyệt</w:t>
+            </w:r>
+            <w:proofErr w:type="spellEnd"/>
+            <w:r>
+              <w:t xml:space="preserve"> order </w:t>
+            </w:r>
+            <w:proofErr w:type="spellStart"/>
+            <w:r>
+              <w:t>nếu</w:t>
+            </w:r>
+            <w:proofErr w:type="spellEnd"/>
+            <w:r>
+              <w:t xml:space="preserve"> </w:t>
+            </w:r>
+            <w:proofErr w:type="spellStart"/>
+            <w:r>
+              <w:t>requested_departure_at</w:t>
+            </w:r>
+            <w:proofErr w:type="spellEnd"/>
+            <w:r>
+              <w:t xml:space="preserve"> </w:t>
+            </w:r>
+            <w:proofErr w:type="spellStart"/>
+            <w:r>
+              <w:t>sớm</w:t>
+            </w:r>
+            <w:proofErr w:type="spellEnd"/>
+            <w:r>
+              <w:t xml:space="preserve"> </w:t>
+            </w:r>
+            <w:proofErr w:type="spellStart"/>
+            <w:r>
+              <w:t>hơn</w:t>
+            </w:r>
+            <w:proofErr w:type="spellEnd"/>
+            <w:r>
+              <w:t xml:space="preserve"> </w:t>
+            </w:r>
+            <w:proofErr w:type="spellStart"/>
+            <w:r>
+              <w:t>created_at</w:t>
+            </w:r>
+            <w:proofErr w:type="spellEnd"/>
+            <w:r>
+              <w:t xml:space="preserve"> + </w:t>
+            </w:r>
+            <w:proofErr w:type="spellStart"/>
+            <w:r>
+              <w:t>minimum_processing_days</w:t>
+            </w:r>
+            <w:proofErr w:type="spellEnd"/>
+            <w:r>
+              <w:t>.</w:t>
+            </w:r>
+          </w:p>
+        </w:tc>
+        <w:tc>
+          <w:tcPr>
+            <w:tcW w:w="1950" w:type="dxa"/>
+            <w:tcMar>
+              <w:top w:w="100" w:type="dxa"/>
+              <w:left w:w="120" w:type="dxa"/>
+              <w:bottom w:w="100" w:type="dxa"/>
+              <w:right w:w="120" w:type="dxa"/>
+            </w:tcMar>
+          </w:tcPr>
+          <w:p>
+            <w:proofErr w:type="spellStart"/>
+            <w:r>
+              <w:rPr>
+                <w:b/>
+                <w:bCs/>
+                <w:i/>
+                <w:iCs/>
+                <w:color w:val="833C0C"/>
+                <w:sz w:val="18"/>
+                <w:szCs w:val="18"/>
+              </w:rPr>
+              <w:t>Cần</w:t>
+            </w:r>
+            <w:proofErr w:type="spellEnd"/>
+            <w:r>
+              <w:rPr>
+                <w:b/>
+                <w:bCs/>
+                <w:i/>
+                <w:iCs/>
+                <w:color w:val="833C0C"/>
+                <w:sz w:val="18"/>
+                <w:szCs w:val="18"/>
+              </w:rPr>
+              <w:t xml:space="preserve"> </w:t>
+            </w:r>
+            <w:proofErr w:type="spellStart"/>
+            <w:r>
+              <w:rPr>
+                <w:b/>
+                <w:bCs/>
+                <w:i/>
+                <w:iCs/>
+                <w:color w:val="833C0C"/>
+                <w:sz w:val="18"/>
+                <w:szCs w:val="18"/>
+              </w:rPr>
+              <w:t>xác</w:t>
+            </w:r>
+            <w:proofErr w:type="spellEnd"/>
+            <w:r>
+              <w:rPr>
+                <w:b/>
+                <w:bCs/>
+                <w:i/>
+                <w:iCs/>
+                <w:color w:val="833C0C"/>
+                <w:sz w:val="18"/>
+                <w:szCs w:val="18"/>
+              </w:rPr>
+              <w:t xml:space="preserve"> </w:t>
+            </w:r>
+            <w:proofErr w:type="spellStart"/>
+            <w:r>
+              <w:rPr>
+                <w:b/>
+                <w:bCs/>
+                <w:i/>
+                <w:iCs/>
+                <w:color w:val="833C0C"/>
+                <w:sz w:val="18"/>
+                <w:szCs w:val="18"/>
+              </w:rPr>
+              <w:t>nhận</w:t>
+            </w:r>
+            <w:proofErr w:type="spellEnd"/>
+          </w:p>
+        </w:tc>
+      </w:tr>
+      <w:tr>
+        <w:tc>
+          <w:tcPr>
+            <w:tcW w:w="1100" w:type="dxa"/>
+            <w:tcMar>
+              <w:top w:w="100" w:type="dxa"/>
+              <w:left w:w="120" w:type="dxa"/>
+              <w:bottom w:w="100" w:type="dxa"/>
+              <w:right w:w="120" w:type="dxa"/>
+            </w:tcMar>
+          </w:tcPr>
+          <w:p>
+            <w:pPr>
+              <w:rPr>
+                <w:b/>
+                <w:bCs/>
+                <w:color w:val="1F3864"/>
+                <w:lang w:val="vi-VN"/>
+              </w:rPr>
+            </w:pPr>
+            <w:r>
+              <w:rPr>
+                <w:b/>
+                <w:bCs/>
+                <w:color w:val="1F3864"/>
+              </w:rPr>
+              <w:t>BR</w:t>
+            </w:r>
+            <w:r>
+              <w:rPr>
+                <w:b/>
+                <w:bCs/>
+                <w:color w:val="1F3864"/>
+                <w:lang w:val="vi-VN"/>
+              </w:rPr>
+              <w:t>-</w:t>
+            </w:r>
+            <w:r>
+              <w:rPr>
+                <w:b/>
+                <w:bCs/>
+                <w:color w:val="1F3864"/>
+                <w:lang w:val="vi-VN"/>
+              </w:rPr>
+              <w:t>06</w:t>
+            </w:r>
+            <w:r>
+              <w:rPr>
+                <w:b/>
+                <w:bCs/>
+                <w:color w:val="1F3864"/>
+                <w:lang w:val="vi-VN"/>
+              </w:rPr>
+              <w:t xml:space="preserve"> </w:t>
             </w:r>
           </w:p>
         </w:tc>
@@ -3253,6 +3710,7 @@
                 <w:szCs w:val="18"/>
                 <w:lang w:val="vi-VN"/>
               </w:rPr>
+              <w:lastRenderedPageBreak/>
               <w:t>Bắt buộc</w:t>
             </w:r>
           </w:p>
@@ -3557,7 +4015,7 @@
                 <w:bCs/>
                 <w:color w:val="1F3864"/>
               </w:rPr>
-              <w:t>06</w:t>
+              <w:t>07</w:t>
             </w:r>
           </w:p>
         </w:tc>
@@ -3792,7 +4250,7 @@
                 <w:bCs/>
                 <w:color w:val="1F3864"/>
               </w:rPr>
-              <w:t>07</w:t>
+              <w:t>08</w:t>
             </w:r>
           </w:p>
         </w:tc>
@@ -3905,7 +4363,6 @@
             </w:r>
             <w:proofErr w:type="spellStart"/>
             <w:r>
-              <w:lastRenderedPageBreak/>
               <w:t>planned_stop_duration_minutes</w:t>
             </w:r>
             <w:proofErr w:type="spellEnd"/>
@@ -4030,7 +4487,6 @@
                 <w:sz w:val="18"/>
                 <w:szCs w:val="18"/>
               </w:rPr>
-              <w:lastRenderedPageBreak/>
               <w:t>Bắt</w:t>
             </w:r>
             <w:proofErr w:type="spellEnd"/>
@@ -4091,7 +4547,7 @@
                 <w:bCs/>
                 <w:color w:val="1F3864"/>
               </w:rPr>
-              <w:t>08</w:t>
+              <w:t>09</w:t>
             </w:r>
           </w:p>
         </w:tc>
@@ -4166,6 +4622,329 @@
               <w:t>buộc</w:t>
             </w:r>
             <w:proofErr w:type="spellEnd"/>
+          </w:p>
+        </w:tc>
+      </w:tr>
+      <w:tr>
+        <w:tc>
+          <w:tcPr>
+            <w:tcW w:w="1100" w:type="dxa"/>
+            <w:shd w:val="clear" w:color="auto" w:fill="F2F6FB"/>
+            <w:tcMar>
+              <w:top w:w="100" w:type="dxa"/>
+              <w:left w:w="120" w:type="dxa"/>
+              <w:bottom w:w="100" w:type="dxa"/>
+              <w:right w:w="120" w:type="dxa"/>
+            </w:tcMar>
+          </w:tcPr>
+          <w:p>
+            <w:pPr>
+              <w:rPr>
+                <w:b/>
+                <w:bCs/>
+                <w:color w:val="1F3864"/>
+                <w:lang w:val="vi-VN"/>
+              </w:rPr>
+            </w:pPr>
+            <w:r>
+              <w:rPr>
+                <w:b/>
+                <w:bCs/>
+                <w:color w:val="1F3864"/>
+              </w:rPr>
+              <w:t>BR</w:t>
+            </w:r>
+            <w:r>
+              <w:rPr>
+                <w:b/>
+                <w:bCs/>
+                <w:color w:val="1F3864"/>
+                <w:lang w:val="vi-VN"/>
+              </w:rPr>
+              <w:t>-</w:t>
+            </w:r>
+            <w:r>
+              <w:rPr>
+                <w:b/>
+                <w:bCs/>
+                <w:color w:val="1F3864"/>
+                <w:lang w:val="vi-VN"/>
+              </w:rPr>
+              <w:t>10</w:t>
+            </w:r>
+          </w:p>
+        </w:tc>
+        <w:tc>
+          <w:tcPr>
+            <w:tcW w:w="6300" w:type="dxa"/>
+            <w:shd w:val="clear" w:color="auto" w:fill="F2F6FB"/>
+            <w:tcMar>
+              <w:top w:w="100" w:type="dxa"/>
+              <w:left w:w="120" w:type="dxa"/>
+              <w:bottom w:w="100" w:type="dxa"/>
+              <w:right w:w="120" w:type="dxa"/>
+            </w:tcMar>
+          </w:tcPr>
+          <w:p>
+            <w:pPr>
+              <w:rPr>
+                <w:lang w:val="vi-VN"/>
+              </w:rPr>
+            </w:pPr>
+            <w:r>
+              <w:t xml:space="preserve">Sau </w:t>
+            </w:r>
+            <w:proofErr w:type="spellStart"/>
+            <w:r>
+              <w:t>khi</w:t>
+            </w:r>
+            <w:proofErr w:type="spellEnd"/>
+            <w:r>
+              <w:t xml:space="preserve"> TS </w:t>
+            </w:r>
+            <w:proofErr w:type="spellStart"/>
+            <w:r>
+              <w:t>thực</w:t>
+            </w:r>
+            <w:proofErr w:type="spellEnd"/>
+            <w:r>
+              <w:t xml:space="preserve"> </w:t>
+            </w:r>
+            <w:proofErr w:type="spellStart"/>
+            <w:r>
+              <w:t>hiện</w:t>
+            </w:r>
+            <w:proofErr w:type="spellEnd"/>
+            <w:r>
+              <w:t xml:space="preserve"> Final Confirm </w:t>
+            </w:r>
+            <w:proofErr w:type="spellStart"/>
+            <w:r>
+              <w:t>và</w:t>
+            </w:r>
+            <w:proofErr w:type="spellEnd"/>
+            <w:r>
+              <w:t xml:space="preserve"> </w:t>
+            </w:r>
+            <w:proofErr w:type="spellStart"/>
+            <w:r>
+              <w:t>tất</w:t>
+            </w:r>
+            <w:proofErr w:type="spellEnd"/>
+            <w:r>
+              <w:t xml:space="preserve"> </w:t>
+            </w:r>
+            <w:proofErr w:type="spellStart"/>
+            <w:r>
+              <w:t>cả</w:t>
+            </w:r>
+            <w:proofErr w:type="spellEnd"/>
+            <w:r>
+              <w:t xml:space="preserve"> mandatory documents </w:t>
+            </w:r>
+            <w:proofErr w:type="spellStart"/>
+            <w:r>
+              <w:t>của</w:t>
+            </w:r>
+            <w:proofErr w:type="spellEnd"/>
+            <w:r>
+              <w:t xml:space="preserve"> Order </w:t>
+            </w:r>
+            <w:proofErr w:type="spellStart"/>
+            <w:r>
+              <w:t>đã</w:t>
+            </w:r>
+            <w:proofErr w:type="spellEnd"/>
+            <w:r>
+              <w:t xml:space="preserve"> </w:t>
+            </w:r>
+            <w:proofErr w:type="spellStart"/>
+            <w:r>
+              <w:t>được</w:t>
+            </w:r>
+            <w:proofErr w:type="spellEnd"/>
+            <w:r>
+              <w:t xml:space="preserve"> APPROVED, Customer </w:t>
+            </w:r>
+            <w:proofErr w:type="spellStart"/>
+            <w:r>
+              <w:t>phải</w:t>
+            </w:r>
+            <w:proofErr w:type="spellEnd"/>
+            <w:r>
+              <w:t xml:space="preserve"> </w:t>
+            </w:r>
+            <w:proofErr w:type="spellStart"/>
+            <w:r>
+              <w:t>thanh</w:t>
+            </w:r>
+            <w:proofErr w:type="spellEnd"/>
+            <w:r>
+              <w:t xml:space="preserve"> </w:t>
+            </w:r>
+            <w:proofErr w:type="spellStart"/>
+            <w:r>
+              <w:t>toán</w:t>
+            </w:r>
+            <w:proofErr w:type="spellEnd"/>
+            <w:r>
+              <w:t xml:space="preserve"> Remaining Balance </w:t>
+            </w:r>
+            <w:proofErr w:type="spellStart"/>
+            <w:r>
+              <w:t>theo</w:t>
+            </w:r>
+            <w:proofErr w:type="spellEnd"/>
+            <w:r>
+              <w:t xml:space="preserve"> quotation </w:t>
+            </w:r>
+            <w:proofErr w:type="spellStart"/>
+            <w:r>
+              <w:t>đã</w:t>
+            </w:r>
+            <w:proofErr w:type="spellEnd"/>
+            <w:r>
+              <w:t xml:space="preserve"> </w:t>
+            </w:r>
+            <w:proofErr w:type="spellStart"/>
+            <w:r>
+              <w:t>được</w:t>
+            </w:r>
+            <w:proofErr w:type="spellEnd"/>
+            <w:r>
+              <w:t xml:space="preserve"> </w:t>
+            </w:r>
+            <w:proofErr w:type="spellStart"/>
+            <w:r>
+              <w:t>khóa</w:t>
+            </w:r>
+            <w:proofErr w:type="spellEnd"/>
+            <w:r>
+              <w:t xml:space="preserve">. Order </w:t>
+            </w:r>
+            <w:proofErr w:type="spellStart"/>
+            <w:r>
+              <w:t>chỉ</w:t>
+            </w:r>
+            <w:proofErr w:type="spellEnd"/>
+            <w:r>
+              <w:t xml:space="preserve"> </w:t>
+            </w:r>
+            <w:proofErr w:type="spellStart"/>
+            <w:r>
+              <w:t>được</w:t>
+            </w:r>
+            <w:proofErr w:type="spellEnd"/>
+            <w:r>
+              <w:t xml:space="preserve"> </w:t>
+            </w:r>
+            <w:proofErr w:type="spellStart"/>
+            <w:r>
+              <w:t>chuyển</w:t>
+            </w:r>
+            <w:proofErr w:type="spellEnd"/>
+            <w:r>
+              <w:t xml:space="preserve"> sang Route Planning </w:t>
+            </w:r>
+            <w:proofErr w:type="spellStart"/>
+            <w:r>
+              <w:t>sau</w:t>
+            </w:r>
+            <w:proofErr w:type="spellEnd"/>
+            <w:r>
+              <w:t xml:space="preserve"> </w:t>
+            </w:r>
+            <w:proofErr w:type="spellStart"/>
+            <w:r>
+              <w:t>khi</w:t>
+            </w:r>
+            <w:proofErr w:type="spellEnd"/>
+            <w:r>
+              <w:t xml:space="preserve"> Stripe </w:t>
+            </w:r>
+            <w:proofErr w:type="spellStart"/>
+            <w:r>
+              <w:t>xác</w:t>
+            </w:r>
+            <w:proofErr w:type="spellEnd"/>
+            <w:r>
+              <w:t xml:space="preserve"> </w:t>
+            </w:r>
+            <w:proofErr w:type="spellStart"/>
+            <w:r>
+              <w:t>nhận</w:t>
+            </w:r>
+            <w:proofErr w:type="spellEnd"/>
+            <w:r>
+              <w:t xml:space="preserve"> </w:t>
+            </w:r>
+            <w:proofErr w:type="spellStart"/>
+            <w:r>
+              <w:t>thanh</w:t>
+            </w:r>
+            <w:proofErr w:type="spellEnd"/>
+            <w:r>
+              <w:t xml:space="preserve"> </w:t>
+            </w:r>
+            <w:proofErr w:type="spellStart"/>
+            <w:r>
+              <w:t>toán</w:t>
+            </w:r>
+            <w:proofErr w:type="spellEnd"/>
+            <w:r>
+              <w:t xml:space="preserve"> Remaining Balance </w:t>
+            </w:r>
+            <w:proofErr w:type="spellStart"/>
+            <w:r>
+              <w:t>thành</w:t>
+            </w:r>
+            <w:proofErr w:type="spellEnd"/>
+            <w:r>
+              <w:t xml:space="preserve"> </w:t>
+            </w:r>
+            <w:proofErr w:type="spellStart"/>
+            <w:r>
+              <w:t>công</w:t>
+            </w:r>
+            <w:proofErr w:type="spellEnd"/>
+            <w:r>
+              <w:t>.</w:t>
+            </w:r>
+          </w:p>
+        </w:tc>
+        <w:tc>
+          <w:tcPr>
+            <w:tcW w:w="1950" w:type="dxa"/>
+            <w:shd w:val="clear" w:color="auto" w:fill="F2F6FB"/>
+            <w:tcMar>
+              <w:top w:w="100" w:type="dxa"/>
+              <w:left w:w="120" w:type="dxa"/>
+              <w:bottom w:w="100" w:type="dxa"/>
+              <w:right w:w="120" w:type="dxa"/>
+            </w:tcMar>
+          </w:tcPr>
+          <w:p>
+            <w:pPr>
+              <w:rPr>
+                <w:i/>
+                <w:iCs/>
+                <w:color w:val="595959"/>
+                <w:sz w:val="18"/>
+                <w:szCs w:val="18"/>
+                <w:lang w:val="vi-VN"/>
+              </w:rPr>
+            </w:pPr>
+            <w:r>
+              <w:rPr>
+                <w:i/>
+                <w:iCs/>
+                <w:color w:val="595959"/>
+                <w:sz w:val="18"/>
+                <w:szCs w:val="18"/>
+                <w:lang w:val="vi-VN"/>
+              </w:rPr>
+              <w:t>Bắt buộc</w:t>
+            </w:r>
           </w:p>
         </w:tc>
       </w:tr>
@@ -4201,7 +4980,7 @@
                 <w:bCs/>
                 <w:color w:val="1F3864"/>
               </w:rPr>
-              <w:t>09</w:t>
+              <w:t>11</w:t>
             </w:r>
           </w:p>
         </w:tc>
@@ -4538,7 +5317,27 @@
           <w:sz w:val="24"/>
           <w:szCs w:val="24"/>
         </w:rPr>
-        <w:t xml:space="preserve"> sơ </w:t>
+        <w:t xml:space="preserve"> </w:t>
+      </w:r>
+      <w:proofErr w:type="spellStart"/>
+      <w:r>
+        <w:rPr>
+          <w:b/>
+          <w:bCs/>
+          <w:sz w:val="24"/>
+          <w:szCs w:val="24"/>
+        </w:rPr>
+        <w:t>sơ</w:t>
+      </w:r>
+      <w:proofErr w:type="spellEnd"/>
+      <w:r>
+        <w:rPr>
+          <w:b/>
+          <w:bCs/>
+          <w:sz w:val="24"/>
+          <w:szCs w:val="24"/>
+        </w:rPr>
+        <w:t xml:space="preserve"> </w:t>
       </w:r>
       <w:proofErr w:type="spellStart"/>
       <w:r>
@@ -4797,7 +5596,7 @@
                 <w:bCs/>
                 <w:color w:val="1F3864"/>
               </w:rPr>
-              <w:t>10</w:t>
+              <w:t>12</w:t>
             </w:r>
           </w:p>
         </w:tc>
@@ -5072,7 +5871,7 @@
                 <w:bCs/>
                 <w:color w:val="1F3864"/>
               </w:rPr>
-              <w:t>11</w:t>
+              <w:t>13</w:t>
             </w:r>
           </w:p>
         </w:tc>
@@ -5310,7 +6109,7 @@
                 <w:bCs/>
                 <w:color w:val="1F3864"/>
               </w:rPr>
-              <w:t>12</w:t>
+              <w:t>14</w:t>
             </w:r>
           </w:p>
         </w:tc>
@@ -5704,7 +6503,7 @@
                 <w:bCs/>
                 <w:color w:val="1F3864"/>
               </w:rPr>
-              <w:t>13</w:t>
+              <w:t>15</w:t>
             </w:r>
           </w:p>
         </w:tc>
@@ -6038,6 +6837,339 @@
               <w:t>buộc</w:t>
             </w:r>
             <w:proofErr w:type="spellEnd"/>
+          </w:p>
+        </w:tc>
+      </w:tr>
+      <w:tr>
+        <w:tc>
+          <w:tcPr>
+            <w:tcW w:w="1100" w:type="dxa"/>
+            <w:tcMar>
+              <w:top w:w="100" w:type="dxa"/>
+              <w:left w:w="120" w:type="dxa"/>
+              <w:bottom w:w="100" w:type="dxa"/>
+              <w:right w:w="120" w:type="dxa"/>
+            </w:tcMar>
+          </w:tcPr>
+          <w:p>
+            <w:pPr>
+              <w:rPr>
+                <w:b/>
+                <w:bCs/>
+                <w:color w:val="1F3864"/>
+                <w:lang w:val="vi-VN"/>
+              </w:rPr>
+            </w:pPr>
+            <w:r>
+              <w:rPr>
+                <w:b/>
+                <w:bCs/>
+                <w:color w:val="1F3864"/>
+              </w:rPr>
+              <w:t>BR-</w:t>
+            </w:r>
+            <w:r>
+              <w:rPr>
+                <w:b/>
+                <w:bCs/>
+                <w:color w:val="1F3864"/>
+              </w:rPr>
+              <w:t>16</w:t>
+            </w:r>
+          </w:p>
+        </w:tc>
+        <w:tc>
+          <w:tcPr>
+            <w:tcW w:w="6300" w:type="dxa"/>
+            <w:tcMar>
+              <w:top w:w="100" w:type="dxa"/>
+              <w:left w:w="120" w:type="dxa"/>
+              <w:bottom w:w="100" w:type="dxa"/>
+              <w:right w:w="120" w:type="dxa"/>
+            </w:tcMar>
+          </w:tcPr>
+          <w:p>
+            <w:r>
+              <w:rPr>
+                <w:lang w:val="vi-VN"/>
+              </w:rPr>
+              <w:t xml:space="preserve">Sau khi Route Plan được LM Confirm, hệ thống tự động phân công nhân sự thực hiện. </w:t>
+            </w:r>
+            <w:proofErr w:type="spellStart"/>
+            <w:r>
+              <w:t>Mỗi</w:t>
+            </w:r>
+            <w:proofErr w:type="spellEnd"/>
+            <w:r>
+              <w:t xml:space="preserve"> ROAD Vehicle </w:t>
+            </w:r>
+            <w:proofErr w:type="spellStart"/>
+            <w:r>
+              <w:t>phải</w:t>
+            </w:r>
+            <w:proofErr w:type="spellEnd"/>
+            <w:r>
+              <w:t xml:space="preserve"> </w:t>
+            </w:r>
+            <w:proofErr w:type="spellStart"/>
+            <w:r>
+              <w:t>được</w:t>
+            </w:r>
+            <w:proofErr w:type="spellEnd"/>
+            <w:r>
+              <w:t xml:space="preserve"> </w:t>
+            </w:r>
+            <w:proofErr w:type="spellStart"/>
+            <w:r>
+              <w:t>phân</w:t>
+            </w:r>
+            <w:proofErr w:type="spellEnd"/>
+            <w:r>
+              <w:t xml:space="preserve"> </w:t>
+            </w:r>
+            <w:proofErr w:type="spellStart"/>
+            <w:r>
+              <w:t>công</w:t>
+            </w:r>
+            <w:proofErr w:type="spellEnd"/>
+            <w:r>
+              <w:t xml:space="preserve"> </w:t>
+            </w:r>
+            <w:proofErr w:type="spellStart"/>
+            <w:r>
+              <w:t>đúng</w:t>
+            </w:r>
+            <w:proofErr w:type="spellEnd"/>
+            <w:r>
+              <w:t xml:space="preserve"> 1 Driver </w:t>
+            </w:r>
+            <w:proofErr w:type="spellStart"/>
+            <w:r>
+              <w:t>và</w:t>
+            </w:r>
+            <w:proofErr w:type="spellEnd"/>
+            <w:r>
+              <w:t xml:space="preserve"> 1 </w:t>
+            </w:r>
+            <w:r>
+              <w:lastRenderedPageBreak/>
+              <w:t xml:space="preserve">Escort. </w:t>
+            </w:r>
+            <w:proofErr w:type="spellStart"/>
+            <w:r>
+              <w:t>Mỗi</w:t>
+            </w:r>
+            <w:proofErr w:type="spellEnd"/>
+            <w:r>
+              <w:t xml:space="preserve"> AIR </w:t>
+            </w:r>
+            <w:proofErr w:type="spellStart"/>
+            <w:r>
+              <w:t>RouteLeg</w:t>
+            </w:r>
+            <w:proofErr w:type="spellEnd"/>
+            <w:r>
+              <w:t xml:space="preserve"> </w:t>
+            </w:r>
+            <w:proofErr w:type="spellStart"/>
+            <w:r>
+              <w:t>phải</w:t>
+            </w:r>
+            <w:proofErr w:type="spellEnd"/>
+            <w:r>
+              <w:t xml:space="preserve"> </w:t>
+            </w:r>
+            <w:proofErr w:type="spellStart"/>
+            <w:r>
+              <w:t>được</w:t>
+            </w:r>
+            <w:proofErr w:type="spellEnd"/>
+            <w:r>
+              <w:t xml:space="preserve"> </w:t>
+            </w:r>
+            <w:proofErr w:type="spellStart"/>
+            <w:r>
+              <w:t>phân</w:t>
+            </w:r>
+            <w:proofErr w:type="spellEnd"/>
+            <w:r>
+              <w:t xml:space="preserve"> </w:t>
+            </w:r>
+            <w:proofErr w:type="spellStart"/>
+            <w:r>
+              <w:t>công</w:t>
+            </w:r>
+            <w:proofErr w:type="spellEnd"/>
+            <w:r>
+              <w:t xml:space="preserve"> </w:t>
+            </w:r>
+            <w:proofErr w:type="spellStart"/>
+            <w:r>
+              <w:t>đúng</w:t>
+            </w:r>
+            <w:proofErr w:type="spellEnd"/>
+            <w:r>
+              <w:t xml:space="preserve"> 1 Escort. </w:t>
+            </w:r>
+            <w:proofErr w:type="spellStart"/>
+            <w:r>
+              <w:t>Một</w:t>
+            </w:r>
+            <w:proofErr w:type="spellEnd"/>
+            <w:r>
+              <w:t xml:space="preserve"> </w:t>
+            </w:r>
+            <w:proofErr w:type="spellStart"/>
+            <w:r>
+              <w:t>RouteLeg</w:t>
+            </w:r>
+            <w:proofErr w:type="spellEnd"/>
+            <w:r>
+              <w:t xml:space="preserve"> </w:t>
+            </w:r>
+            <w:proofErr w:type="spellStart"/>
+            <w:r>
+              <w:t>có</w:t>
+            </w:r>
+            <w:proofErr w:type="spellEnd"/>
+            <w:r>
+              <w:t xml:space="preserve"> </w:t>
+            </w:r>
+            <w:proofErr w:type="spellStart"/>
+            <w:r>
+              <w:t>thể</w:t>
+            </w:r>
+            <w:proofErr w:type="spellEnd"/>
+            <w:r>
+              <w:t xml:space="preserve"> </w:t>
+            </w:r>
+            <w:proofErr w:type="spellStart"/>
+            <w:r>
+              <w:t>sử</w:t>
+            </w:r>
+            <w:proofErr w:type="spellEnd"/>
+            <w:r>
+              <w:t xml:space="preserve"> </w:t>
+            </w:r>
+            <w:proofErr w:type="spellStart"/>
+            <w:r>
+              <w:t>dụng</w:t>
+            </w:r>
+            <w:proofErr w:type="spellEnd"/>
+            <w:r>
+              <w:t xml:space="preserve"> </w:t>
+            </w:r>
+            <w:proofErr w:type="spellStart"/>
+            <w:r>
+              <w:t>các</w:t>
+            </w:r>
+            <w:proofErr w:type="spellEnd"/>
+            <w:r>
+              <w:t xml:space="preserve"> </w:t>
+            </w:r>
+            <w:proofErr w:type="spellStart"/>
+            <w:r>
+              <w:t>nhân</w:t>
+            </w:r>
+            <w:proofErr w:type="spellEnd"/>
+            <w:r>
+              <w:t xml:space="preserve"> </w:t>
+            </w:r>
+            <w:proofErr w:type="spellStart"/>
+            <w:r>
+              <w:t>sự</w:t>
+            </w:r>
+            <w:proofErr w:type="spellEnd"/>
+            <w:r>
+              <w:t xml:space="preserve"> </w:t>
+            </w:r>
+            <w:proofErr w:type="spellStart"/>
+            <w:r>
+              <w:t>khác</w:t>
+            </w:r>
+            <w:proofErr w:type="spellEnd"/>
+            <w:r>
+              <w:t xml:space="preserve"> </w:t>
+            </w:r>
+            <w:proofErr w:type="spellStart"/>
+            <w:r>
+              <w:t>nhau</w:t>
+            </w:r>
+            <w:proofErr w:type="spellEnd"/>
+            <w:r>
+              <w:t xml:space="preserve"> so </w:t>
+            </w:r>
+            <w:proofErr w:type="spellStart"/>
+            <w:r>
+              <w:t>với</w:t>
+            </w:r>
+            <w:proofErr w:type="spellEnd"/>
+            <w:r>
+              <w:t xml:space="preserve"> </w:t>
+            </w:r>
+            <w:proofErr w:type="spellStart"/>
+            <w:r>
+              <w:t>RouteLeg</w:t>
+            </w:r>
+            <w:proofErr w:type="spellEnd"/>
+            <w:r>
+              <w:t xml:space="preserve"> </w:t>
+            </w:r>
+            <w:proofErr w:type="spellStart"/>
+            <w:r>
+              <w:t>khác</w:t>
+            </w:r>
+            <w:proofErr w:type="spellEnd"/>
+            <w:r>
+              <w:t>.</w:t>
+            </w:r>
+          </w:p>
+        </w:tc>
+        <w:tc>
+          <w:tcPr>
+            <w:tcW w:w="1950" w:type="dxa"/>
+            <w:tcMar>
+              <w:top w:w="100" w:type="dxa"/>
+              <w:left w:w="120" w:type="dxa"/>
+              <w:bottom w:w="100" w:type="dxa"/>
+              <w:right w:w="120" w:type="dxa"/>
+            </w:tcMar>
+          </w:tcPr>
+          <w:p>
+            <w:pPr>
+              <w:rPr>
+                <w:i/>
+                <w:iCs/>
+                <w:color w:val="595959"/>
+                <w:sz w:val="18"/>
+                <w:szCs w:val="18"/>
+                <w:lang w:val="vi-VN"/>
+              </w:rPr>
+            </w:pPr>
+            <w:proofErr w:type="spellStart"/>
+            <w:r>
+              <w:rPr>
+                <w:i/>
+                <w:iCs/>
+                <w:color w:val="595959"/>
+                <w:sz w:val="18"/>
+                <w:szCs w:val="18"/>
+              </w:rPr>
+              <w:lastRenderedPageBreak/>
+              <w:t>Bắt</w:t>
+            </w:r>
+            <w:proofErr w:type="spellEnd"/>
+            <w:r>
+              <w:rPr>
+                <w:i/>
+                <w:iCs/>
+                <w:color w:val="595959"/>
+                <w:sz w:val="18"/>
+                <w:szCs w:val="18"/>
+                <w:lang w:val="vi-VN"/>
+              </w:rPr>
+              <w:t xml:space="preserve"> buộc</w:t>
+            </w:r>
           </w:p>
         </w:tc>
       </w:tr>
@@ -6290,7 +7422,6 @@
         <w:tc>
           <w:tcPr>
             <w:tcW w:w="1100" w:type="dxa"/>
-            <w:shd w:val="clear" w:color="auto" w:fill="F2F6FB"/>
             <w:tcMar>
               <w:top w:w="100" w:type="dxa"/>
               <w:left w:w="120" w:type="dxa"/>
@@ -6318,14 +7449,13 @@
                 <w:bCs/>
                 <w:color w:val="1F3864"/>
               </w:rPr>
-              <w:t>14</w:t>
+              <w:t>17</w:t>
             </w:r>
           </w:p>
         </w:tc>
         <w:tc>
           <w:tcPr>
             <w:tcW w:w="6300" w:type="dxa"/>
-            <w:shd w:val="clear" w:color="auto" w:fill="F2F6FB"/>
             <w:tcMar>
               <w:top w:w="100" w:type="dxa"/>
               <w:left w:w="120" w:type="dxa"/>
@@ -6376,99 +7506,98 @@
             </w:r>
             <w:proofErr w:type="spellStart"/>
             <w:r>
+              <w:t>được</w:t>
+            </w:r>
+            <w:proofErr w:type="spellEnd"/>
+            <w:r>
+              <w:t xml:space="preserve"> </w:t>
+            </w:r>
+            <w:proofErr w:type="spellStart"/>
+            <w:r>
+              <w:t>phân</w:t>
+            </w:r>
+            <w:proofErr w:type="spellEnd"/>
+            <w:r>
+              <w:t xml:space="preserve"> </w:t>
+            </w:r>
+            <w:proofErr w:type="spellStart"/>
+            <w:r>
+              <w:t>công</w:t>
+            </w:r>
+            <w:proofErr w:type="spellEnd"/>
+            <w:r>
+              <w:t xml:space="preserve"> ở </w:t>
+            </w:r>
+            <w:proofErr w:type="spellStart"/>
+            <w:r>
+              <w:t>cấp</w:t>
+            </w:r>
+            <w:proofErr w:type="spellEnd"/>
+            <w:r>
+              <w:t xml:space="preserve"> Order. </w:t>
+            </w:r>
+            <w:proofErr w:type="spellStart"/>
+            <w:r>
+              <w:t>Mỗi</w:t>
+            </w:r>
+            <w:proofErr w:type="spellEnd"/>
+            <w:r>
+              <w:t xml:space="preserve"> ROAD </w:t>
+            </w:r>
+            <w:proofErr w:type="spellStart"/>
+            <w:r>
+              <w:t>RouteLeg</w:t>
+            </w:r>
+            <w:proofErr w:type="spellEnd"/>
+            <w:r>
+              <w:t xml:space="preserve"> </w:t>
+            </w:r>
+            <w:proofErr w:type="spellStart"/>
+            <w:r>
+              <w:t>phải</w:t>
+            </w:r>
+            <w:proofErr w:type="spellEnd"/>
+            <w:r>
+              <w:t xml:space="preserve"> </w:t>
+            </w:r>
+            <w:proofErr w:type="spellStart"/>
+            <w:r>
+              <w:t>có</w:t>
+            </w:r>
+            <w:proofErr w:type="spellEnd"/>
+            <w:r>
+              <w:t xml:space="preserve"> </w:t>
+            </w:r>
+            <w:proofErr w:type="spellStart"/>
+            <w:r>
+              <w:t>thể</w:t>
+            </w:r>
+            <w:proofErr w:type="spellEnd"/>
+            <w:r>
+              <w:rPr>
+                <w:lang w:val="vi-VN"/>
+              </w:rPr>
+              <w:t xml:space="preserve"> có nhiều </w:t>
+            </w:r>
+            <w:r>
+              <w:t xml:space="preserve">Driver </w:t>
+            </w:r>
+            <w:proofErr w:type="spellStart"/>
+            <w:r>
               <w:t>và</w:t>
             </w:r>
             <w:proofErr w:type="spellEnd"/>
             <w:r>
-              <w:t xml:space="preserve"> </w:t>
-            </w:r>
-            <w:proofErr w:type="spellStart"/>
-            <w:r>
-              <w:t>đúng</w:t>
-            </w:r>
-            <w:proofErr w:type="spellEnd"/>
-            <w:r>
-              <w:t xml:space="preserve"> 1 Escort </w:t>
-            </w:r>
-            <w:proofErr w:type="spellStart"/>
-            <w:r>
-              <w:t>được</w:t>
-            </w:r>
-            <w:proofErr w:type="spellEnd"/>
-            <w:r>
-              <w:t xml:space="preserve"> </w:t>
-            </w:r>
-            <w:proofErr w:type="spellStart"/>
-            <w:r>
-              <w:t>phân</w:t>
-            </w:r>
-            <w:proofErr w:type="spellEnd"/>
-            <w:r>
-              <w:t xml:space="preserve"> </w:t>
-            </w:r>
-            <w:proofErr w:type="spellStart"/>
-            <w:r>
-              <w:t>công</w:t>
-            </w:r>
-            <w:proofErr w:type="spellEnd"/>
-            <w:r>
-              <w:t xml:space="preserve"> ở </w:t>
-            </w:r>
-            <w:proofErr w:type="spellStart"/>
-            <w:r>
-              <w:t>cấp</w:t>
-            </w:r>
-            <w:proofErr w:type="spellEnd"/>
-            <w:r>
-              <w:t xml:space="preserve"> Order. </w:t>
-            </w:r>
-            <w:proofErr w:type="spellStart"/>
-            <w:r>
-              <w:t>Mỗi</w:t>
-            </w:r>
-            <w:proofErr w:type="spellEnd"/>
-            <w:r>
-              <w:t xml:space="preserve"> ROAD </w:t>
-            </w:r>
-            <w:proofErr w:type="spellStart"/>
-            <w:r>
-              <w:t>RouteLeg</w:t>
-            </w:r>
-            <w:proofErr w:type="spellEnd"/>
-            <w:r>
-              <w:t xml:space="preserve"> </w:t>
-            </w:r>
-            <w:proofErr w:type="spellStart"/>
-            <w:r>
-              <w:t>phải</w:t>
-            </w:r>
-            <w:proofErr w:type="spellEnd"/>
-            <w:r>
-              <w:t xml:space="preserve"> </w:t>
-            </w:r>
-            <w:proofErr w:type="spellStart"/>
-            <w:r>
-              <w:t>có</w:t>
-            </w:r>
-            <w:proofErr w:type="spellEnd"/>
-            <w:r>
-              <w:t xml:space="preserve"> </w:t>
-            </w:r>
-            <w:proofErr w:type="spellStart"/>
-            <w:r>
-              <w:t>ít</w:t>
-            </w:r>
-            <w:proofErr w:type="spellEnd"/>
-            <w:r>
-              <w:t xml:space="preserve"> </w:t>
-            </w:r>
-            <w:proofErr w:type="spellStart"/>
-            <w:r>
-              <w:t>nhất</w:t>
-            </w:r>
-            <w:proofErr w:type="spellEnd"/>
-            <w:r>
-              <w:t xml:space="preserve"> 1 Driver </w:t>
+              <w:rPr>
+                <w:lang w:val="vi-VN"/>
+              </w:rPr>
+              <w:t xml:space="preserve"> </w:t>
+            </w:r>
+            <w:r>
+              <w:rPr>
+                <w:lang w:val="vi-VN"/>
+              </w:rPr>
+              <w:t xml:space="preserve">Escoct </w:t>
             </w:r>
             <w:proofErr w:type="spellStart"/>
             <w:r>
@@ -6531,7 +7660,6 @@
         <w:tc>
           <w:tcPr>
             <w:tcW w:w="1950" w:type="dxa"/>
-            <w:shd w:val="clear" w:color="auto" w:fill="F2F6FB"/>
             <w:tcMar>
               <w:top w:w="100" w:type="dxa"/>
               <w:left w:w="120" w:type="dxa"/>
@@ -6609,7 +7737,7 @@
                 <w:bCs/>
                 <w:color w:val="1F3864"/>
               </w:rPr>
-              <w:t>15</w:t>
+              <w:t>18</w:t>
             </w:r>
           </w:p>
         </w:tc>
@@ -6975,174 +8103,6 @@
                 <w:szCs w:val="18"/>
               </w:rPr>
               <w:t>nhận</w:t>
-            </w:r>
-            <w:proofErr w:type="spellEnd"/>
-          </w:p>
-        </w:tc>
-      </w:tr>
-      <w:tr>
-        <w:tc>
-          <w:tcPr>
-            <w:tcW w:w="1100" w:type="dxa"/>
-            <w:shd w:val="clear" w:color="auto" w:fill="F2F6FB"/>
-            <w:tcMar>
-              <w:top w:w="100" w:type="dxa"/>
-              <w:left w:w="120" w:type="dxa"/>
-              <w:bottom w:w="100" w:type="dxa"/>
-              <w:right w:w="120" w:type="dxa"/>
-            </w:tcMar>
-          </w:tcPr>
-          <w:p>
-            <w:pPr>
-              <w:rPr>
-                <w:lang w:val="vi-VN"/>
-              </w:rPr>
-            </w:pPr>
-            <w:r>
-              <w:rPr>
-                <w:b/>
-                <w:bCs/>
-                <w:color w:val="1F3864"/>
-              </w:rPr>
-              <w:t>BR-</w:t>
-            </w:r>
-            <w:r>
-              <w:rPr>
-                <w:b/>
-                <w:bCs/>
-                <w:color w:val="1F3864"/>
-              </w:rPr>
-              <w:t>16</w:t>
-            </w:r>
-          </w:p>
-        </w:tc>
-        <w:tc>
-          <w:tcPr>
-            <w:tcW w:w="6300" w:type="dxa"/>
-            <w:shd w:val="clear" w:color="auto" w:fill="F2F6FB"/>
-            <w:tcMar>
-              <w:top w:w="100" w:type="dxa"/>
-              <w:left w:w="120" w:type="dxa"/>
-              <w:bottom w:w="100" w:type="dxa"/>
-              <w:right w:w="120" w:type="dxa"/>
-            </w:tcMar>
-          </w:tcPr>
-          <w:p>
-            <w:r>
-              <w:t>Không áp dụng trong MVP. Quy tắc legacy này đã được loại khỏi phạm vi MVP.</w:t>
-            </w:r>
-            <w:proofErr w:type="spellStart"/>
-            <w:r/>
-            <w:proofErr w:type="spellEnd"/>
-            <w:r/>
-            <w:proofErr w:type="spellStart"/>
-            <w:r/>
-            <w:proofErr w:type="spellEnd"/>
-            <w:r/>
-            <w:proofErr w:type="spellStart"/>
-            <w:r/>
-            <w:proofErr w:type="spellEnd"/>
-            <w:r/>
-            <w:proofErr w:type="spellStart"/>
-            <w:r/>
-            <w:proofErr w:type="spellEnd"/>
-            <w:r/>
-            <w:proofErr w:type="spellStart"/>
-            <w:r/>
-            <w:proofErr w:type="spellEnd"/>
-            <w:r/>
-            <w:proofErr w:type="spellStart"/>
-            <w:r/>
-            <w:proofErr w:type="spellEnd"/>
-            <w:r/>
-            <w:proofErr w:type="spellStart"/>
-            <w:r/>
-            <w:proofErr w:type="spellEnd"/>
-            <w:r/>
-            <w:proofErr w:type="spellStart"/>
-            <w:r/>
-            <w:proofErr w:type="spellEnd"/>
-            <w:r/>
-            <w:proofErr w:type="spellStart"/>
-            <w:r/>
-            <w:proofErr w:type="spellEnd"/>
-            <w:r/>
-            <w:proofErr w:type="spellStart"/>
-            <w:r/>
-            <w:proofErr w:type="spellEnd"/>
-            <w:r/>
-            <w:proofErr w:type="spellStart"/>
-            <w:r/>
-            <w:proofErr w:type="spellEnd"/>
-            <w:r/>
-            <w:proofErr w:type="spellStart"/>
-            <w:r/>
-            <w:proofErr w:type="spellEnd"/>
-            <w:r/>
-            <w:proofErr w:type="spellStart"/>
-            <w:r/>
-            <w:proofErr w:type="spellEnd"/>
-            <w:r/>
-            <w:proofErr w:type="spellStart"/>
-            <w:r/>
-            <w:proofErr w:type="spellEnd"/>
-            <w:r/>
-            <w:proofErr w:type="spellStart"/>
-            <w:r/>
-            <w:proofErr w:type="spellEnd"/>
-            <w:r/>
-            <w:proofErr w:type="spellStart"/>
-            <w:r/>
-            <w:proofErr w:type="spellEnd"/>
-            <w:r/>
-            <w:proofErr w:type="spellStart"/>
-            <w:r/>
-            <w:proofErr w:type="spellEnd"/>
-            <w:r/>
-          </w:p>
-        </w:tc>
-        <w:tc>
-          <w:tcPr>
-            <w:tcW w:w="1950" w:type="dxa"/>
-            <w:shd w:val="clear" w:color="auto" w:fill="F2F6FB"/>
-            <w:tcMar>
-              <w:top w:w="100" w:type="dxa"/>
-              <w:left w:w="120" w:type="dxa"/>
-              <w:bottom w:w="100" w:type="dxa"/>
-              <w:right w:w="120" w:type="dxa"/>
-            </w:tcMar>
-          </w:tcPr>
-          <w:p>
-            <w:proofErr w:type="spellStart"/>
-            <w:r>
-              <w:rPr>
-                <w:i/>
-                <w:iCs/>
-                <w:color w:val="595959"/>
-                <w:sz w:val="18"/>
-                <w:szCs w:val="18"/>
-              </w:rPr>
-              <w:t>Ngoài phạm vi MVP</w:t>
-            </w:r>
-            <w:proofErr w:type="spellEnd"/>
-            <w:r>
-              <w:rPr>
-                <w:i/>
-                <w:iCs/>
-                <w:color w:val="595959"/>
-                <w:sz w:val="18"/>
-                <w:szCs w:val="18"/>
-              </w:rPr>
-            </w:r>
-            <w:proofErr w:type="spellStart"/>
-            <w:r>
-              <w:rPr>
-                <w:i/>
-                <w:iCs/>
-                <w:color w:val="595959"/>
-                <w:sz w:val="18"/>
-                <w:szCs w:val="18"/>
-              </w:rPr>
             </w:r>
             <w:proofErr w:type="spellEnd"/>
           </w:p>
@@ -7398,7 +8358,7 @@
                 <w:bCs/>
                 <w:color w:val="1F3864"/>
               </w:rPr>
-              <w:t>17</w:t>
+              <w:t>20</w:t>
             </w:r>
           </w:p>
         </w:tc>
@@ -7689,7 +8649,7 @@
                 <w:bCs/>
                 <w:color w:val="1F3864"/>
               </w:rPr>
-              <w:t>18</w:t>
+              <w:t>21</w:t>
             </w:r>
           </w:p>
         </w:tc>
@@ -8218,7 +9178,7 @@
                 <w:bCs/>
                 <w:color w:val="1F3864"/>
               </w:rPr>
-              <w:t>19</w:t>
+              <w:t>22</w:t>
             </w:r>
           </w:p>
         </w:tc>
@@ -8249,7 +9209,7 @@
               <w:rPr>
                 <w:lang w:val="vi-VN"/>
               </w:rPr>
-              <w:t xml:space="preserve"> entity gồm TransportOrder, TransportOrderHorse, HorseDocumentVersion, RouteLeg và Quotation phải tạo một StatusAuditLog chứa trạng thái trước, trạng thái sau, người thực hiện, thời gian và lý do nếu có. </w:t>
+              <w:t xml:space="preserve"> entity gồm TransportOrder, TransportOrderHorse, HorseDocumentVersion, RouteLeg, Quotation và phải tạo một StatusAuditLog chứa trạng thái trước, trạng thái sau, người thực hiện, thời gian và lý do nếu có. </w:t>
             </w:r>
             <w:r>
               <w:t xml:space="preserve">Audit log </w:t>

</xml_diff>

<commit_message>
docs: consolidate Sprint 2 business rules
</commit_message>
<xml_diff>
--- a/docs/business-rules/Business_Rules.docx
+++ b/docs/business-rules/Business_Rules.docx
@@ -304,53 +304,13 @@
           <w:iCs/>
           <w:color w:val="595959"/>
         </w:rPr>
-        <w:t>Ngày</w:t>
-      </w:r>
-      <w:proofErr w:type="spellEnd"/>
-      <w:r>
-        <w:rPr>
-          <w:i/>
-          <w:iCs/>
-          <w:color w:val="595959"/>
-        </w:rPr>
-        <w:t xml:space="preserve"> </w:t>
-      </w:r>
-      <w:proofErr w:type="spellStart"/>
-      <w:r>
-        <w:rPr>
-          <w:i/>
-          <w:iCs/>
-          <w:color w:val="595959"/>
-        </w:rPr>
-        <w:t>cập</w:t>
-      </w:r>
-      <w:proofErr w:type="spellEnd"/>
-      <w:r>
-        <w:rPr>
-          <w:i/>
-          <w:iCs/>
-          <w:color w:val="595959"/>
-        </w:rPr>
-        <w:t xml:space="preserve"> </w:t>
-      </w:r>
-      <w:proofErr w:type="spellStart"/>
-      <w:r>
-        <w:rPr>
-          <w:i/>
-          <w:iCs/>
-          <w:color w:val="595959"/>
-        </w:rPr>
-        <w:t>nhật</w:t>
-      </w:r>
-      <w:proofErr w:type="spellEnd"/>
-      <w:r>
-        <w:rPr>
-          <w:i/>
-          <w:iCs/>
-          <w:color w:val="595959"/>
-        </w:rPr>
-        <w:t>: 12/09/2026</w:t>
-      </w:r>
+        <w:t>Ngày cập nhật: 02/10/2026</w:t>
+      </w:r>
+      <w:proofErr w:type="spellEnd"/>
+      <w:proofErr w:type="spellStart"/>
+      <w:proofErr w:type="spellEnd"/>
+      <w:proofErr w:type="spellStart"/>
+      <w:proofErr w:type="spellEnd"/>
     </w:p>
     <w:p>
       <w:pPr>
@@ -1933,432 +1893,114 @@
           <w:p>
             <w:proofErr w:type="spellStart"/>
             <w:r>
-              <w:t>Đơn</w:t>
-            </w:r>
-            <w:proofErr w:type="spellEnd"/>
-            <w:r>
-              <w:t xml:space="preserve"> </w:t>
-            </w:r>
-            <w:proofErr w:type="spellStart"/>
-            <w:r>
-              <w:t>hàng</w:t>
-            </w:r>
-            <w:proofErr w:type="spellEnd"/>
-            <w:r>
-              <w:t xml:space="preserve"> </w:t>
-            </w:r>
-            <w:proofErr w:type="spellStart"/>
-            <w:r>
-              <w:t>chỉ</w:t>
-            </w:r>
-            <w:proofErr w:type="spellEnd"/>
-            <w:r>
-              <w:t xml:space="preserve"> </w:t>
-            </w:r>
-            <w:proofErr w:type="spellStart"/>
-            <w:r>
-              <w:t>được</w:t>
-            </w:r>
-            <w:proofErr w:type="spellEnd"/>
-            <w:r>
-              <w:t xml:space="preserve"> </w:t>
-            </w:r>
-            <w:proofErr w:type="spellStart"/>
-            <w:r>
-              <w:t>chuyển</w:t>
-            </w:r>
-            <w:proofErr w:type="spellEnd"/>
-            <w:r>
-              <w:t xml:space="preserve"> sang </w:t>
-            </w:r>
-            <w:proofErr w:type="spellStart"/>
-            <w:r>
-              <w:t>trạng</w:t>
-            </w:r>
-            <w:proofErr w:type="spellEnd"/>
-            <w:r>
-              <w:t xml:space="preserve"> </w:t>
-            </w:r>
-            <w:proofErr w:type="spellStart"/>
-            <w:r>
-              <w:t>thái</w:t>
-            </w:r>
-            <w:proofErr w:type="spellEnd"/>
-            <w:r>
-              <w:t xml:space="preserve"> APPROVED </w:t>
-            </w:r>
-            <w:proofErr w:type="spellStart"/>
-            <w:r>
-              <w:t>khi</w:t>
-            </w:r>
-            <w:proofErr w:type="spellEnd"/>
-            <w:r>
-              <w:t xml:space="preserve"> Customer </w:t>
-            </w:r>
-            <w:proofErr w:type="spellStart"/>
-            <w:r>
-              <w:t>thanh</w:t>
-            </w:r>
-            <w:proofErr w:type="spellEnd"/>
-            <w:r>
-              <w:t xml:space="preserve"> </w:t>
-            </w:r>
-            <w:proofErr w:type="spellStart"/>
-            <w:r>
-              <w:t>toán</w:t>
-            </w:r>
-            <w:proofErr w:type="spellEnd"/>
-            <w:r>
-              <w:t xml:space="preserve"> Deposit </w:t>
-            </w:r>
-            <w:proofErr w:type="spellStart"/>
-            <w:r>
-              <w:t>thành</w:t>
-            </w:r>
-            <w:proofErr w:type="spellEnd"/>
-            <w:r>
-              <w:t xml:space="preserve"> </w:t>
-            </w:r>
-            <w:proofErr w:type="spellStart"/>
-            <w:r>
-              <w:t>công</w:t>
-            </w:r>
-            <w:proofErr w:type="spellEnd"/>
-            <w:r>
-              <w:t xml:space="preserve"> </w:t>
-            </w:r>
-            <w:proofErr w:type="spellStart"/>
-            <w:r>
-              <w:t>thông</w:t>
-            </w:r>
-            <w:proofErr w:type="spellEnd"/>
-            <w:r>
-              <w:t xml:space="preserve"> qua Stripe </w:t>
-            </w:r>
-            <w:proofErr w:type="spellStart"/>
-            <w:r>
-              <w:t>cho</w:t>
-            </w:r>
-            <w:proofErr w:type="spellEnd"/>
-            <w:r>
-              <w:t xml:space="preserve"> quotation </w:t>
-            </w:r>
-            <w:proofErr w:type="spellStart"/>
-            <w:r>
-              <w:t>đã</w:t>
-            </w:r>
-            <w:proofErr w:type="spellEnd"/>
-            <w:r>
-              <w:t xml:space="preserve"> </w:t>
-            </w:r>
-            <w:proofErr w:type="spellStart"/>
-            <w:r>
-              <w:t>được</w:t>
-            </w:r>
-            <w:proofErr w:type="spellEnd"/>
-            <w:r>
-              <w:t xml:space="preserve"> </w:t>
-            </w:r>
-            <w:proofErr w:type="spellStart"/>
-            <w:r>
-              <w:t>gửi</w:t>
-            </w:r>
-            <w:proofErr w:type="spellEnd"/>
-            <w:r>
-              <w:t xml:space="preserve"> </w:t>
-            </w:r>
-            <w:proofErr w:type="spellStart"/>
-            <w:r>
-              <w:t>và</w:t>
-            </w:r>
-            <w:proofErr w:type="spellEnd"/>
-            <w:r>
-              <w:t xml:space="preserve"> </w:t>
-            </w:r>
-            <w:proofErr w:type="spellStart"/>
-            <w:r>
-              <w:t>khóa</w:t>
-            </w:r>
-            <w:proofErr w:type="spellEnd"/>
-            <w:r>
-              <w:t xml:space="preserve">. </w:t>
-            </w:r>
-            <w:proofErr w:type="spellStart"/>
-            <w:r>
-              <w:t>Hệ</w:t>
-            </w:r>
-            <w:proofErr w:type="spellEnd"/>
-            <w:r>
-              <w:t xml:space="preserve"> </w:t>
-            </w:r>
-            <w:proofErr w:type="spellStart"/>
-            <w:r>
-              <w:t>thống</w:t>
-            </w:r>
-            <w:proofErr w:type="spellEnd"/>
-            <w:r>
-              <w:t xml:space="preserve"> </w:t>
-            </w:r>
-            <w:proofErr w:type="spellStart"/>
-            <w:r>
-              <w:t>tự</w:t>
-            </w:r>
-            <w:proofErr w:type="spellEnd"/>
-            <w:r>
-              <w:t xml:space="preserve"> </w:t>
-            </w:r>
-            <w:proofErr w:type="spellStart"/>
-            <w:r>
-              <w:t>động</w:t>
-            </w:r>
-            <w:proofErr w:type="spellEnd"/>
-            <w:r>
-              <w:t xml:space="preserve"> </w:t>
-            </w:r>
-            <w:proofErr w:type="spellStart"/>
-            <w:r>
-              <w:t>chuyển</w:t>
-            </w:r>
-            <w:proofErr w:type="spellEnd"/>
-            <w:r>
-              <w:t xml:space="preserve"> </w:t>
-            </w:r>
-            <w:proofErr w:type="spellStart"/>
-            <w:r>
-              <w:t>đơn</w:t>
-            </w:r>
-            <w:proofErr w:type="spellEnd"/>
-            <w:r>
-              <w:t xml:space="preserve"> </w:t>
-            </w:r>
-            <w:proofErr w:type="spellStart"/>
-            <w:r>
-              <w:t>hàng</w:t>
-            </w:r>
-            <w:proofErr w:type="spellEnd"/>
-            <w:r>
-              <w:t xml:space="preserve"> sang APPROVED </w:t>
-            </w:r>
-            <w:proofErr w:type="spellStart"/>
-            <w:r>
-              <w:t>sau</w:t>
-            </w:r>
-            <w:proofErr w:type="spellEnd"/>
-            <w:r>
-              <w:t xml:space="preserve"> </w:t>
-            </w:r>
-            <w:proofErr w:type="spellStart"/>
-            <w:r>
-              <w:t>khi</w:t>
-            </w:r>
-            <w:proofErr w:type="spellEnd"/>
-            <w:r>
-              <w:t xml:space="preserve"> </w:t>
-            </w:r>
-            <w:proofErr w:type="spellStart"/>
-            <w:r>
-              <w:t>nhận</w:t>
-            </w:r>
-            <w:proofErr w:type="spellEnd"/>
-            <w:r>
-              <w:t xml:space="preserve"> </w:t>
-            </w:r>
-            <w:proofErr w:type="spellStart"/>
-            <w:r>
-              <w:t>được</w:t>
-            </w:r>
-            <w:proofErr w:type="spellEnd"/>
-            <w:r>
-              <w:t xml:space="preserve"> </w:t>
-            </w:r>
-            <w:proofErr w:type="spellStart"/>
-            <w:r>
-              <w:t>xác</w:t>
-            </w:r>
-            <w:proofErr w:type="spellEnd"/>
-            <w:r>
-              <w:t xml:space="preserve"> </w:t>
-            </w:r>
-            <w:proofErr w:type="spellStart"/>
-            <w:r>
-              <w:t>nhận</w:t>
-            </w:r>
-            <w:proofErr w:type="spellEnd"/>
-            <w:r>
-              <w:t xml:space="preserve"> </w:t>
-            </w:r>
-            <w:proofErr w:type="spellStart"/>
-            <w:r>
-              <w:t>thanh</w:t>
-            </w:r>
-            <w:proofErr w:type="spellEnd"/>
-            <w:r>
-              <w:t xml:space="preserve"> </w:t>
-            </w:r>
-            <w:proofErr w:type="spellStart"/>
-            <w:r>
-              <w:t>toán</w:t>
-            </w:r>
-            <w:proofErr w:type="spellEnd"/>
-            <w:r>
-              <w:t xml:space="preserve"> </w:t>
-            </w:r>
-            <w:proofErr w:type="spellStart"/>
-            <w:r>
-              <w:t>thành</w:t>
-            </w:r>
-            <w:proofErr w:type="spellEnd"/>
-            <w:r>
-              <w:t xml:space="preserve"> </w:t>
-            </w:r>
-            <w:proofErr w:type="spellStart"/>
-            <w:r>
-              <w:t>công</w:t>
-            </w:r>
-            <w:proofErr w:type="spellEnd"/>
-            <w:r>
-              <w:t xml:space="preserve"> </w:t>
-            </w:r>
-            <w:proofErr w:type="spellStart"/>
-            <w:r>
-              <w:t>từ</w:t>
-            </w:r>
-            <w:proofErr w:type="spellEnd"/>
-            <w:r>
-              <w:t xml:space="preserve"> Stripe. </w:t>
-            </w:r>
-            <w:proofErr w:type="spellStart"/>
-            <w:r>
-              <w:t>Không</w:t>
-            </w:r>
-            <w:proofErr w:type="spellEnd"/>
-            <w:r>
-              <w:t xml:space="preserve"> </w:t>
-            </w:r>
-            <w:proofErr w:type="spellStart"/>
-            <w:r>
-              <w:t>yêu</w:t>
-            </w:r>
-            <w:proofErr w:type="spellEnd"/>
-            <w:r>
-              <w:t xml:space="preserve"> </w:t>
-            </w:r>
-            <w:proofErr w:type="spellStart"/>
-            <w:r>
-              <w:t>cầu</w:t>
-            </w:r>
-            <w:proofErr w:type="spellEnd"/>
-            <w:r>
-              <w:t xml:space="preserve"> Customer </w:t>
-            </w:r>
-            <w:proofErr w:type="spellStart"/>
-            <w:r>
-              <w:t>thực</w:t>
-            </w:r>
-            <w:proofErr w:type="spellEnd"/>
-            <w:r>
-              <w:t xml:space="preserve"> </w:t>
-            </w:r>
-            <w:proofErr w:type="spellStart"/>
-            <w:r>
-              <w:t>hiện</w:t>
-            </w:r>
-            <w:proofErr w:type="spellEnd"/>
-            <w:r>
-              <w:t xml:space="preserve"> </w:t>
-            </w:r>
-            <w:proofErr w:type="spellStart"/>
-            <w:r>
-              <w:t>thao</w:t>
-            </w:r>
-            <w:proofErr w:type="spellEnd"/>
-            <w:r>
-              <w:t xml:space="preserve"> </w:t>
-            </w:r>
-            <w:proofErr w:type="spellStart"/>
-            <w:r>
-              <w:t>tác</w:t>
-            </w:r>
-            <w:proofErr w:type="spellEnd"/>
-            <w:r>
-              <w:t xml:space="preserve"> ACCEPT quotation </w:t>
-            </w:r>
-            <w:proofErr w:type="spellStart"/>
-            <w:r>
-              <w:t>riêng</w:t>
-            </w:r>
-            <w:proofErr w:type="spellEnd"/>
-            <w:r>
-              <w:t xml:space="preserve"> </w:t>
-            </w:r>
-            <w:proofErr w:type="spellStart"/>
-            <w:r>
-              <w:t>và</w:t>
-            </w:r>
-            <w:proofErr w:type="spellEnd"/>
-            <w:r>
-              <w:t xml:space="preserve"> </w:t>
-            </w:r>
-            <w:proofErr w:type="spellStart"/>
-            <w:r>
-              <w:t>không</w:t>
-            </w:r>
-            <w:proofErr w:type="spellEnd"/>
-            <w:r>
-              <w:t xml:space="preserve"> </w:t>
-            </w:r>
-            <w:proofErr w:type="spellStart"/>
-            <w:r>
-              <w:t>yêu</w:t>
-            </w:r>
-            <w:proofErr w:type="spellEnd"/>
-            <w:r>
-              <w:t xml:space="preserve"> </w:t>
-            </w:r>
-            <w:proofErr w:type="spellStart"/>
-            <w:r>
-              <w:t>cầu</w:t>
-            </w:r>
-            <w:proofErr w:type="spellEnd"/>
-            <w:r>
-              <w:t xml:space="preserve"> LM </w:t>
-            </w:r>
-            <w:proofErr w:type="spellStart"/>
-            <w:r>
-              <w:t>phê</w:t>
-            </w:r>
-            <w:proofErr w:type="spellEnd"/>
-            <w:r>
-              <w:t xml:space="preserve"> </w:t>
-            </w:r>
-            <w:proofErr w:type="spellStart"/>
-            <w:r>
-              <w:t>duyệt</w:t>
-            </w:r>
-            <w:proofErr w:type="spellEnd"/>
-            <w:r>
-              <w:t xml:space="preserve"> </w:t>
-            </w:r>
-            <w:proofErr w:type="spellStart"/>
-            <w:r>
-              <w:t>thủ</w:t>
-            </w:r>
-            <w:proofErr w:type="spellEnd"/>
-            <w:r>
-              <w:t xml:space="preserve"> </w:t>
-            </w:r>
+              <w:t>Đơn hàng chỉ được chuyển sang trạng thái APPROVED khi Customer thanh toán Deposit thành công thông qua Stripe cho quotation đã được gửi và khóa. Hệ thống tự động chuyển đơn hàng sang APPROVED sau khi nhận signed Stripe webhook xác nhận thanh toán thành công. Không yêu cầu Customer thực hiện thao tác ACCEPT quotation riêng và không yêu cầu LM phê duyệt thủ công.</w:t>
+            </w:r>
+            <w:proofErr w:type="spellEnd"/>
+            <w:proofErr w:type="spellStart"/>
+            <w:proofErr w:type="spellEnd"/>
+            <w:proofErr w:type="spellStart"/>
+            <w:proofErr w:type="spellEnd"/>
+            <w:proofErr w:type="spellStart"/>
+            <w:proofErr w:type="spellEnd"/>
+            <w:proofErr w:type="spellStart"/>
+            <w:proofErr w:type="spellEnd"/>
+            <w:proofErr w:type="spellStart"/>
+            <w:proofErr w:type="spellEnd"/>
+            <w:proofErr w:type="spellStart"/>
+            <w:proofErr w:type="spellEnd"/>
+            <w:proofErr w:type="spellStart"/>
+            <w:proofErr w:type="spellEnd"/>
+            <w:proofErr w:type="spellStart"/>
+            <w:proofErr w:type="spellEnd"/>
+            <w:proofErr w:type="spellStart"/>
+            <w:proofErr w:type="spellEnd"/>
+            <w:proofErr w:type="spellStart"/>
+            <w:proofErr w:type="spellEnd"/>
+            <w:proofErr w:type="spellStart"/>
+            <w:proofErr w:type="spellEnd"/>
+            <w:proofErr w:type="spellStart"/>
+            <w:proofErr w:type="spellEnd"/>
+            <w:proofErr w:type="spellStart"/>
+            <w:proofErr w:type="spellEnd"/>
+            <w:proofErr w:type="spellStart"/>
+            <w:proofErr w:type="spellEnd"/>
+            <w:proofErr w:type="spellStart"/>
+            <w:proofErr w:type="spellEnd"/>
+            <w:proofErr w:type="spellStart"/>
+            <w:proofErr w:type="spellEnd"/>
+            <w:proofErr w:type="spellStart"/>
+            <w:proofErr w:type="spellEnd"/>
+            <w:proofErr w:type="spellStart"/>
+            <w:proofErr w:type="spellEnd"/>
+            <w:proofErr w:type="spellStart"/>
+            <w:proofErr w:type="spellEnd"/>
+            <w:proofErr w:type="spellStart"/>
+            <w:proofErr w:type="spellEnd"/>
+            <w:proofErr w:type="spellStart"/>
+            <w:proofErr w:type="spellEnd"/>
+            <w:proofErr w:type="spellStart"/>
+            <w:proofErr w:type="spellEnd"/>
+            <w:proofErr w:type="spellStart"/>
+            <w:proofErr w:type="spellEnd"/>
+            <w:proofErr w:type="spellStart"/>
+            <w:proofErr w:type="spellEnd"/>
+            <w:proofErr w:type="spellStart"/>
+            <w:proofErr w:type="spellEnd"/>
+            <w:proofErr w:type="spellStart"/>
+            <w:proofErr w:type="spellEnd"/>
+            <w:proofErr w:type="spellStart"/>
+            <w:proofErr w:type="spellEnd"/>
+            <w:proofErr w:type="spellStart"/>
+            <w:proofErr w:type="spellEnd"/>
+            <w:proofErr w:type="spellStart"/>
+            <w:proofErr w:type="spellEnd"/>
+            <w:proofErr w:type="spellStart"/>
+            <w:proofErr w:type="spellEnd"/>
+            <w:proofErr w:type="spellStart"/>
+            <w:proofErr w:type="spellEnd"/>
+            <w:proofErr w:type="spellStart"/>
+            <w:proofErr w:type="spellEnd"/>
+            <w:proofErr w:type="spellStart"/>
+            <w:proofErr w:type="spellEnd"/>
+            <w:proofErr w:type="spellStart"/>
+            <w:proofErr w:type="spellEnd"/>
+            <w:proofErr w:type="spellStart"/>
+            <w:proofErr w:type="spellEnd"/>
+            <w:proofErr w:type="spellStart"/>
+            <w:proofErr w:type="spellEnd"/>
+            <w:proofErr w:type="spellStart"/>
+            <w:proofErr w:type="spellEnd"/>
+            <w:proofErr w:type="spellStart"/>
+            <w:proofErr w:type="spellEnd"/>
+            <w:proofErr w:type="spellStart"/>
+            <w:proofErr w:type="spellEnd"/>
+            <w:proofErr w:type="spellStart"/>
+            <w:proofErr w:type="spellEnd"/>
+            <w:proofErr w:type="spellStart"/>
+            <w:proofErr w:type="spellEnd"/>
+            <w:proofErr w:type="spellStart"/>
+            <w:proofErr w:type="spellEnd"/>
+            <w:proofErr w:type="spellStart"/>
+            <w:proofErr w:type="spellEnd"/>
+            <w:proofErr w:type="spellStart"/>
+            <w:proofErr w:type="spellEnd"/>
+            <w:proofErr w:type="spellStart"/>
+            <w:proofErr w:type="spellEnd"/>
+            <w:proofErr w:type="spellStart"/>
+            <w:proofErr w:type="spellEnd"/>
+            <w:proofErr w:type="spellStart"/>
+            <w:proofErr w:type="spellEnd"/>
+            <w:proofErr w:type="spellStart"/>
+            <w:proofErr w:type="spellEnd"/>
+            <w:proofErr w:type="spellStart"/>
+            <w:proofErr w:type="spellEnd"/>
+            <w:proofErr w:type="spellStart"/>
+            <w:proofErr w:type="spellEnd"/>
+            <w:proofErr w:type="spellStart"/>
+            <w:proofErr w:type="spellEnd"/>
             <w:proofErr w:type="spellStart"/>
             <w:proofErr w:type="gramStart"/>
-            <w:r>
-              <w:t>công</w:t>
-            </w:r>
-            <w:proofErr w:type="spellEnd"/>
-            <w:r>
-              <w:t>.</w:t>
-            </w:r>
-            <w:r>
-              <w:t>.</w:t>
-            </w:r>
+            <w:proofErr w:type="spellEnd"/>
             <w:proofErr w:type="gramEnd"/>
           </w:p>
         </w:tc>
@@ -2383,30 +2025,10 @@
                 <w:sz w:val="18"/>
                 <w:szCs w:val="18"/>
               </w:rPr>
-              <w:t>Bắt</w:t>
-            </w:r>
-            <w:proofErr w:type="spellEnd"/>
-            <w:r>
-              <w:rPr>
-                <w:i/>
-                <w:iCs/>
-                <w:color w:val="595959"/>
-                <w:sz w:val="18"/>
-                <w:szCs w:val="18"/>
-              </w:rPr>
-              <w:t xml:space="preserve"> </w:t>
-            </w:r>
-            <w:proofErr w:type="spellStart"/>
-            <w:r>
-              <w:rPr>
-                <w:i/>
-                <w:iCs/>
-                <w:color w:val="595959"/>
-                <w:sz w:val="18"/>
-                <w:szCs w:val="18"/>
-              </w:rPr>
-              <w:t>buộc</w:t>
-            </w:r>
+              <w:t>Bắt buộc</w:t>
+            </w:r>
+            <w:proofErr w:type="spellEnd"/>
+            <w:proofErr w:type="spellStart"/>
             <w:proofErr w:type="spellEnd"/>
           </w:p>
         </w:tc>
@@ -3667,13 +3289,6 @@
               </w:rPr>
               <w:t>Nếu Customer muốn thay đổi yêu cầu vận chuyển, order hiện tại phải được chuyển sang CANCELLED và Customer phải tạo một order mới theo đúng quy trình.</w:t>
             </w:r>
-          </w:p>
-          <w:p>
-            <w:pPr>
-              <w:rPr>
-                <w:lang w:val="vi-VN"/>
-              </w:rPr>
-            </w:pPr>
           </w:p>
         </w:tc>
         <w:tc>
@@ -5279,6 +4894,138 @@
           </w:p>
         </w:tc>
       </w:tr>
+      <w:tr>
+        <w:tc>
+          <w:tcPr>
+            <w:tcW w:w="1100" w:type="dxa"/>
+            <w:shd w:val="clear" w:color="auto" w:fill="FFFFFF" w:themeFill="background1"/>
+            <w:tcMar>
+              <w:top w:w="100" w:type="dxa"/>
+              <w:left w:w="120" w:type="dxa"/>
+              <w:bottom w:w="100" w:type="dxa"/>
+              <w:right w:w="120" w:type="dxa"/>
+            </w:tcMar>
+          </w:tcPr>
+          <w:p>
+            <w:pPr>
+              <w:rPr>
+                <w:lang w:val="vi-VN"/>
+              </w:rPr>
+            </w:pPr>
+            <w:r>
+              <w:rPr>
+                <w:b/>
+                <w:bCs/>
+                <w:color w:val="1F3864"/>
+              </w:rPr>
+              <w:t>BR-23</w:t>
+            </w:r>
+          </w:p>
+        </w:tc>
+        <w:tc>
+          <w:tcPr>
+            <w:tcW w:w="6300" w:type="dxa"/>
+            <w:shd w:val="clear" w:color="auto" w:fill="FFFFFF" w:themeFill="background1"/>
+            <w:tcMar>
+              <w:top w:w="100" w:type="dxa"/>
+              <w:left w:w="120" w:type="dxa"/>
+              <w:bottom w:w="100" w:type="dxa"/>
+              <w:right w:w="120" w:type="dxa"/>
+            </w:tcMar>
+          </w:tcPr>
+          <w:p>
+            <w:proofErr w:type="spellStart"/>
+            <w:r>
+              <w:t>Vehicle là fleet/reference/master data có sẵn trong MVP; không có Vehicle CRUD hoặc fleet-management workflow. Assigned FRC chọn Vehicle cho ROAD leg. Khả dụng theo lịch được suy ra từ road_leg_vehicles và khoảng planned time. Allocation liên quan là cùng Vehicle trên ROAD RouteLeg khác của non-terminal Order; bỏ qua current RouteLeg. Overlap khi newStart &lt; existingEnd và newEnd &gt; existingStart. Không dùng trạng thái AVAILABLE/BUSY hoặc AVAILABLE/ASSIGNED phải đồng bộ theo lịch. Vehicle MAINTENANCE/INACTIVE không selectable; touching endpoints không overlap.</w:t>
+            </w:r>
+            <w:proofErr w:type="spellEnd"/>
+            <w:proofErr w:type="spellStart"/>
+            <w:proofErr w:type="spellEnd"/>
+            <w:proofErr w:type="spellStart"/>
+            <w:proofErr w:type="spellEnd"/>
+            <w:proofErr w:type="spellStart"/>
+            <w:proofErr w:type="spellEnd"/>
+            <w:proofErr w:type="spellStart"/>
+            <w:proofErr w:type="spellEnd"/>
+            <w:proofErr w:type="spellStart"/>
+            <w:proofErr w:type="spellEnd"/>
+            <w:proofErr w:type="spellStart"/>
+            <w:proofErr w:type="spellEnd"/>
+            <w:proofErr w:type="spellStart"/>
+            <w:proofErr w:type="spellEnd"/>
+            <w:proofErr w:type="spellStart"/>
+            <w:proofErr w:type="spellEnd"/>
+            <w:proofErr w:type="spellStart"/>
+            <w:proofErr w:type="spellEnd"/>
+            <w:proofErr w:type="spellStart"/>
+            <w:proofErr w:type="spellEnd"/>
+            <w:proofErr w:type="spellStart"/>
+            <w:proofErr w:type="spellEnd"/>
+            <w:proofErr w:type="spellStart"/>
+            <w:proofErr w:type="spellEnd"/>
+            <w:proofErr w:type="spellStart"/>
+            <w:proofErr w:type="spellEnd"/>
+            <w:proofErr w:type="spellStart"/>
+            <w:proofErr w:type="spellEnd"/>
+            <w:proofErr w:type="spellStart"/>
+            <w:proofErr w:type="spellEnd"/>
+            <w:proofErr w:type="spellStart"/>
+            <w:proofErr w:type="spellEnd"/>
+            <w:proofErr w:type="spellStart"/>
+            <w:proofErr w:type="spellEnd"/>
+            <w:proofErr w:type="spellStart"/>
+            <w:proofErr w:type="spellEnd"/>
+            <w:proofErr w:type="spellStart"/>
+            <w:proofErr w:type="spellEnd"/>
+            <w:proofErr w:type="spellStart"/>
+            <w:proofErr w:type="spellEnd"/>
+            <w:proofErr w:type="spellStart"/>
+            <w:proofErr w:type="spellEnd"/>
+            <w:proofErr w:type="spellStart"/>
+            <w:proofErr w:type="spellEnd"/>
+            <w:proofErr w:type="spellStart"/>
+            <w:proofErr w:type="spellEnd"/>
+            <w:proofErr w:type="spellStart"/>
+            <w:proofErr w:type="spellEnd"/>
+            <w:proofErr w:type="spellStart"/>
+            <w:proofErr w:type="spellEnd"/>
+            <w:proofErr w:type="spellStart"/>
+            <w:proofErr w:type="spellEnd"/>
+            <w:proofErr w:type="spellStart"/>
+            <w:proofErr w:type="spellEnd"/>
+            <w:proofErr w:type="spellStart"/>
+            <w:proofErr w:type="spellEnd"/>
+          </w:p>
+        </w:tc>
+        <w:tc>
+          <w:tcPr>
+            <w:tcW w:w="1950" w:type="dxa"/>
+            <w:shd w:val="clear" w:color="auto" w:fill="FFFFFF" w:themeFill="background1"/>
+            <w:tcMar>
+              <w:top w:w="100" w:type="dxa"/>
+              <w:left w:w="120" w:type="dxa"/>
+              <w:bottom w:w="100" w:type="dxa"/>
+              <w:right w:w="120" w:type="dxa"/>
+            </w:tcMar>
+          </w:tcPr>
+          <w:p>
+            <w:proofErr w:type="spellStart"/>
+            <w:r>
+              <w:rPr>
+                <w:i/>
+                <w:iCs/>
+                <w:color w:val="595959"/>
+                <w:sz w:val="18"/>
+                <w:szCs w:val="18"/>
+              </w:rPr>
+              <w:t>Bắt buộc</w:t>
+            </w:r>
+            <w:proofErr w:type="spellEnd"/>
+            <w:proofErr w:type="spellStart"/>
+            <w:proofErr w:type="spellEnd"/>
+          </w:p>
+        </w:tc>
+      </w:tr>
     </w:tbl>
     <w:p>
       <w:pPr>
@@ -6473,6 +6220,9 @@
         </w:tc>
       </w:tr>
       <w:tr>
+        <w:trPr>
+          <w:cantSplit/>
+        </w:trPr>
         <w:tc>
           <w:tcPr>
             <w:tcW w:w="1100" w:type="dxa"/>
@@ -6893,236 +6643,64 @@
               <w:rPr>
                 <w:lang w:val="vi-VN"/>
               </w:rPr>
-              <w:t xml:space="preserve">Sau khi Route Plan được LM Confirm, hệ thống tự động phân công nhân sự thực hiện. </w:t>
-            </w:r>
-            <w:proofErr w:type="spellStart"/>
-            <w:r>
-              <w:t>Mỗi</w:t>
-            </w:r>
-            <w:proofErr w:type="spellEnd"/>
-            <w:r>
-              <w:t xml:space="preserve"> ROAD Vehicle </w:t>
-            </w:r>
-            <w:proofErr w:type="spellStart"/>
-            <w:r>
-              <w:t>phải</w:t>
-            </w:r>
-            <w:proofErr w:type="spellEnd"/>
-            <w:r>
-              <w:t xml:space="preserve"> </w:t>
-            </w:r>
-            <w:proofErr w:type="spellStart"/>
-            <w:r>
-              <w:t>được</w:t>
-            </w:r>
-            <w:proofErr w:type="spellEnd"/>
-            <w:r>
-              <w:t xml:space="preserve"> </w:t>
-            </w:r>
-            <w:proofErr w:type="spellStart"/>
-            <w:r>
-              <w:t>phân</w:t>
-            </w:r>
-            <w:proofErr w:type="spellEnd"/>
-            <w:r>
-              <w:t xml:space="preserve"> </w:t>
-            </w:r>
-            <w:proofErr w:type="spellStart"/>
-            <w:r>
-              <w:t>công</w:t>
-            </w:r>
-            <w:proofErr w:type="spellEnd"/>
-            <w:r>
-              <w:t xml:space="preserve"> </w:t>
-            </w:r>
-            <w:proofErr w:type="spellStart"/>
-            <w:r>
-              <w:t>đúng</w:t>
-            </w:r>
-            <w:proofErr w:type="spellEnd"/>
-            <w:r>
-              <w:t xml:space="preserve"> 1 Driver </w:t>
-            </w:r>
-            <w:proofErr w:type="spellStart"/>
-            <w:r>
-              <w:t>và</w:t>
-            </w:r>
-            <w:proofErr w:type="spellEnd"/>
-            <w:r>
-              <w:t xml:space="preserve"> 1 </w:t>
-            </w:r>
-            <w:r>
-              <w:lastRenderedPageBreak/>
-              <w:t xml:space="preserve">Escort. </w:t>
-            </w:r>
-            <w:proofErr w:type="spellStart"/>
-            <w:r>
-              <w:t>Mỗi</w:t>
-            </w:r>
-            <w:proofErr w:type="spellEnd"/>
-            <w:r>
-              <w:t xml:space="preserve"> AIR </w:t>
-            </w:r>
-            <w:proofErr w:type="spellStart"/>
-            <w:r>
-              <w:t>RouteLeg</w:t>
-            </w:r>
-            <w:proofErr w:type="spellEnd"/>
-            <w:r>
-              <w:t xml:space="preserve"> </w:t>
-            </w:r>
-            <w:proofErr w:type="spellStart"/>
-            <w:r>
-              <w:t>phải</w:t>
-            </w:r>
-            <w:proofErr w:type="spellEnd"/>
-            <w:r>
-              <w:t xml:space="preserve"> </w:t>
-            </w:r>
-            <w:proofErr w:type="spellStart"/>
-            <w:r>
-              <w:t>được</w:t>
-            </w:r>
-            <w:proofErr w:type="spellEnd"/>
-            <w:r>
-              <w:t xml:space="preserve"> </w:t>
-            </w:r>
-            <w:proofErr w:type="spellStart"/>
-            <w:r>
-              <w:t>phân</w:t>
-            </w:r>
-            <w:proofErr w:type="spellEnd"/>
-            <w:r>
-              <w:t xml:space="preserve"> </w:t>
-            </w:r>
-            <w:proofErr w:type="spellStart"/>
-            <w:r>
-              <w:t>công</w:t>
-            </w:r>
-            <w:proofErr w:type="spellEnd"/>
-            <w:r>
-              <w:t xml:space="preserve"> </w:t>
-            </w:r>
-            <w:proofErr w:type="spellStart"/>
-            <w:r>
-              <w:t>đúng</w:t>
-            </w:r>
-            <w:proofErr w:type="spellEnd"/>
-            <w:r>
-              <w:t xml:space="preserve"> 1 Escort. </w:t>
-            </w:r>
-            <w:proofErr w:type="spellStart"/>
-            <w:r>
-              <w:t>Một</w:t>
-            </w:r>
-            <w:proofErr w:type="spellEnd"/>
-            <w:r>
-              <w:t xml:space="preserve"> </w:t>
-            </w:r>
-            <w:proofErr w:type="spellStart"/>
-            <w:r>
-              <w:t>RouteLeg</w:t>
-            </w:r>
-            <w:proofErr w:type="spellEnd"/>
-            <w:r>
-              <w:t xml:space="preserve"> </w:t>
-            </w:r>
-            <w:proofErr w:type="spellStart"/>
-            <w:r>
-              <w:t>có</w:t>
-            </w:r>
-            <w:proofErr w:type="spellEnd"/>
-            <w:r>
-              <w:t xml:space="preserve"> </w:t>
-            </w:r>
-            <w:proofErr w:type="spellStart"/>
-            <w:r>
-              <w:t>thể</w:t>
-            </w:r>
-            <w:proofErr w:type="spellEnd"/>
-            <w:r>
-              <w:t xml:space="preserve"> </w:t>
-            </w:r>
-            <w:proofErr w:type="spellStart"/>
-            <w:r>
-              <w:t>sử</w:t>
-            </w:r>
-            <w:proofErr w:type="spellEnd"/>
-            <w:r>
-              <w:t xml:space="preserve"> </w:t>
-            </w:r>
-            <w:proofErr w:type="spellStart"/>
-            <w:r>
-              <w:t>dụng</w:t>
-            </w:r>
-            <w:proofErr w:type="spellEnd"/>
-            <w:r>
-              <w:t xml:space="preserve"> </w:t>
-            </w:r>
-            <w:proofErr w:type="spellStart"/>
-            <w:r>
-              <w:t>các</w:t>
-            </w:r>
-            <w:proofErr w:type="spellEnd"/>
-            <w:r>
-              <w:t xml:space="preserve"> </w:t>
-            </w:r>
-            <w:proofErr w:type="spellStart"/>
-            <w:r>
-              <w:t>nhân</w:t>
-            </w:r>
-            <w:proofErr w:type="spellEnd"/>
-            <w:r>
-              <w:t xml:space="preserve"> </w:t>
-            </w:r>
-            <w:proofErr w:type="spellStart"/>
-            <w:r>
-              <w:t>sự</w:t>
-            </w:r>
-            <w:proofErr w:type="spellEnd"/>
-            <w:r>
-              <w:t xml:space="preserve"> </w:t>
-            </w:r>
-            <w:proofErr w:type="spellStart"/>
-            <w:r>
-              <w:t>khác</w:t>
-            </w:r>
-            <w:proofErr w:type="spellEnd"/>
-            <w:r>
-              <w:t xml:space="preserve"> </w:t>
-            </w:r>
-            <w:proofErr w:type="spellStart"/>
-            <w:r>
-              <w:t>nhau</w:t>
-            </w:r>
-            <w:proofErr w:type="spellEnd"/>
-            <w:r>
-              <w:t xml:space="preserve"> so </w:t>
-            </w:r>
-            <w:proofErr w:type="spellStart"/>
-            <w:r>
-              <w:t>với</w:t>
-            </w:r>
-            <w:proofErr w:type="spellEnd"/>
-            <w:r>
-              <w:t xml:space="preserve"> </w:t>
-            </w:r>
-            <w:proofErr w:type="spellStart"/>
-            <w:r>
-              <w:t>RouteLeg</w:t>
-            </w:r>
-            <w:proofErr w:type="spellEnd"/>
-            <w:r>
-              <w:t xml:space="preserve"> </w:t>
-            </w:r>
-            <w:proofErr w:type="spellStart"/>
-            <w:r>
-              <w:t>khác</w:t>
-            </w:r>
-            <w:proofErr w:type="spellEnd"/>
-            <w:r>
-              <w:t>.</w:t>
-            </w:r>
+              <w:t>Sau khi Route Plan được LM Confirm và khóa, hệ thống tự động phân công execution staff; FRC không chọn Driver/Escort. Driver eligible khi user ACTIVE, role DRIVER và không có non-completed ROAD execution assignment overlap planned interval. Escort eligible khi user ACTIVE, role ESCORT và không có non-completed ROAD/AIR execution assignment overlap. Trong tập eligible, ưu tiên người có ít active execution assignments nhất, rồi dùng stable user ID để tie-break. Mỗi ROAD Vehicle có đúng 1 Driver + 1 Escort; mỗi AIR RouteLeg có đúng 1 Escort và không có Driver. Chỉ khi toàn bộ assignment được persist thành công Order mới READY_TO_SHIP.</w:t>
+            </w:r>
+            <w:proofErr w:type="spellStart"/>
+            <w:proofErr w:type="spellEnd"/>
+            <w:proofErr w:type="spellStart"/>
+            <w:proofErr w:type="spellEnd"/>
+            <w:proofErr w:type="spellStart"/>
+            <w:proofErr w:type="spellEnd"/>
+            <w:proofErr w:type="spellStart"/>
+            <w:proofErr w:type="spellEnd"/>
+            <w:proofErr w:type="spellStart"/>
+            <w:proofErr w:type="spellEnd"/>
+            <w:proofErr w:type="spellStart"/>
+            <w:proofErr w:type="spellEnd"/>
+            <w:proofErr w:type="spellStart"/>
+            <w:proofErr w:type="spellEnd"/>
+            <w:proofErr w:type="spellStart"/>
+            <w:proofErr w:type="spellEnd"/>
+            <w:proofErr w:type="spellStart"/>
+            <w:proofErr w:type="spellEnd"/>
+            <w:proofErr w:type="spellStart"/>
+            <w:proofErr w:type="spellEnd"/>
+            <w:proofErr w:type="spellStart"/>
+            <w:proofErr w:type="spellEnd"/>
+            <w:proofErr w:type="spellStart"/>
+            <w:proofErr w:type="spellEnd"/>
+            <w:proofErr w:type="spellStart"/>
+            <w:proofErr w:type="spellEnd"/>
+            <w:proofErr w:type="spellStart"/>
+            <w:proofErr w:type="spellEnd"/>
+            <w:proofErr w:type="spellStart"/>
+            <w:proofErr w:type="spellEnd"/>
+            <w:proofErr w:type="spellStart"/>
+            <w:proofErr w:type="spellEnd"/>
+            <w:proofErr w:type="spellStart"/>
+            <w:proofErr w:type="spellEnd"/>
+            <w:proofErr w:type="spellStart"/>
+            <w:proofErr w:type="spellEnd"/>
+            <w:proofErr w:type="spellStart"/>
+            <w:proofErr w:type="spellEnd"/>
+            <w:proofErr w:type="spellStart"/>
+            <w:proofErr w:type="spellEnd"/>
+            <w:proofErr w:type="spellStart"/>
+            <w:proofErr w:type="spellEnd"/>
+            <w:proofErr w:type="spellStart"/>
+            <w:proofErr w:type="spellEnd"/>
+            <w:proofErr w:type="spellStart"/>
+            <w:proofErr w:type="spellEnd"/>
+            <w:proofErr w:type="spellStart"/>
+            <w:proofErr w:type="spellEnd"/>
+            <w:proofErr w:type="spellStart"/>
+            <w:proofErr w:type="spellEnd"/>
+            <w:proofErr w:type="spellStart"/>
+            <w:proofErr w:type="spellEnd"/>
+            <w:proofErr w:type="spellStart"/>
+            <w:proofErr w:type="spellEnd"/>
+            <w:proofErr w:type="spellStart"/>
+            <w:proofErr w:type="spellEnd"/>
           </w:p>
         </w:tc>
         <w:tc>
@@ -7155,21 +6733,9 @@
                 <w:sz w:val="18"/>
                 <w:szCs w:val="18"/>
               </w:rPr>
-              <w:lastRenderedPageBreak/>
-              <w:t>Bắt</w:t>
-            </w:r>
-            <w:proofErr w:type="spellEnd"/>
-            <w:r>
-              <w:rPr>
-                <w:i/>
-                <w:iCs/>
-                <w:color w:val="595959"/>
-                <w:sz w:val="18"/>
-                <w:szCs w:val="18"/>
-                <w:lang w:val="vi-VN"/>
-              </w:rPr>
-              <w:t xml:space="preserve"> buộc</w:t>
-            </w:r>
+              <w:t>Bắt buộc</w:t>
+            </w:r>
+            <w:proofErr w:type="spellEnd"/>
           </w:p>
         </w:tc>
       </w:tr>
@@ -7466,195 +7032,51 @@
           <w:p>
             <w:proofErr w:type="spellStart"/>
             <w:r>
-              <w:t>Mỗi</w:t>
-            </w:r>
-            <w:proofErr w:type="spellEnd"/>
-            <w:r>
-              <w:t xml:space="preserve"> order </w:t>
-            </w:r>
-            <w:proofErr w:type="spellStart"/>
-            <w:r>
-              <w:t>phải</w:t>
-            </w:r>
-            <w:proofErr w:type="spellEnd"/>
-            <w:r>
-              <w:t xml:space="preserve"> </w:t>
-            </w:r>
-            <w:proofErr w:type="spellStart"/>
-            <w:r>
-              <w:t>có</w:t>
-            </w:r>
-            <w:proofErr w:type="spellEnd"/>
-            <w:r>
-              <w:t xml:space="preserve"> </w:t>
-            </w:r>
-            <w:proofErr w:type="spellStart"/>
-            <w:r>
-              <w:t>đúng</w:t>
-            </w:r>
-            <w:proofErr w:type="spellEnd"/>
-            <w:r>
-              <w:t xml:space="preserve"> 1 Transport Specialist, </w:t>
-            </w:r>
-            <w:proofErr w:type="spellStart"/>
-            <w:r>
-              <w:t>đúng</w:t>
-            </w:r>
-            <w:proofErr w:type="spellEnd"/>
-            <w:r>
-              <w:t xml:space="preserve"> 1 Fleet &amp; Route Coordinator </w:t>
-            </w:r>
-            <w:proofErr w:type="spellStart"/>
-            <w:r>
-              <w:t>được</w:t>
-            </w:r>
-            <w:proofErr w:type="spellEnd"/>
-            <w:r>
-              <w:t xml:space="preserve"> </w:t>
-            </w:r>
-            <w:proofErr w:type="spellStart"/>
-            <w:r>
-              <w:t>phân</w:t>
-            </w:r>
-            <w:proofErr w:type="spellEnd"/>
-            <w:r>
-              <w:t xml:space="preserve"> </w:t>
-            </w:r>
-            <w:proofErr w:type="spellStart"/>
-            <w:r>
-              <w:t>công</w:t>
-            </w:r>
-            <w:proofErr w:type="spellEnd"/>
-            <w:r>
-              <w:t xml:space="preserve"> ở </w:t>
-            </w:r>
-            <w:proofErr w:type="spellStart"/>
-            <w:r>
-              <w:t>cấp</w:t>
-            </w:r>
-            <w:proofErr w:type="spellEnd"/>
-            <w:r>
-              <w:t xml:space="preserve"> Order. </w:t>
-            </w:r>
-            <w:proofErr w:type="spellStart"/>
-            <w:r>
-              <w:t>Mỗi</w:t>
-            </w:r>
-            <w:proofErr w:type="spellEnd"/>
-            <w:r>
-              <w:t xml:space="preserve"> ROAD </w:t>
-            </w:r>
-            <w:proofErr w:type="spellStart"/>
-            <w:r>
-              <w:t>RouteLeg</w:t>
-            </w:r>
-            <w:proofErr w:type="spellEnd"/>
-            <w:r>
-              <w:t xml:space="preserve"> </w:t>
-            </w:r>
-            <w:proofErr w:type="spellStart"/>
-            <w:r>
-              <w:t>phải</w:t>
-            </w:r>
-            <w:proofErr w:type="spellEnd"/>
-            <w:r>
-              <w:t xml:space="preserve"> </w:t>
-            </w:r>
-            <w:proofErr w:type="spellStart"/>
-            <w:r>
-              <w:t>có</w:t>
-            </w:r>
-            <w:proofErr w:type="spellEnd"/>
-            <w:r>
-              <w:t xml:space="preserve"> </w:t>
-            </w:r>
-            <w:proofErr w:type="spellStart"/>
-            <w:r>
-              <w:t>thể</w:t>
-            </w:r>
-            <w:proofErr w:type="spellEnd"/>
-            <w:r>
-              <w:rPr>
-                <w:lang w:val="vi-VN"/>
-              </w:rPr>
-              <w:t xml:space="preserve"> có nhiều </w:t>
-            </w:r>
-            <w:r>
-              <w:t xml:space="preserve">Driver </w:t>
-            </w:r>
-            <w:proofErr w:type="spellStart"/>
-            <w:r>
-              <w:t>và</w:t>
-            </w:r>
-            <w:proofErr w:type="spellEnd"/>
-            <w:r>
-              <w:rPr>
-                <w:lang w:val="vi-VN"/>
-              </w:rPr>
-              <w:t xml:space="preserve"> </w:t>
-            </w:r>
-            <w:r>
-              <w:rPr>
-                <w:lang w:val="vi-VN"/>
-              </w:rPr>
-              <w:t xml:space="preserve">Escoct </w:t>
-            </w:r>
-            <w:proofErr w:type="spellStart"/>
-            <w:r>
-              <w:t>được</w:t>
-            </w:r>
-            <w:proofErr w:type="spellEnd"/>
-            <w:r>
-              <w:t xml:space="preserve"> </w:t>
-            </w:r>
-            <w:proofErr w:type="spellStart"/>
-            <w:r>
-              <w:t>phân</w:t>
-            </w:r>
-            <w:proofErr w:type="spellEnd"/>
-            <w:r>
-              <w:t xml:space="preserve"> </w:t>
-            </w:r>
-            <w:proofErr w:type="spellStart"/>
-            <w:r>
-              <w:t>công</w:t>
-            </w:r>
-            <w:proofErr w:type="spellEnd"/>
-            <w:r>
-              <w:t xml:space="preserve">. AIR </w:t>
-            </w:r>
-            <w:proofErr w:type="spellStart"/>
-            <w:r>
-              <w:t>RouteLeg</w:t>
-            </w:r>
-            <w:proofErr w:type="spellEnd"/>
-            <w:r>
-              <w:t xml:space="preserve"> </w:t>
-            </w:r>
-            <w:proofErr w:type="spellStart"/>
-            <w:r>
-              <w:t>không</w:t>
-            </w:r>
-            <w:proofErr w:type="spellEnd"/>
-            <w:r>
-              <w:t xml:space="preserve"> </w:t>
-            </w:r>
-            <w:proofErr w:type="spellStart"/>
-            <w:r>
-              <w:t>yêu</w:t>
-            </w:r>
-            <w:proofErr w:type="spellEnd"/>
-            <w:r>
-              <w:t xml:space="preserve"> </w:t>
-            </w:r>
-            <w:proofErr w:type="spellStart"/>
-            <w:r>
-              <w:t>cầu</w:t>
-            </w:r>
-            <w:proofErr w:type="spellEnd"/>
-            <w:r>
-              <w:t xml:space="preserve"> Driver.</w:t>
-            </w:r>
+              <w:t>Sau signed Stripe Deposit webhook làm Order chuyển QUOTATION_SENT → APPROVED, LM phải manual-confirm đúng 1 ACTIVE Transport Specialist và đúng 1 ACTIVE Fleet &amp; Route Coordinator ở cấp Order trong cùng một assignment action. TS/FRC không accept, reject hoặc negotiate assignment; không có assignment-request lifecycle hay reassignment workflow. Chỉ assigned TS/FRC được thao tác trên Order thuộc trách nhiệm của mình.</w:t>
+            </w:r>
+            <w:proofErr w:type="spellEnd"/>
+            <w:proofErr w:type="spellStart"/>
+            <w:proofErr w:type="spellEnd"/>
+            <w:proofErr w:type="spellStart"/>
+            <w:proofErr w:type="spellEnd"/>
+            <w:proofErr w:type="spellStart"/>
+            <w:proofErr w:type="spellEnd"/>
+            <w:proofErr w:type="spellStart"/>
+            <w:proofErr w:type="spellEnd"/>
+            <w:proofErr w:type="spellStart"/>
+            <w:proofErr w:type="spellEnd"/>
+            <w:proofErr w:type="spellStart"/>
+            <w:proofErr w:type="spellEnd"/>
+            <w:proofErr w:type="spellStart"/>
+            <w:proofErr w:type="spellEnd"/>
+            <w:proofErr w:type="spellStart"/>
+            <w:proofErr w:type="spellEnd"/>
+            <w:proofErr w:type="spellStart"/>
+            <w:proofErr w:type="spellEnd"/>
+            <w:proofErr w:type="spellStart"/>
+            <w:proofErr w:type="spellEnd"/>
+            <w:proofErr w:type="spellStart"/>
+            <w:proofErr w:type="spellEnd"/>
+            <w:proofErr w:type="spellStart"/>
+            <w:proofErr w:type="spellEnd"/>
+            <w:proofErr w:type="spellStart"/>
+            <w:proofErr w:type="spellEnd"/>
+            <w:proofErr w:type="spellStart"/>
+            <w:proofErr w:type="spellEnd"/>
+            <w:proofErr w:type="spellStart"/>
+            <w:proofErr w:type="spellEnd"/>
+            <w:proofErr w:type="spellStart"/>
+            <w:proofErr w:type="spellEnd"/>
+            <w:proofErr w:type="spellStart"/>
+            <w:proofErr w:type="spellEnd"/>
+            <w:proofErr w:type="spellStart"/>
+            <w:proofErr w:type="spellEnd"/>
+            <w:proofErr w:type="spellStart"/>
+            <w:proofErr w:type="spellEnd"/>
+            <w:proofErr w:type="spellStart"/>
+            <w:proofErr w:type="spellEnd"/>
+            <w:proofErr w:type="spellStart"/>
+            <w:proofErr w:type="spellEnd"/>
           </w:p>
         </w:tc>
         <w:tc>
@@ -7677,30 +7099,10 @@
                 <w:sz w:val="18"/>
                 <w:szCs w:val="18"/>
               </w:rPr>
-              <w:t>Bắt</w:t>
-            </w:r>
-            <w:proofErr w:type="spellEnd"/>
-            <w:r>
-              <w:rPr>
-                <w:i/>
-                <w:iCs/>
-                <w:color w:val="595959"/>
-                <w:sz w:val="18"/>
-                <w:szCs w:val="18"/>
-              </w:rPr>
-              <w:t xml:space="preserve"> </w:t>
-            </w:r>
-            <w:proofErr w:type="spellStart"/>
-            <w:r>
-              <w:rPr>
-                <w:i/>
-                <w:iCs/>
-                <w:color w:val="595959"/>
-                <w:sz w:val="18"/>
-                <w:szCs w:val="18"/>
-              </w:rPr>
-              <w:t>buộc</w:t>
-            </w:r>
+              <w:t>Bắt buộc</w:t>
+            </w:r>
+            <w:proofErr w:type="spellEnd"/>
+            <w:proofErr w:type="spellStart"/>
             <w:proofErr w:type="spellEnd"/>
           </w:p>
         </w:tc>
@@ -7755,276 +7157,75 @@
           <w:p>
             <w:proofErr w:type="spellStart"/>
             <w:r>
-              <w:t>Một</w:t>
-            </w:r>
-            <w:proofErr w:type="spellEnd"/>
-            <w:r>
-              <w:t xml:space="preserve"> Transport Specialist </w:t>
-            </w:r>
-            <w:proofErr w:type="spellStart"/>
-            <w:r>
-              <w:t>có</w:t>
-            </w:r>
-            <w:proofErr w:type="spellEnd"/>
-            <w:r>
-              <w:t xml:space="preserve"> </w:t>
-            </w:r>
-            <w:proofErr w:type="spellStart"/>
-            <w:r>
-              <w:t>thể</w:t>
-            </w:r>
-            <w:proofErr w:type="spellEnd"/>
-            <w:r>
-              <w:t xml:space="preserve"> </w:t>
-            </w:r>
-            <w:proofErr w:type="spellStart"/>
-            <w:r>
-              <w:t>phụ</w:t>
-            </w:r>
-            <w:proofErr w:type="spellEnd"/>
-            <w:r>
-              <w:t xml:space="preserve"> </w:t>
-            </w:r>
-            <w:proofErr w:type="spellStart"/>
-            <w:r>
-              <w:t>trách</w:t>
-            </w:r>
-            <w:proofErr w:type="spellEnd"/>
-            <w:r>
-              <w:t xml:space="preserve"> </w:t>
-            </w:r>
-            <w:proofErr w:type="spellStart"/>
-            <w:r>
-              <w:t>nhiều</w:t>
-            </w:r>
-            <w:proofErr w:type="spellEnd"/>
-            <w:r>
-              <w:t xml:space="preserve"> order. </w:t>
-            </w:r>
-            <w:proofErr w:type="spellStart"/>
-            <w:r>
-              <w:t>Nếu</w:t>
-            </w:r>
-            <w:proofErr w:type="spellEnd"/>
-            <w:r>
-              <w:t xml:space="preserve"> </w:t>
-            </w:r>
-            <w:proofErr w:type="spellStart"/>
-            <w:r>
-              <w:t>hai</w:t>
-            </w:r>
-            <w:proofErr w:type="spellEnd"/>
-            <w:r>
-              <w:t xml:space="preserve"> order </w:t>
-            </w:r>
-            <w:proofErr w:type="spellStart"/>
-            <w:r>
-              <w:t>được</w:t>
-            </w:r>
-            <w:proofErr w:type="spellEnd"/>
-            <w:r>
-              <w:t xml:space="preserve"> </w:t>
-            </w:r>
-            <w:proofErr w:type="spellStart"/>
-            <w:r>
-              <w:t>giao</w:t>
-            </w:r>
-            <w:proofErr w:type="spellEnd"/>
-            <w:r>
-              <w:t xml:space="preserve"> </w:t>
-            </w:r>
-            <w:proofErr w:type="spellStart"/>
-            <w:r>
-              <w:t>cho</w:t>
-            </w:r>
-            <w:proofErr w:type="spellEnd"/>
-            <w:r>
-              <w:t xml:space="preserve"> </w:t>
-            </w:r>
-            <w:proofErr w:type="spellStart"/>
-            <w:r>
-              <w:t>cùng</w:t>
-            </w:r>
-            <w:proofErr w:type="spellEnd"/>
-            <w:r>
-              <w:t xml:space="preserve"> </w:t>
-            </w:r>
-            <w:proofErr w:type="spellStart"/>
-            <w:r>
-              <w:t>một</w:t>
-            </w:r>
-            <w:proofErr w:type="spellEnd"/>
-            <w:r>
-              <w:t xml:space="preserve"> TS </w:t>
-            </w:r>
-            <w:proofErr w:type="spellStart"/>
-            <w:r>
-              <w:t>có</w:t>
-            </w:r>
-            <w:proofErr w:type="spellEnd"/>
-            <w:r>
-              <w:t xml:space="preserve"> </w:t>
-            </w:r>
-            <w:proofErr w:type="spellStart"/>
-            <w:r>
-              <w:t>document_submission_deadline_at</w:t>
-            </w:r>
-            <w:proofErr w:type="spellEnd"/>
-            <w:r>
-              <w:t xml:space="preserve"> </w:t>
-            </w:r>
-            <w:proofErr w:type="spellStart"/>
-            <w:r>
-              <w:t>cách</w:t>
-            </w:r>
-            <w:proofErr w:type="spellEnd"/>
-            <w:r>
-              <w:t xml:space="preserve"> </w:t>
-            </w:r>
-            <w:proofErr w:type="spellStart"/>
-            <w:r>
-              <w:t>nhau</w:t>
-            </w:r>
-            <w:proofErr w:type="spellEnd"/>
-            <w:r>
-              <w:t xml:space="preserve"> </w:t>
-            </w:r>
-            <w:proofErr w:type="spellStart"/>
-            <w:r>
-              <w:t>không</w:t>
-            </w:r>
-            <w:proofErr w:type="spellEnd"/>
-            <w:r>
-              <w:t xml:space="preserve"> </w:t>
-            </w:r>
-            <w:proofErr w:type="spellStart"/>
-            <w:r>
-              <w:t>quá</w:t>
-            </w:r>
-            <w:proofErr w:type="spellEnd"/>
-            <w:r>
-              <w:t xml:space="preserve"> 1 </w:t>
-            </w:r>
-            <w:proofErr w:type="spellStart"/>
-            <w:r>
-              <w:t>ngày</w:t>
-            </w:r>
-            <w:proofErr w:type="spellEnd"/>
-            <w:r>
-              <w:t xml:space="preserve">, </w:t>
-            </w:r>
-            <w:proofErr w:type="spellStart"/>
-            <w:r>
-              <w:t>hệ</w:t>
-            </w:r>
-            <w:proofErr w:type="spellEnd"/>
-            <w:r>
-              <w:t xml:space="preserve"> </w:t>
-            </w:r>
-            <w:proofErr w:type="spellStart"/>
-            <w:r>
-              <w:t>thống</w:t>
-            </w:r>
-            <w:proofErr w:type="spellEnd"/>
-            <w:r>
-              <w:t xml:space="preserve"> </w:t>
-            </w:r>
-            <w:proofErr w:type="spellStart"/>
-            <w:r>
-              <w:t>phải</w:t>
-            </w:r>
-            <w:proofErr w:type="spellEnd"/>
-            <w:r>
-              <w:t xml:space="preserve"> </w:t>
-            </w:r>
-            <w:proofErr w:type="spellStart"/>
-            <w:r>
-              <w:t>tạo</w:t>
-            </w:r>
-            <w:proofErr w:type="spellEnd"/>
-            <w:r>
-              <w:t xml:space="preserve"> </w:t>
-            </w:r>
-            <w:proofErr w:type="spellStart"/>
-            <w:r>
-              <w:t>cảnh</w:t>
-            </w:r>
-            <w:proofErr w:type="spellEnd"/>
-            <w:r>
-              <w:t xml:space="preserve"> </w:t>
-            </w:r>
-            <w:proofErr w:type="spellStart"/>
-            <w:r>
-              <w:t>báo</w:t>
-            </w:r>
-            <w:proofErr w:type="spellEnd"/>
-            <w:r>
-              <w:t xml:space="preserve"> (Warning). </w:t>
-            </w:r>
-            <w:proofErr w:type="spellStart"/>
-            <w:r>
-              <w:t>Cảnh</w:t>
-            </w:r>
-            <w:proofErr w:type="spellEnd"/>
-            <w:r>
-              <w:t xml:space="preserve"> </w:t>
-            </w:r>
-            <w:proofErr w:type="spellStart"/>
-            <w:r>
-              <w:t>báo</w:t>
-            </w:r>
-            <w:proofErr w:type="spellEnd"/>
-            <w:r>
-              <w:t xml:space="preserve"> </w:t>
-            </w:r>
-            <w:proofErr w:type="spellStart"/>
-            <w:r>
-              <w:t>này</w:t>
-            </w:r>
-            <w:proofErr w:type="spellEnd"/>
-            <w:r>
-              <w:t xml:space="preserve"> </w:t>
-            </w:r>
-            <w:proofErr w:type="spellStart"/>
-            <w:r>
-              <w:t>không</w:t>
-            </w:r>
-            <w:proofErr w:type="spellEnd"/>
-            <w:r>
-              <w:t xml:space="preserve"> </w:t>
-            </w:r>
-            <w:proofErr w:type="spellStart"/>
-            <w:r>
-              <w:t>chặn</w:t>
-            </w:r>
-            <w:proofErr w:type="spellEnd"/>
-            <w:r>
-              <w:t xml:space="preserve"> </w:t>
-            </w:r>
-            <w:proofErr w:type="spellStart"/>
-            <w:r>
-              <w:t>việc</w:t>
-            </w:r>
-            <w:proofErr w:type="spellEnd"/>
-            <w:r>
-              <w:t xml:space="preserve"> </w:t>
-            </w:r>
-            <w:proofErr w:type="spellStart"/>
-            <w:r>
-              <w:t>phân</w:t>
-            </w:r>
-            <w:proofErr w:type="spellEnd"/>
-            <w:r>
-              <w:t xml:space="preserve"> </w:t>
-            </w:r>
-            <w:proofErr w:type="spellStart"/>
-            <w:r>
-              <w:t>công</w:t>
-            </w:r>
-            <w:proofErr w:type="spellEnd"/>
-            <w:r>
-              <w:t>.</w:t>
-            </w:r>
+              <w:t>Candidate TS/FRC hiển thị user/staff identity, full name, role và activeOrderCount, nên ưu tiên sắp xếp count tăng dần với stable identity tie-breaker; count chỉ hỗ trợ quyết định và LM tự chọn. TS count = assigned Orders có status APPROVED và documents_final_confirmed_at null. FRC count = assigned non-terminal Orders chưa có LM-approved Route Plan, kể cả Order đang chờ Document Phase/Remaining Balance. TS queue chỉ chứa assigned actionable document Orders; FRC queue chỉ chứa assigned Orders có Remaining Balance PAID và Route Plan absent/DRAFT/RETURNED.</w:t>
+            </w:r>
+            <w:proofErr w:type="spellEnd"/>
+            <w:proofErr w:type="spellStart"/>
+            <w:proofErr w:type="spellEnd"/>
+            <w:proofErr w:type="spellStart"/>
+            <w:proofErr w:type="spellEnd"/>
+            <w:proofErr w:type="spellStart"/>
+            <w:proofErr w:type="spellEnd"/>
+            <w:proofErr w:type="spellStart"/>
+            <w:proofErr w:type="spellEnd"/>
+            <w:proofErr w:type="spellStart"/>
+            <w:proofErr w:type="spellEnd"/>
+            <w:proofErr w:type="spellStart"/>
+            <w:proofErr w:type="spellEnd"/>
+            <w:proofErr w:type="spellStart"/>
+            <w:proofErr w:type="spellEnd"/>
+            <w:proofErr w:type="spellStart"/>
+            <w:proofErr w:type="spellEnd"/>
+            <w:proofErr w:type="spellStart"/>
+            <w:proofErr w:type="spellEnd"/>
+            <w:proofErr w:type="spellStart"/>
+            <w:proofErr w:type="spellEnd"/>
+            <w:proofErr w:type="spellStart"/>
+            <w:proofErr w:type="spellEnd"/>
+            <w:proofErr w:type="spellStart"/>
+            <w:proofErr w:type="spellEnd"/>
+            <w:proofErr w:type="spellStart"/>
+            <w:proofErr w:type="spellEnd"/>
+            <w:proofErr w:type="spellStart"/>
+            <w:proofErr w:type="spellEnd"/>
+            <w:proofErr w:type="spellStart"/>
+            <w:proofErr w:type="spellEnd"/>
+            <w:proofErr w:type="spellStart"/>
+            <w:proofErr w:type="spellEnd"/>
+            <w:proofErr w:type="spellStart"/>
+            <w:proofErr w:type="spellEnd"/>
+            <w:proofErr w:type="spellStart"/>
+            <w:proofErr w:type="spellEnd"/>
+            <w:proofErr w:type="spellStart"/>
+            <w:proofErr w:type="spellEnd"/>
+            <w:proofErr w:type="spellStart"/>
+            <w:proofErr w:type="spellEnd"/>
+            <w:proofErr w:type="spellStart"/>
+            <w:proofErr w:type="spellEnd"/>
+            <w:proofErr w:type="spellStart"/>
+            <w:proofErr w:type="spellEnd"/>
+            <w:proofErr w:type="spellStart"/>
+            <w:proofErr w:type="spellEnd"/>
+            <w:proofErr w:type="spellStart"/>
+            <w:proofErr w:type="spellEnd"/>
+            <w:proofErr w:type="spellStart"/>
+            <w:proofErr w:type="spellEnd"/>
+            <w:proofErr w:type="spellStart"/>
+            <w:proofErr w:type="spellEnd"/>
+            <w:proofErr w:type="spellStart"/>
+            <w:proofErr w:type="spellEnd"/>
+            <w:proofErr w:type="spellStart"/>
+            <w:proofErr w:type="spellEnd"/>
+            <w:proofErr w:type="spellStart"/>
+            <w:proofErr w:type="spellEnd"/>
+            <w:proofErr w:type="spellStart"/>
+            <w:proofErr w:type="spellEnd"/>
+            <w:proofErr w:type="spellStart"/>
+            <w:proofErr w:type="spellEnd"/>
+            <w:proofErr w:type="spellStart"/>
+            <w:proofErr w:type="spellEnd"/>
+            <w:proofErr w:type="spellStart"/>
+            <w:proofErr w:type="spellEnd"/>
           </w:p>
         </w:tc>
         <w:tc>
@@ -8050,60 +7251,12 @@
                 <w:sz w:val="18"/>
                 <w:szCs w:val="18"/>
               </w:rPr>
-              <w:t>Cần</w:t>
-            </w:r>
-            <w:proofErr w:type="spellEnd"/>
-            <w:r>
-              <w:rPr>
-                <w:b/>
-                <w:bCs/>
-                <w:i/>
-                <w:iCs/>
-                <w:color w:val="833C0C"/>
-                <w:sz w:val="18"/>
-                <w:szCs w:val="18"/>
-              </w:rPr>
-              <w:t xml:space="preserve"> </w:t>
-            </w:r>
-            <w:proofErr w:type="spellStart"/>
-            <w:r>
-              <w:rPr>
-                <w:b/>
-                <w:bCs/>
-                <w:i/>
-                <w:iCs/>
-                <w:color w:val="833C0C"/>
-                <w:sz w:val="18"/>
-                <w:szCs w:val="18"/>
-              </w:rPr>
-              <w:t>xác</w:t>
-            </w:r>
-            <w:proofErr w:type="spellEnd"/>
-            <w:r>
-              <w:rPr>
-                <w:b/>
-                <w:bCs/>
-                <w:i/>
-                <w:iCs/>
-                <w:color w:val="833C0C"/>
-                <w:sz w:val="18"/>
-                <w:szCs w:val="18"/>
-              </w:rPr>
-              <w:t xml:space="preserve"> </w:t>
-            </w:r>
-            <w:proofErr w:type="spellStart"/>
-            <w:r>
-              <w:rPr>
-                <w:b/>
-                <w:bCs/>
-                <w:i/>
-                <w:iCs/>
-                <w:color w:val="833C0C"/>
-                <w:sz w:val="18"/>
-                <w:szCs w:val="18"/>
-              </w:rPr>
-              <w:t>nhận</w:t>
-            </w:r>
+              <w:t>Bắt buộc</w:t>
+            </w:r>
+            <w:proofErr w:type="spellEnd"/>
+            <w:proofErr w:type="spellStart"/>
+            <w:proofErr w:type="spellEnd"/>
+            <w:proofErr w:type="spellStart"/>
             <w:proofErr w:type="spellEnd"/>
           </w:p>
         </w:tc>
@@ -8619,6 +7772,9 @@
         </w:tc>
       </w:tr>
       <w:tr>
+        <w:trPr>
+          <w:cantSplit/>
+        </w:trPr>
         <w:tc>
           <w:tcPr>
             <w:tcW w:w="1100" w:type="dxa"/>
@@ -8942,6 +8098,7 @@
     <w:p>
       <w:pPr>
         <w:pStyle w:val="Heading2"/>
+        <w:keepNext/>
         <w:spacing w:before="260" w:after="120"/>
       </w:pPr>
       <w:r>
@@ -9170,15 +8327,7 @@
                 <w:bCs/>
                 <w:color w:val="1F3864"/>
               </w:rPr>
-              <w:t>BR-</w:t>
-            </w:r>
-            <w:r>
-              <w:rPr>
-                <w:b/>
-                <w:bCs/>
-                <w:color w:val="1F3864"/>
-              </w:rPr>
-              <w:t>22</w:t>
+              <w:t>BR-19</w:t>
             </w:r>
           </w:p>
         </w:tc>

</xml_diff>